<commit_message>
v1.0: docs — fix output format count (21→22), add SML 13.1 documentation
SpatialMediaLab 13.1 was added in v1.0 but documentation still said 21 formats.
Updated README, wiki (5 pages), and manual generator to reflect 22 formats.
Removed phantom 7.0.4 format from manual generator, added missing 5.1.4.
Regenerated user manual DOCX. Added SML 13.1 to glossary and troubleshooting.

Co-Authored-By: Claude Opus 4.6 <noreply@anthropic.com>
</commit_message>
<xml_diff>
--- a/docs/OpenSpatialDelay_Manual_v1.0.docx
+++ b/docs/OpenSpatialDelay_Manual_v1.0.docx
@@ -4,23 +4,18 @@
   <w:body>
     <w:p>
       <w:pPr>
-        <w:spacing w:after="1200"/>
-      </w:pPr>
-    </w:p>
-    <w:p>
-      <w:pPr>
-        <w:spacing w:after="1200"/>
-      </w:pPr>
-    </w:p>
-    <w:p>
-      <w:pPr>
-        <w:spacing w:after="400"/>
+        <w:spacing w:after="800"/>
+      </w:pPr>
+    </w:p>
+    <w:p>
+      <w:pPr>
+        <w:spacing w:after="200"/>
         <w:jc w:val="center"/>
       </w:pPr>
       <w:r>
         <w:drawing>
           <wp:inline distT="0" distB="0" distL="0" distR="0">
-            <wp:extent cx="2095500" cy="1057275"/>
+            <wp:extent cx="1714500" cy="866775"/>
             <wp:effectExtent t="0" r="0" b="0" l="0"/>
             <wp:docPr id="1" name="sml-logo" descr="Logo for Spatial Media Lab" title="Spatial Media Lab Logo"/>
             <wp:cNvGraphicFramePr>
@@ -45,7 +40,7 @@
                   <pic:spPr bwMode="auto">
                     <a:xfrm>
                       <a:off x="0" y="0"/>
-                      <a:ext cx="2095500" cy="1057275"/>
+                      <a:ext cx="1714500" cy="866775"/>
                     </a:xfrm>
                     <a:prstGeom prst="rect">
                       <a:avLst/>
@@ -77,7 +72,7 @@
     </w:p>
     <w:p>
       <w:pPr>
-        <w:spacing w:after="300"/>
+        <w:spacing w:after="140"/>
         <w:jc w:val="center"/>
       </w:pPr>
       <w:r>
@@ -109,49 +104,53 @@
     </w:p>
     <w:p>
       <w:pPr>
+        <w:spacing w:after="120" w:before="80"/>
+        <w:jc w:val="center"/>
+      </w:pPr>
+      <w:r>
+        <w:drawing>
+          <wp:inline distT="0" distB="0" distL="0" distR="0">
+            <wp:extent cx="4000500" cy="2828925"/>
+            <wp:effectExtent t="0" r="0" b="0" l="0"/>
+            <wp:docPr id="1" name="openspatialdelay-interface" descr="Full plugin UI showing spatial map, controls, and tap selector" title="OpenSpatialDelay Interface"/>
+            <wp:cNvGraphicFramePr>
+              <a:graphicFrameLocks xmlns:a="http://schemas.openxmlformats.org/drawingml/2006/main" noChangeAspect="1"/>
+            </wp:cNvGraphicFramePr>
+            <a:graphic xmlns:a="http://schemas.openxmlformats.org/drawingml/2006/main">
+              <a:graphicData uri="http://schemas.openxmlformats.org/drawingml/2006/picture">
+                <pic:pic xmlns:pic="http://schemas.openxmlformats.org/drawingml/2006/picture">
+                  <pic:nvPicPr>
+                    <pic:cNvPr id="0" name="" descr=""/>
+                    <pic:cNvPicPr>
+                      <a:picLocks noChangeAspect="1" noChangeArrowheads="1"/>
+                    </pic:cNvPicPr>
+                  </pic:nvPicPr>
+                  <pic:blipFill>
+                    <a:blip r:embed="rId12" cstate="none"/>
+                    <a:srcRect/>
+                    <a:stretch>
+                      <a:fillRect/>
+                    </a:stretch>
+                  </pic:blipFill>
+                  <pic:spPr bwMode="auto">
+                    <a:xfrm>
+                      <a:off x="0" y="0"/>
+                      <a:ext cx="4000500" cy="2828925"/>
+                    </a:xfrm>
+                    <a:prstGeom prst="rect">
+                      <a:avLst/>
+                    </a:prstGeom>
+                  </pic:spPr>
+                </pic:pic>
+              </a:graphicData>
+            </a:graphic>
+          </wp:inline>
+        </w:drawing>
+      </w:r>
+    </w:p>
+    <w:p>
+      <w:pPr>
         <w:spacing w:after="400"/>
-      </w:pPr>
-    </w:p>
-    <w:p>
-      <w:pPr>
-        <w:pBdr>
-          <w:top w:val="single" w:sz="1"/>
-          <w:bottom w:val="single" w:sz="1"/>
-          <w:left w:val="single" w:sz="1"/>
-          <w:right w:val="single" w:sz="1"/>
-        </w:pBdr>
-        <w:spacing w:after="40"/>
-        <w:jc w:val="center"/>
-      </w:pPr>
-      <w:r>
-        <w:rPr>
-          <w:rFonts w:ascii="DM Sans" w:cs="DM Sans" w:eastAsia="DM Sans" w:hAnsi="DM Sans"/>
-          <w:sz w:val="20"/>
-          <w:szCs w:val="20"/>
-        </w:rPr>
-        <w:t xml:space="preserve"/>
-      </w:r>
-    </w:p>
-    <w:p>
-      <w:pPr>
-        <w:spacing w:after="600" w:before="600"/>
-        <w:jc w:val="center"/>
-      </w:pPr>
-      <w:r>
-        <w:rPr>
-          <w:rFonts w:ascii="DM Sans" w:cs="DM Sans" w:eastAsia="DM Sans" w:hAnsi="DM Sans"/>
-          <w:i/>
-          <w:iCs/>
-          <w:color w:val="64748B"/>
-          <w:sz w:val="22"/>
-          <w:szCs w:val="22"/>
-        </w:rPr>
-        <w:t xml:space="preserve">[ App Screenshot — To Be Added ]</w:t>
-      </w:r>
-    </w:p>
-    <w:p>
-      <w:pPr>
-        <w:spacing w:after="800"/>
       </w:pPr>
     </w:p>
     <w:p>
@@ -173,7 +172,7 @@
       <w:pPr>
         <w:jc w:val="center"/>
       </w:pPr>
-      <w:hyperlink w:history="1" r:id="rIdnnaxiuhzeu0kpvtc8aox6">
+      <w:hyperlink w:history="1" r:id="rIdih7ltwlay_ee4ip_ooffn">
         <w:r>
           <w:rPr>
             <w:rFonts w:ascii="DM Sans" w:cs="DM Sans" w:eastAsia="DM Sans" w:hAnsi="DM Sans"/>
@@ -1460,7 +1459,7 @@
         </w:rPr>
         <w:t xml:space="preserve">Download the latest release for your platform from the </w:t>
       </w:r>
-      <w:hyperlink w:history="1" r:id="rIdfvdbuybomydquafa183lm">
+      <w:hyperlink w:history="1" r:id="rId5g5d_mmri4qrnppgkhicq">
         <w:r>
           <w:rPr>
             <w:rFonts w:ascii="DM Sans" w:cs="DM Sans" w:eastAsia="DM Sans" w:hAnsi="DM Sans"/>
@@ -1642,109 +1641,52 @@
       </w:r>
       <w:bookmarkEnd w:id="1"/>
     </w:p>
-    <w:tbl>
-      <w:tblPr>
-        <w:tblW w:type="dxa" w:w="9026"/>
-        <w:tblBorders>
-          <w:top w:val="single" w:color="auto" w:sz="4"/>
-          <w:left w:val="single" w:color="auto" w:sz="4"/>
-          <w:bottom w:val="single" w:color="auto" w:sz="4"/>
-          <w:right w:val="single" w:color="auto" w:sz="4"/>
-          <w:insideH w:val="single" w:color="auto" w:sz="4"/>
-          <w:insideV w:val="single" w:color="auto" w:sz="4"/>
-        </w:tblBorders>
-      </w:tblPr>
-      <w:tblGrid>
-        <w:gridCol w:w="9026"/>
-      </w:tblGrid>
-      <w:tr>
-        <w:tc>
-          <w:tcPr>
-            <w:tcW w:type="dxa" w:w="9026"/>
-            <w:tcBorders>
-              <w:top w:val="dashed" w:color="CBD5E1" w:sz="1"/>
-              <w:left w:val="dashed" w:color="CBD5E1" w:sz="1"/>
-              <w:bottom w:val="dashed" w:color="CBD5E1" w:sz="1"/>
-              <w:right w:val="dashed" w:color="CBD5E1" w:sz="1"/>
-            </w:tcBorders>
-            <w:shd w:fill="F0F4F8" w:val="clear"/>
-            <w:tcMar>
-              <w:top w:type="dxa" w:w="80"/>
-              <w:left w:type="dxa" w:w="120"/>
-              <w:bottom w:type="dxa" w:w="80"/>
-              <w:right w:type="dxa" w:w="120"/>
-            </w:tcMar>
-          </w:tcPr>
-          <w:p>
-            <w:pPr>
-              <w:spacing w:after="0"/>
-            </w:pPr>
-          </w:p>
-          <w:p>
-            <w:pPr>
-              <w:spacing w:after="0"/>
-            </w:pPr>
-          </w:p>
-          <w:p>
-            <w:pPr>
-              <w:spacing w:after="0"/>
-            </w:pPr>
-          </w:p>
-          <w:p>
-            <w:pPr>
-              <w:spacing w:after="0"/>
-            </w:pPr>
-          </w:p>
-          <w:p>
-            <w:pPr>
-              <w:spacing w:after="0"/>
-            </w:pPr>
-          </w:p>
-          <w:p>
-            <w:pPr>
-              <w:spacing w:after="40"/>
-              <w:jc w:val="center"/>
-            </w:pPr>
-            <w:r>
-              <w:rPr>
-                <w:rFonts w:ascii="DM Sans" w:cs="DM Sans" w:eastAsia="DM Sans" w:hAnsi="DM Sans"/>
-                <w:i/>
-                <w:iCs/>
-                <w:color w:val="64748B"/>
-                <w:sz w:val="20"/>
-                <w:szCs w:val="20"/>
-              </w:rPr>
-              <w:t xml:space="preserve">[ Screenshot: Full Plugin UI — 820×580 window showing all four regions ]</w:t>
-            </w:r>
-          </w:p>
-          <w:p>
-            <w:pPr>
-              <w:spacing w:after="0"/>
-            </w:pPr>
-          </w:p>
-          <w:p>
-            <w:pPr>
-              <w:spacing w:after="0"/>
-            </w:pPr>
-          </w:p>
-          <w:p>
-            <w:pPr>
-              <w:spacing w:after="0"/>
-            </w:pPr>
-          </w:p>
-          <w:p>
-            <w:pPr>
-              <w:spacing w:after="0"/>
-            </w:pPr>
-          </w:p>
-          <w:p>
-            <w:pPr>
-              <w:spacing w:after="0"/>
-            </w:pPr>
-          </w:p>
-        </w:tc>
-      </w:tr>
-    </w:tbl>
+    <w:p>
+      <w:pPr>
+        <w:spacing w:after="120" w:before="80"/>
+        <w:jc w:val="center"/>
+      </w:pPr>
+      <w:r>
+        <w:drawing>
+          <wp:inline distT="0" distB="0" distL="0" distR="0">
+            <wp:extent cx="4572000" cy="3238500"/>
+            <wp:effectExtent t="0" r="0" b="0" l="0"/>
+            <wp:docPr id="1" name="plugin-interface-overview" descr="Full Plugin UI — 820×580 window with four labeled regions" title="Plugin Interface Overview"/>
+            <wp:cNvGraphicFramePr>
+              <a:graphicFrameLocks xmlns:a="http://schemas.openxmlformats.org/drawingml/2006/main" noChangeAspect="1"/>
+            </wp:cNvGraphicFramePr>
+            <a:graphic xmlns:a="http://schemas.openxmlformats.org/drawingml/2006/main">
+              <a:graphicData uri="http://schemas.openxmlformats.org/drawingml/2006/picture">
+                <pic:pic xmlns:pic="http://schemas.openxmlformats.org/drawingml/2006/picture">
+                  <pic:nvPicPr>
+                    <pic:cNvPr id="0" name="" descr=""/>
+                    <pic:cNvPicPr>
+                      <a:picLocks noChangeAspect="1" noChangeArrowheads="1"/>
+                    </pic:cNvPicPr>
+                  </pic:nvPicPr>
+                  <pic:blipFill>
+                    <a:blip r:embed="rId13" cstate="none"/>
+                    <a:srcRect/>
+                    <a:stretch>
+                      <a:fillRect/>
+                    </a:stretch>
+                  </pic:blipFill>
+                  <pic:spPr bwMode="auto">
+                    <a:xfrm>
+                      <a:off x="0" y="0"/>
+                      <a:ext cx="4572000" cy="3238500"/>
+                    </a:xfrm>
+                    <a:prstGeom prst="rect">
+                      <a:avLst/>
+                    </a:prstGeom>
+                  </pic:spPr>
+                </pic:pic>
+              </a:graphicData>
+            </a:graphic>
+          </wp:inline>
+        </w:drawing>
+      </w:r>
+    </w:p>
     <w:p>
       <w:pPr>
         <w:spacing w:after="160"/>
@@ -1761,8 +1703,13 @@
           <w:sz w:val="22"/>
           <w:szCs w:val="22"/>
         </w:rPr>
-        <w:t xml:space="preserve">The interface has four regions: </w:t>
-      </w:r>
+        <w:t xml:space="preserve">The interface has four regions:</w:t>
+      </w:r>
+    </w:p>
+    <w:p>
+      <w:pPr>
+        <w:spacing w:after="160" w:line="300"/>
+      </w:pPr>
       <w:r>
         <w:rPr>
           <w:rFonts w:ascii="DM Sans" w:cs="DM Sans" w:eastAsia="DM Sans" w:hAnsi="DM Sans"/>
@@ -1772,7 +1719,7 @@
           <w:sz w:val="22"/>
           <w:szCs w:val="22"/>
         </w:rPr>
-        <w:t xml:space="preserve">A) Spatial Map </w:t>
+        <w:t xml:space="preserve">A) Header Bar </w:t>
       </w:r>
       <w:r>
         <w:rPr>
@@ -1781,8 +1728,13 @@
           <w:sz w:val="22"/>
           <w:szCs w:val="22"/>
         </w:rPr>
-        <w:t xml:space="preserve">(left) — top-down view of 3D space where you position delay taps. </w:t>
-      </w:r>
+        <w:t xml:space="preserve">(top) — presets, output format, and algorithm selection.</w:t>
+      </w:r>
+    </w:p>
+    <w:p>
+      <w:pPr>
+        <w:spacing w:after="160" w:line="300"/>
+      </w:pPr>
       <w:r>
         <w:rPr>
           <w:rFonts w:ascii="DM Sans" w:cs="DM Sans" w:eastAsia="DM Sans" w:hAnsi="DM Sans"/>
@@ -1792,7 +1744,7 @@
           <w:sz w:val="22"/>
           <w:szCs w:val="22"/>
         </w:rPr>
-        <w:t xml:space="preserve">B) Right Panel </w:t>
+        <w:t xml:space="preserve">B) Spatial Map </w:t>
       </w:r>
       <w:r>
         <w:rPr>
@@ -1801,8 +1753,13 @@
           <w:sz w:val="22"/>
           <w:szCs w:val="22"/>
         </w:rPr>
-        <w:t xml:space="preserve">(right) — global controls for delay, tone, modulation, and mix. </w:t>
-      </w:r>
+        <w:t xml:space="preserve">(left) — top-down view of 3D space where you position delay taps.</w:t>
+      </w:r>
+    </w:p>
+    <w:p>
+      <w:pPr>
+        <w:spacing w:after="160" w:line="300"/>
+      </w:pPr>
       <w:r>
         <w:rPr>
           <w:rFonts w:ascii="DM Sans" w:cs="DM Sans" w:eastAsia="DM Sans" w:hAnsi="DM Sans"/>
@@ -1821,8 +1778,13 @@
           <w:sz w:val="22"/>
           <w:szCs w:val="22"/>
         </w:rPr>
-        <w:t xml:space="preserve">(bottom) — per-tap controls for the selected object. </w:t>
-      </w:r>
+        <w:t xml:space="preserve">(bottom-left) — per-tap controls for the selected object.</w:t>
+      </w:r>
+    </w:p>
+    <w:p>
+      <w:pPr>
+        <w:spacing w:after="160" w:line="300"/>
+      </w:pPr>
       <w:r>
         <w:rPr>
           <w:rFonts w:ascii="DM Sans" w:cs="DM Sans" w:eastAsia="DM Sans" w:hAnsi="DM Sans"/>
@@ -1832,7 +1794,7 @@
           <w:sz w:val="22"/>
           <w:szCs w:val="22"/>
         </w:rPr>
-        <w:t xml:space="preserve">D) Header Bar </w:t>
+        <w:t xml:space="preserve">D) Right Panel </w:t>
       </w:r>
       <w:r>
         <w:rPr>
@@ -1841,7 +1803,7 @@
           <w:sz w:val="22"/>
           <w:szCs w:val="22"/>
         </w:rPr>
-        <w:t xml:space="preserve">(top) — presets, output format, and algorithm selection.</w:t>
+        <w:t xml:space="preserve">(right) — global controls for delay, tone, modulation, and mix.</w:t>
       </w:r>
     </w:p>
     <w:p>
@@ -1898,7 +1860,7 @@
                     </pic:cNvPicPr>
                   </pic:nvPicPr>
                   <pic:blipFill>
-                    <a:blip r:embed="rId12" cstate="none"/>
+                    <a:blip r:embed="rId14" cstate="none"/>
                     <a:srcRect/>
                     <a:stretch>
                       <a:fillRect/>
@@ -3094,7 +3056,7 @@
           <w:sz w:val="22"/>
           <w:szCs w:val="22"/>
         </w:rPr>
-        <w:t xml:space="preserve">21 output formats </w:t>
+        <w:t xml:space="preserve">22 output formats </w:t>
       </w:r>
       <w:r>
         <w:rPr>
@@ -3103,7 +3065,7 @@
           <w:sz w:val="22"/>
           <w:szCs w:val="22"/>
         </w:rPr>
-        <w:t xml:space="preserve">— from binaural headphones to 9.1.6 Dolby Atmos to 6th-order Ambisonics.</w:t>
+        <w:t xml:space="preserve">— from binaural headphones to 9.1.6 Dolby Atmos, SpatialMediaLab 13.1, and 6th-order Ambisonics.</w:t>
       </w:r>
     </w:p>
     <w:p>
@@ -3205,119 +3167,52 @@
         <w:t xml:space="preserve">The spatial map is the large visualization on the left side of the plugin window. It shows a top-down view of 3D space with the listener at the center. Each colored dot represents a delay tap positioned in space.</w:t>
       </w:r>
     </w:p>
-    <w:tbl>
-      <w:tblPr>
-        <w:tblW w:type="dxa" w:w="9026"/>
-        <w:tblBorders>
-          <w:top w:val="single" w:color="auto" w:sz="4"/>
-          <w:left w:val="single" w:color="auto" w:sz="4"/>
-          <w:bottom w:val="single" w:color="auto" w:sz="4"/>
-          <w:right w:val="single" w:color="auto" w:sz="4"/>
-          <w:insideH w:val="single" w:color="auto" w:sz="4"/>
-          <w:insideV w:val="single" w:color="auto" w:sz="4"/>
-        </w:tblBorders>
-      </w:tblPr>
-      <w:tblGrid>
-        <w:gridCol w:w="9026"/>
-      </w:tblGrid>
-      <w:tr>
-        <w:tc>
-          <w:tcPr>
-            <w:tcW w:type="dxa" w:w="9026"/>
-            <w:tcBorders>
-              <w:top w:val="dashed" w:color="CBD5E1" w:sz="1"/>
-              <w:left w:val="dashed" w:color="CBD5E1" w:sz="1"/>
-              <w:bottom w:val="dashed" w:color="CBD5E1" w:sz="1"/>
-              <w:right w:val="dashed" w:color="CBD5E1" w:sz="1"/>
-            </w:tcBorders>
-            <w:shd w:fill="F0F4F8" w:val="clear"/>
-            <w:tcMar>
-              <w:top w:type="dxa" w:w="80"/>
-              <w:left w:type="dxa" w:w="120"/>
-              <w:bottom w:type="dxa" w:w="80"/>
-              <w:right w:type="dxa" w:w="120"/>
-            </w:tcMar>
-          </w:tcPr>
-          <w:p>
-            <w:pPr>
-              <w:spacing w:after="0"/>
-            </w:pPr>
-          </w:p>
-          <w:p>
-            <w:pPr>
-              <w:spacing w:after="0"/>
-            </w:pPr>
-          </w:p>
-          <w:p>
-            <w:pPr>
-              <w:spacing w:after="0"/>
-            </w:pPr>
-          </w:p>
-          <w:p>
-            <w:pPr>
-              <w:spacing w:after="0"/>
-            </w:pPr>
-          </w:p>
-          <w:p>
-            <w:pPr>
-              <w:spacing w:after="0"/>
-            </w:pPr>
-          </w:p>
-          <w:p>
-            <w:pPr>
-              <w:spacing w:after="0"/>
-            </w:pPr>
-          </w:p>
-          <w:p>
-            <w:pPr>
-              <w:spacing w:after="40"/>
-              <w:jc w:val="center"/>
-            </w:pPr>
-            <w:r>
-              <w:rPr>
-                <w:rFonts w:ascii="DM Sans" w:cs="DM Sans" w:eastAsia="DM Sans" w:hAnsi="DM Sans"/>
-                <w:i/>
-                <w:iCs/>
-                <w:color w:val="64748B"/>
-                <w:sz w:val="20"/>
-                <w:szCs w:val="20"/>
-              </w:rPr>
-              <w:t xml:space="preserve">[ Screenshot: Spatial Map Close-Up — showing taps positioned around the listener with distance rings and compass labels ]</w:t>
-            </w:r>
-          </w:p>
-          <w:p>
-            <w:pPr>
-              <w:spacing w:after="0"/>
-            </w:pPr>
-          </w:p>
-          <w:p>
-            <w:pPr>
-              <w:spacing w:after="0"/>
-            </w:pPr>
-          </w:p>
-          <w:p>
-            <w:pPr>
-              <w:spacing w:after="0"/>
-            </w:pPr>
-          </w:p>
-          <w:p>
-            <w:pPr>
-              <w:spacing w:after="0"/>
-            </w:pPr>
-          </w:p>
-          <w:p>
-            <w:pPr>
-              <w:spacing w:after="0"/>
-            </w:pPr>
-          </w:p>
-          <w:p>
-            <w:pPr>
-              <w:spacing w:after="0"/>
-            </w:pPr>
-          </w:p>
-        </w:tc>
-      </w:tr>
-    </w:tbl>
+    <w:p>
+      <w:pPr>
+        <w:spacing w:after="120" w:before="80"/>
+        <w:jc w:val="center"/>
+      </w:pPr>
+      <w:r>
+        <w:drawing>
+          <wp:inline distT="0" distB="0" distL="0" distR="0">
+            <wp:extent cx="3619500" cy="2667000"/>
+            <wp:effectExtent t="0" r="0" b="0" l="0"/>
+            <wp:docPr id="1" name="spatial-map" descr="Spatial Map Close-Up — showing taps positioned around the listener with distance rings and compass labels" title="Spatial Map"/>
+            <wp:cNvGraphicFramePr>
+              <a:graphicFrameLocks xmlns:a="http://schemas.openxmlformats.org/drawingml/2006/main" noChangeAspect="1"/>
+            </wp:cNvGraphicFramePr>
+            <a:graphic xmlns:a="http://schemas.openxmlformats.org/drawingml/2006/main">
+              <a:graphicData uri="http://schemas.openxmlformats.org/drawingml/2006/picture">
+                <pic:pic xmlns:pic="http://schemas.openxmlformats.org/drawingml/2006/picture">
+                  <pic:nvPicPr>
+                    <pic:cNvPr id="0" name="" descr=""/>
+                    <pic:cNvPicPr>
+                      <a:picLocks noChangeAspect="1" noChangeArrowheads="1"/>
+                    </pic:cNvPicPr>
+                  </pic:nvPicPr>
+                  <pic:blipFill>
+                    <a:blip r:embed="rId15" cstate="none"/>
+                    <a:srcRect/>
+                    <a:stretch>
+                      <a:fillRect/>
+                    </a:stretch>
+                  </pic:blipFill>
+                  <pic:spPr bwMode="auto">
+                    <a:xfrm>
+                      <a:off x="0" y="0"/>
+                      <a:ext cx="3619500" cy="2667000"/>
+                    </a:xfrm>
+                    <a:prstGeom prst="rect">
+                      <a:avLst/>
+                    </a:prstGeom>
+                  </pic:spPr>
+                </pic:pic>
+              </a:graphicData>
+            </a:graphic>
+          </wp:inline>
+        </w:drawing>
+      </w:r>
+    </w:p>
     <w:p>
       <w:pPr>
         <w:spacing w:after="160"/>
@@ -4139,99 +4034,52 @@
         <w:spacing w:after="160"/>
       </w:pPr>
     </w:p>
-    <w:tbl>
-      <w:tblPr>
-        <w:tblW w:type="dxa" w:w="9026"/>
-        <w:tblBorders>
-          <w:top w:val="single" w:color="auto" w:sz="4"/>
-          <w:left w:val="single" w:color="auto" w:sz="4"/>
-          <w:bottom w:val="single" w:color="auto" w:sz="4"/>
-          <w:right w:val="single" w:color="auto" w:sz="4"/>
-          <w:insideH w:val="single" w:color="auto" w:sz="4"/>
-          <w:insideV w:val="single" w:color="auto" w:sz="4"/>
-        </w:tblBorders>
-      </w:tblPr>
-      <w:tblGrid>
-        <w:gridCol w:w="9026"/>
-      </w:tblGrid>
-      <w:tr>
-        <w:tc>
-          <w:tcPr>
-            <w:tcW w:type="dxa" w:w="9026"/>
-            <w:tcBorders>
-              <w:top w:val="dashed" w:color="CBD5E1" w:sz="1"/>
-              <w:left w:val="dashed" w:color="CBD5E1" w:sz="1"/>
-              <w:bottom w:val="dashed" w:color="CBD5E1" w:sz="1"/>
-              <w:right w:val="dashed" w:color="CBD5E1" w:sz="1"/>
-            </w:tcBorders>
-            <w:shd w:fill="F0F4F8" w:val="clear"/>
-            <w:tcMar>
-              <w:top w:type="dxa" w:w="80"/>
-              <w:left w:type="dxa" w:w="120"/>
-              <w:bottom w:type="dxa" w:w="80"/>
-              <w:right w:type="dxa" w:w="120"/>
-            </w:tcMar>
-          </w:tcPr>
-          <w:p>
-            <w:pPr>
-              <w:spacing w:after="0"/>
-            </w:pPr>
-          </w:p>
-          <w:p>
-            <w:pPr>
-              <w:spacing w:after="0"/>
-            </w:pPr>
-          </w:p>
-          <w:p>
-            <w:pPr>
-              <w:spacing w:after="0"/>
-            </w:pPr>
-          </w:p>
-          <w:p>
-            <w:pPr>
-              <w:spacing w:after="0"/>
-            </w:pPr>
-          </w:p>
-          <w:p>
-            <w:pPr>
-              <w:spacing w:after="40"/>
-              <w:jc w:val="center"/>
-            </w:pPr>
-            <w:r>
-              <w:rPr>
-                <w:rFonts w:ascii="DM Sans" w:cs="DM Sans" w:eastAsia="DM Sans" w:hAnsi="DM Sans"/>
-                <w:i/>
-                <w:iCs/>
-                <w:color w:val="64748B"/>
-                <w:sz w:val="20"/>
-                <w:szCs w:val="20"/>
-              </w:rPr>
-              <w:t xml:space="preserve">[ Screenshot: Spatial Map with multiple taps at various positions, showing elevation transparency and color coding ]</w:t>
-            </w:r>
-          </w:p>
-          <w:p>
-            <w:pPr>
-              <w:spacing w:after="0"/>
-            </w:pPr>
-          </w:p>
-          <w:p>
-            <w:pPr>
-              <w:spacing w:after="0"/>
-            </w:pPr>
-          </w:p>
-          <w:p>
-            <w:pPr>
-              <w:spacing w:after="0"/>
-            </w:pPr>
-          </w:p>
-          <w:p>
-            <w:pPr>
-              <w:spacing w:after="0"/>
-            </w:pPr>
-          </w:p>
-        </w:tc>
-      </w:tr>
-    </w:tbl>
+    <w:p>
+      <w:pPr>
+        <w:spacing w:after="120" w:before="80"/>
+        <w:jc w:val="center"/>
+      </w:pPr>
+      <w:r>
+        <w:drawing>
+          <wp:inline distT="0" distB="0" distL="0" distR="0">
+            <wp:extent cx="3619500" cy="2667000"/>
+            <wp:effectExtent t="0" r="0" b="0" l="0"/>
+            <wp:docPr id="1" name="elevation-visualization" descr="Spatial Map with multiple taps at various positions, showing elevation transparency and color coding" title="Elevation Visualization"/>
+            <wp:cNvGraphicFramePr>
+              <a:graphicFrameLocks xmlns:a="http://schemas.openxmlformats.org/drawingml/2006/main" noChangeAspect="1"/>
+            </wp:cNvGraphicFramePr>
+            <a:graphic xmlns:a="http://schemas.openxmlformats.org/drawingml/2006/main">
+              <a:graphicData uri="http://schemas.openxmlformats.org/drawingml/2006/picture">
+                <pic:pic xmlns:pic="http://schemas.openxmlformats.org/drawingml/2006/picture">
+                  <pic:nvPicPr>
+                    <pic:cNvPr id="0" name="" descr=""/>
+                    <pic:cNvPicPr>
+                      <a:picLocks noChangeAspect="1" noChangeArrowheads="1"/>
+                    </pic:cNvPicPr>
+                  </pic:nvPicPr>
+                  <pic:blipFill>
+                    <a:blip r:embed="rId16" cstate="none"/>
+                    <a:srcRect/>
+                    <a:stretch>
+                      <a:fillRect/>
+                    </a:stretch>
+                  </pic:blipFill>
+                  <pic:spPr bwMode="auto">
+                    <a:xfrm>
+                      <a:off x="0" y="0"/>
+                      <a:ext cx="3619500" cy="2667000"/>
+                    </a:xfrm>
+                    <a:prstGeom prst="rect">
+                      <a:avLst/>
+                    </a:prstGeom>
+                  </pic:spPr>
+                </pic:pic>
+              </a:graphicData>
+            </a:graphic>
+          </wp:inline>
+        </w:drawing>
+      </w:r>
+    </w:p>
     <w:p>
       <w:r>
         <w:br w:type="page"/>
@@ -4289,7 +4137,7 @@
           <w:sz w:val="22"/>
           <w:szCs w:val="22"/>
         </w:rPr>
-        <w:t xml:space="preserve">21 output formats</w:t>
+        <w:t xml:space="preserve">22 output formats</w:t>
       </w:r>
       <w:r>
         <w:rPr>
@@ -5501,7 +5349,7 @@
           <w:sz w:val="22"/>
           <w:szCs w:val="22"/>
         </w:rPr>
-        <w:t xml:space="preserve">13 discrete surround formats, from Quadraphonic to 9.1.6 Atmos. Formats with an LFE channel (marked with .1) derive it as a mono sum of all tap outputs through a 120 Hz low-pass filter at −10 dB. Choose a </w:t>
+        <w:t xml:space="preserve">14 discrete surround formats, from Quadraphonic to 9.1.6 Atmos and SpatialMediaLab 13.1. Formats with an LFE channel (marked with .1) derive it as a mono sum of all tap outputs through a 120 Hz low-pass filter at −10 dB. Choose a </w:t>
       </w:r>
       <w:hyperlink w:history="1" w:anchor="algorithms">
         <w:r>
@@ -6740,7 +6588,7 @@
                 <w:sz w:val="18"/>
                 <w:szCs w:val="18"/>
               </w:rPr>
-              <w:t xml:space="preserve">7.0.4</w:t>
+              <w:t xml:space="preserve">5.1.4 Atmos</w:t>
             </w:r>
           </w:p>
         </w:tc>
@@ -6769,7 +6617,7 @@
                 <w:sz w:val="18"/>
                 <w:szCs w:val="18"/>
               </w:rPr>
-              <w:t xml:space="preserve">11</w:t>
+              <w:t xml:space="preserve">10</w:t>
             </w:r>
           </w:p>
         </w:tc>
@@ -6798,7 +6646,7 @@
                 <w:sz w:val="18"/>
                 <w:szCs w:val="18"/>
               </w:rPr>
-              <w:t xml:space="preserve">No</w:t>
+              <w:t xml:space="preserve">Yes</w:t>
             </w:r>
           </w:p>
         </w:tc>
@@ -7174,6 +7022,124 @@
                 <w:szCs w:val="18"/>
               </w:rPr>
               <w:t xml:space="preserve">6 top + wide speakers</w:t>
+            </w:r>
+          </w:p>
+        </w:tc>
+      </w:tr>
+      <w:tr>
+        <w:tc>
+          <w:tcPr>
+            <w:tcW w:type="dxa" w:w="2400"/>
+            <w:tcBorders>
+              <w:top w:val="single" w:color="E2E8F0" w:sz="1"/>
+              <w:left w:val="single" w:color="E2E8F0" w:sz="1"/>
+              <w:bottom w:val="single" w:color="E2E8F0" w:sz="1"/>
+              <w:right w:val="single" w:color="E2E8F0" w:sz="1"/>
+            </w:tcBorders>
+            <w:shd w:fill="F8FAFC" w:val="clear"/>
+            <w:tcMar>
+              <w:top w:type="dxa" w:w="50"/>
+              <w:left w:type="dxa" w:w="100"/>
+              <w:bottom w:type="dxa" w:w="50"/>
+              <w:right w:type="dxa" w:w="100"/>
+            </w:tcMar>
+          </w:tcPr>
+          <w:p>
+            <w:r>
+              <w:rPr>
+                <w:rFonts w:ascii="DM Sans" w:cs="DM Sans" w:eastAsia="DM Sans" w:hAnsi="DM Sans"/>
+                <w:color w:val="1A1A2E"/>
+                <w:sz w:val="18"/>
+                <w:szCs w:val="18"/>
+              </w:rPr>
+              <w:t xml:space="preserve">SpatialMediaLab 13.1</w:t>
+            </w:r>
+          </w:p>
+        </w:tc>
+        <w:tc>
+          <w:tcPr>
+            <w:tcW w:type="dxa" w:w="1400"/>
+            <w:tcBorders>
+              <w:top w:val="single" w:color="E2E8F0" w:sz="1"/>
+              <w:left w:val="single" w:color="E2E8F0" w:sz="1"/>
+              <w:bottom w:val="single" w:color="E2E8F0" w:sz="1"/>
+              <w:right w:val="single" w:color="E2E8F0" w:sz="1"/>
+            </w:tcBorders>
+            <w:shd w:fill="F8FAFC" w:val="clear"/>
+            <w:tcMar>
+              <w:top w:type="dxa" w:w="50"/>
+              <w:left w:type="dxa" w:w="100"/>
+              <w:bottom w:type="dxa" w:w="50"/>
+              <w:right w:type="dxa" w:w="100"/>
+            </w:tcMar>
+          </w:tcPr>
+          <w:p>
+            <w:r>
+              <w:rPr>
+                <w:rFonts w:ascii="DM Sans" w:cs="DM Sans" w:eastAsia="DM Sans" w:hAnsi="DM Sans"/>
+                <w:color w:val="1A1A2E"/>
+                <w:sz w:val="18"/>
+                <w:szCs w:val="18"/>
+              </w:rPr>
+              <w:t xml:space="preserve">14</w:t>
+            </w:r>
+          </w:p>
+        </w:tc>
+        <w:tc>
+          <w:tcPr>
+            <w:tcW w:type="dxa" w:w="1000"/>
+            <w:tcBorders>
+              <w:top w:val="single" w:color="E2E8F0" w:sz="1"/>
+              <w:left w:val="single" w:color="E2E8F0" w:sz="1"/>
+              <w:bottom w:val="single" w:color="E2E8F0" w:sz="1"/>
+              <w:right w:val="single" w:color="E2E8F0" w:sz="1"/>
+            </w:tcBorders>
+            <w:shd w:fill="F8FAFC" w:val="clear"/>
+            <w:tcMar>
+              <w:top w:type="dxa" w:w="50"/>
+              <w:left w:type="dxa" w:w="100"/>
+              <w:bottom w:type="dxa" w:w="50"/>
+              <w:right w:type="dxa" w:w="100"/>
+            </w:tcMar>
+          </w:tcPr>
+          <w:p>
+            <w:r>
+              <w:rPr>
+                <w:rFonts w:ascii="DM Sans" w:cs="DM Sans" w:eastAsia="DM Sans" w:hAnsi="DM Sans"/>
+                <w:color w:val="1A1A2E"/>
+                <w:sz w:val="18"/>
+                <w:szCs w:val="18"/>
+              </w:rPr>
+              <w:t xml:space="preserve">Yes</w:t>
+            </w:r>
+          </w:p>
+        </w:tc>
+        <w:tc>
+          <w:tcPr>
+            <w:tcW w:type="dxa" w:w="4226"/>
+            <w:tcBorders>
+              <w:top w:val="single" w:color="E2E8F0" w:sz="1"/>
+              <w:left w:val="single" w:color="E2E8F0" w:sz="1"/>
+              <w:bottom w:val="single" w:color="E2E8F0" w:sz="1"/>
+              <w:right w:val="single" w:color="E2E8F0" w:sz="1"/>
+            </w:tcBorders>
+            <w:shd w:fill="F8FAFC" w:val="clear"/>
+            <w:tcMar>
+              <w:top w:type="dxa" w:w="50"/>
+              <w:left w:type="dxa" w:w="100"/>
+              <w:bottom w:type="dxa" w:w="50"/>
+              <w:right w:type="dxa" w:w="100"/>
+            </w:tcMar>
+          </w:tcPr>
+          <w:p>
+            <w:r>
+              <w:rPr>
+                <w:rFonts w:ascii="DM Sans" w:cs="DM Sans" w:eastAsia="DM Sans" w:hAnsi="DM Sans"/>
+                <w:color w:val="1A1A2E"/>
+                <w:sz w:val="18"/>
+                <w:szCs w:val="18"/>
+              </w:rPr>
+              <w:t xml:space="preserve">8 ear-level + 4 height + 1 zenith</w:t>
             </w:r>
           </w:p>
         </w:tc>
@@ -9741,69 +9707,52 @@
       </w:r>
       <w:bookmarkEnd w:id="1"/>
     </w:p>
-    <w:tbl>
-      <w:tblPr>
-        <w:tblW w:type="dxa" w:w="9026"/>
-        <w:tblBorders>
-          <w:top w:val="single" w:color="auto" w:sz="4"/>
-          <w:left w:val="single" w:color="auto" w:sz="4"/>
-          <w:bottom w:val="single" w:color="auto" w:sz="4"/>
-          <w:right w:val="single" w:color="auto" w:sz="4"/>
-          <w:insideH w:val="single" w:color="auto" w:sz="4"/>
-          <w:insideV w:val="single" w:color="auto" w:sz="4"/>
-        </w:tblBorders>
-      </w:tblPr>
-      <w:tblGrid>
-        <w:gridCol w:w="9026"/>
-      </w:tblGrid>
-      <w:tr>
-        <w:tc>
-          <w:tcPr>
-            <w:tcW w:type="dxa" w:w="9026"/>
-            <w:tcBorders>
-              <w:top w:val="dashed" w:color="CBD5E1" w:sz="1"/>
-              <w:left w:val="dashed" w:color="CBD5E1" w:sz="1"/>
-              <w:bottom w:val="dashed" w:color="CBD5E1" w:sz="1"/>
-              <w:right w:val="dashed" w:color="CBD5E1" w:sz="1"/>
-            </w:tcBorders>
-            <w:shd w:fill="F0F4F8" w:val="clear"/>
-            <w:tcMar>
-              <w:top w:type="dxa" w:w="80"/>
-              <w:left w:type="dxa" w:w="120"/>
-              <w:bottom w:type="dxa" w:w="80"/>
-              <w:right w:type="dxa" w:w="120"/>
-            </w:tcMar>
-          </w:tcPr>
-          <w:p>
-            <w:pPr>
-              <w:spacing w:after="0"/>
-            </w:pPr>
-          </w:p>
-          <w:p>
-            <w:pPr>
-              <w:spacing w:after="40"/>
-              <w:jc w:val="center"/>
-            </w:pPr>
-            <w:r>
-              <w:rPr>
-                <w:rFonts w:ascii="DM Sans" w:cs="DM Sans" w:eastAsia="DM Sans" w:hAnsi="DM Sans"/>
-                <w:i/>
-                <w:iCs/>
-                <w:color w:val="64748B"/>
-                <w:sz w:val="20"/>
-                <w:szCs w:val="20"/>
-              </w:rPr>
-              <w:t xml:space="preserve">[ Screenshot: Header Bar — showing title, preset navigation, OSC toggle, Output Format, Algorithm/HRTF dropdown ]</w:t>
-            </w:r>
-          </w:p>
-          <w:p>
-            <w:pPr>
-              <w:spacing w:after="0"/>
-            </w:pPr>
-          </w:p>
-        </w:tc>
-      </w:tr>
-    </w:tbl>
+    <w:p>
+      <w:pPr>
+        <w:spacing w:after="120" w:before="80"/>
+        <w:jc w:val="center"/>
+      </w:pPr>
+      <w:r>
+        <w:drawing>
+          <wp:inline distT="0" distB="0" distL="0" distR="0">
+            <wp:extent cx="4572000" cy="285750"/>
+            <wp:effectExtent t="0" r="0" b="0" l="0"/>
+            <wp:docPr id="1" name="header-bar" descr="Header Bar — showing title, preset navigation, OSC toggle, Output Format, Algorithm/HRTF dropdown" title="Header Bar"/>
+            <wp:cNvGraphicFramePr>
+              <a:graphicFrameLocks xmlns:a="http://schemas.openxmlformats.org/drawingml/2006/main" noChangeAspect="1"/>
+            </wp:cNvGraphicFramePr>
+            <a:graphic xmlns:a="http://schemas.openxmlformats.org/drawingml/2006/main">
+              <a:graphicData uri="http://schemas.openxmlformats.org/drawingml/2006/picture">
+                <pic:pic xmlns:pic="http://schemas.openxmlformats.org/drawingml/2006/picture">
+                  <pic:nvPicPr>
+                    <pic:cNvPr id="0" name="" descr=""/>
+                    <pic:cNvPicPr>
+                      <a:picLocks noChangeAspect="1" noChangeArrowheads="1"/>
+                    </pic:cNvPicPr>
+                  </pic:nvPicPr>
+                  <pic:blipFill>
+                    <a:blip r:embed="rId17" cstate="none"/>
+                    <a:srcRect/>
+                    <a:stretch>
+                      <a:fillRect/>
+                    </a:stretch>
+                  </pic:blipFill>
+                  <pic:spPr bwMode="auto">
+                    <a:xfrm>
+                      <a:off x="0" y="0"/>
+                      <a:ext cx="4572000" cy="285750"/>
+                    </a:xfrm>
+                    <a:prstGeom prst="rect">
+                      <a:avLst/>
+                    </a:prstGeom>
+                  </pic:spPr>
+                </pic:pic>
+              </a:graphicData>
+            </a:graphic>
+          </wp:inline>
+        </w:drawing>
+      </w:r>
+    </w:p>
     <w:p>
       <w:pPr>
         <w:spacing w:after="80"/>
@@ -10419,7 +10368,7 @@
                 <w:sz w:val="18"/>
                 <w:szCs w:val="18"/>
               </w:rPr>
-              <w:t xml:space="preserve">1/4, 1/8, 1/16</w:t>
+              <w:t xml:space="preserve">1/32 – 2/1</w:t>
             </w:r>
           </w:p>
         </w:tc>
@@ -13429,69 +13378,52 @@
       </w:r>
       <w:bookmarkEnd w:id="1"/>
     </w:p>
-    <w:tbl>
-      <w:tblPr>
-        <w:tblW w:type="dxa" w:w="9026"/>
-        <w:tblBorders>
-          <w:top w:val="single" w:color="auto" w:sz="4"/>
-          <w:left w:val="single" w:color="auto" w:sz="4"/>
-          <w:bottom w:val="single" w:color="auto" w:sz="4"/>
-          <w:right w:val="single" w:color="auto" w:sz="4"/>
-          <w:insideH w:val="single" w:color="auto" w:sz="4"/>
-          <w:insideV w:val="single" w:color="auto" w:sz="4"/>
-        </w:tblBorders>
-      </w:tblPr>
-      <w:tblGrid>
-        <w:gridCol w:w="9026"/>
-      </w:tblGrid>
-      <w:tr>
-        <w:tc>
-          <w:tcPr>
-            <w:tcW w:type="dxa" w:w="9026"/>
-            <w:tcBorders>
-              <w:top w:val="dashed" w:color="CBD5E1" w:sz="1"/>
-              <w:left w:val="dashed" w:color="CBD5E1" w:sz="1"/>
-              <w:bottom w:val="dashed" w:color="CBD5E1" w:sz="1"/>
-              <w:right w:val="dashed" w:color="CBD5E1" w:sz="1"/>
-            </w:tcBorders>
-            <w:shd w:fill="F0F4F8" w:val="clear"/>
-            <w:tcMar>
-              <w:top w:type="dxa" w:w="80"/>
-              <w:left w:type="dxa" w:w="120"/>
-              <w:bottom w:type="dxa" w:w="80"/>
-              <w:right w:type="dxa" w:w="120"/>
-            </w:tcMar>
-          </w:tcPr>
-          <w:p>
-            <w:pPr>
-              <w:spacing w:after="0"/>
-            </w:pPr>
-          </w:p>
-          <w:p>
-            <w:pPr>
-              <w:spacing w:after="40"/>
-              <w:jc w:val="center"/>
-            </w:pPr>
-            <w:r>
-              <w:rPr>
-                <w:rFonts w:ascii="DM Sans" w:cs="DM Sans" w:eastAsia="DM Sans" w:hAnsi="DM Sans"/>
-                <w:i/>
-                <w:iCs/>
-                <w:color w:val="64748B"/>
-                <w:sz w:val="20"/>
-                <w:szCs w:val="20"/>
-              </w:rPr>
-              <w:t xml:space="preserve">[ Screenshot: Bottom Panel — showing tap selector buttons (1–12) and per-tap controls ]</w:t>
-            </w:r>
-          </w:p>
-          <w:p>
-            <w:pPr>
-              <w:spacing w:after="0"/>
-            </w:pPr>
-          </w:p>
-        </w:tc>
-      </w:tr>
-    </w:tbl>
+    <w:p>
+      <w:pPr>
+        <w:spacing w:after="120" w:before="80"/>
+        <w:jc w:val="center"/>
+      </w:pPr>
+      <w:r>
+        <w:drawing>
+          <wp:inline distT="0" distB="0" distL="0" distR="0">
+            <wp:extent cx="4572000" cy="666750"/>
+            <wp:effectExtent t="0" r="0" b="0" l="0"/>
+            <wp:docPr id="1" name="bottom-panel" descr="Bottom Panel — showing tap selector buttons (1–12) and per-tap controls" title="Bottom Panel"/>
+            <wp:cNvGraphicFramePr>
+              <a:graphicFrameLocks xmlns:a="http://schemas.openxmlformats.org/drawingml/2006/main" noChangeAspect="1"/>
+            </wp:cNvGraphicFramePr>
+            <a:graphic xmlns:a="http://schemas.openxmlformats.org/drawingml/2006/main">
+              <a:graphicData uri="http://schemas.openxmlformats.org/drawingml/2006/picture">
+                <pic:pic xmlns:pic="http://schemas.openxmlformats.org/drawingml/2006/picture">
+                  <pic:nvPicPr>
+                    <pic:cNvPr id="0" name="" descr=""/>
+                    <pic:cNvPicPr>
+                      <a:picLocks noChangeAspect="1" noChangeArrowheads="1"/>
+                    </pic:cNvPicPr>
+                  </pic:nvPicPr>
+                  <pic:blipFill>
+                    <a:blip r:embed="rId18" cstate="none"/>
+                    <a:srcRect/>
+                    <a:stretch>
+                      <a:fillRect/>
+                    </a:stretch>
+                  </pic:blipFill>
+                  <pic:spPr bwMode="auto">
+                    <a:xfrm>
+                      <a:off x="0" y="0"/>
+                      <a:ext cx="4572000" cy="666750"/>
+                    </a:xfrm>
+                    <a:prstGeom prst="rect">
+                      <a:avLst/>
+                    </a:prstGeom>
+                  </pic:spPr>
+                </pic:pic>
+              </a:graphicData>
+            </a:graphic>
+          </wp:inline>
+        </w:drawing>
+      </w:r>
+    </w:p>
     <w:p>
       <w:pPr>
         <w:spacing w:after="80"/>
@@ -14639,7 +14571,7 @@
                 <w:sz w:val="18"/>
                 <w:szCs w:val="18"/>
               </w:rPr>
-              <w:t xml:space="preserve">0.1–10.0×</w:t>
+              <w:t xml:space="preserve">0.00–5.00 Hz</w:t>
             </w:r>
           </w:p>
         </w:tc>
@@ -14667,7 +14599,7 @@
                 <w:sz w:val="18"/>
                 <w:szCs w:val="18"/>
               </w:rPr>
-              <w:t xml:space="preserve">1.0×</w:t>
+              <w:t xml:space="preserve">0.30 Hz</w:t>
             </w:r>
           </w:p>
         </w:tc>
@@ -16261,7 +16193,7 @@
           <w:sz w:val="22"/>
           <w:szCs w:val="22"/>
         </w:rPr>
-        <w:t xml:space="preserve">controls the animation rate (0.1–10.0× the base frequency). </w:t>
+        <w:t xml:space="preserve">controls the animation rate (0.00–5.00 Hz). </w:t>
       </w:r>
       <w:r>
         <w:rPr>
@@ -18385,7 +18317,7 @@
         <w:spacing w:after="60"/>
         <w:jc w:val="center"/>
       </w:pPr>
-      <w:hyperlink w:history="1" r:id="rIdqskgghua08ksfqmswknxl">
+      <w:hyperlink w:history="1" r:id="rIdosqsuzq8xeyxvtat1dmei">
         <w:r>
           <w:rPr>
             <w:rFonts w:ascii="DM Sans" w:cs="DM Sans" w:eastAsia="DM Sans" w:hAnsi="DM Sans"/>
@@ -18403,7 +18335,7 @@
         <w:spacing w:after="60"/>
         <w:jc w:val="center"/>
       </w:pPr>
-      <w:hyperlink w:history="1" r:id="rIdhrtn2a5lbx9lfn2y_frvp">
+      <w:hyperlink w:history="1" r:id="rIddam211owqzp2zd1gzhtd4">
         <w:r>
           <w:rPr>
             <w:rFonts w:ascii="DM Sans" w:cs="DM Sans" w:eastAsia="DM Sans" w:hAnsi="DM Sans"/>

</xml_diff>

<commit_message>
Add third-party legal notices and update documentation for post-v1.0 changes
- Create standalone legal notices DOCX (generate_legal_notices.js) covering
  all distributed third-party components: JUCE, libmysofa, zlib, 5 HRTF
  datasets, and 3 font families with full license texts and attributions
- Add Third-Party Notices section to user manual (generate_manual.js)
- Update algorithm section: 7→8 algorithms, add Constant Power as default,
  update recommendation callout
- Add HRTF low-frequency bypass explanation to manual
- Update VERSION_HISTORY.md with all post-baseline changes: Constant Power
  algorithm, HRTF LF bypass, 9.1 Surround, Ableton compatibility, wobble
  fix, and 15+ bug fixes
- Regenerate manual DOCX with all updates

Co-Authored-By: Claude Opus 4.6 (1M context) <noreply@anthropic.com>
</commit_message>
<xml_diff>
--- a/docs/OpenSpatialDelay_Manual_v1.0.docx
+++ b/docs/OpenSpatialDelay_Manual_v1.0.docx
@@ -1215,6 +1215,36 @@
     </w:p>
     <w:p>
       <w:pPr>
+        <w:spacing w:after="140" w:before="80"/>
+        <w:ind w:left="0"/>
+      </w:pPr>
+      <w:hyperlink w:history="1" w:anchor="legal-notices">
+        <w:r>
+          <w:rPr>
+            <w:rFonts w:ascii="DM Sans" w:cs="DM Sans" w:eastAsia="DM Sans" w:hAnsi="DM Sans"/>
+            <w:b/>
+            <w:bCs/>
+            <w:color w:val="64748B"/>
+            <w:sz w:val="24"/>
+            <w:szCs w:val="24"/>
+          </w:rPr>
+          <w:t xml:space="preserve">11</w:t>
+        </w:r>
+        <w:r>
+          <w:rPr>
+            <w:rFonts w:ascii="DM Sans" w:cs="DM Sans" w:eastAsia="DM Sans" w:hAnsi="DM Sans"/>
+            <w:b/>
+            <w:bCs/>
+            <w:color w:val="001633"/>
+            <w:sz w:val="24"/>
+            <w:szCs w:val="24"/>
+          </w:rPr>
+          <w:t xml:space="preserve">  Third-Party Notices</w:t>
+        </w:r>
+      </w:hyperlink>
+    </w:p>
+    <w:p>
+      <w:pPr>
         <w:sectPr>
           <w:headerReference w:type="default" r:id="rId7"/>
           <w:footerReference w:type="default" r:id="rId8"/>
@@ -1312,7 +1342,7 @@
         </w:rPr>
         <w:t xml:space="preserve">Download the latest release for your platform from the </w:t>
       </w:r>
-      <w:hyperlink w:history="1" r:id="rIdandtqqnedg09069ta7onh">
+      <w:hyperlink w:history="1" r:id="rId9to0rgrpfskqczdfhztmw">
         <w:r>
           <w:rPr>
             <w:rFonts w:ascii="DM Sans" w:cs="DM Sans" w:eastAsia="DM Sans" w:hAnsi="DM Sans"/>
@@ -2934,7 +2964,7 @@
           <w:sz w:val="22"/>
           <w:szCs w:val="22"/>
         </w:rPr>
-        <w:t xml:space="preserve">7 spatialization algorithms </w:t>
+        <w:t xml:space="preserve">8 spatialization algorithms </w:t>
       </w:r>
       <w:r>
         <w:rPr>
@@ -2943,7 +2973,7 @@
           <w:sz w:val="22"/>
           <w:szCs w:val="22"/>
         </w:rPr>
-        <w:t xml:space="preserve">— VBAP, VBIP, MDAP, KNN, DBAP, Ambisonics, and direct binaural HRTF convolution with 6 measured profiles.</w:t>
+        <w:t xml:space="preserve">— Constant Power, VBAP, VBIP, MDAP, KNN, DBAP, Ambisonics, and direct binaural HRTF convolution with 6 measured profiles.</w:t>
       </w:r>
     </w:p>
     <w:p>
@@ -8011,7 +8041,7 @@
                 <w:sz w:val="18"/>
                 <w:szCs w:val="18"/>
               </w:rPr>
-              <w:t xml:space="preserve">VBAP</w:t>
+              <w:t xml:space="preserve">Constant Power</w:t>
             </w:r>
           </w:p>
         </w:tc>
@@ -8039,7 +8069,7 @@
                 <w:sz w:val="18"/>
                 <w:szCs w:val="18"/>
               </w:rPr>
-              <w:t xml:space="preserve">Precise point sources, production mixing</w:t>
+              <w:t xml:space="preserve">Most surround work (default)</w:t>
             </w:r>
           </w:p>
         </w:tc>
@@ -8067,7 +8097,7 @@
                 <w:sz w:val="18"/>
                 <w:szCs w:val="18"/>
               </w:rPr>
-              <w:t xml:space="preserve">Focused, sharp localization</w:t>
+              <w:t xml:space="preserve">Cosine-distance weighting, wide natural rolloff</w:t>
             </w:r>
           </w:p>
         </w:tc>
@@ -8098,7 +8128,7 @@
                 <w:sz w:val="18"/>
                 <w:szCs w:val="18"/>
               </w:rPr>
-              <w:t xml:space="preserve">VBIP</w:t>
+              <w:t xml:space="preserve">VBAP</w:t>
             </w:r>
           </w:p>
         </w:tc>
@@ -8127,7 +8157,7 @@
                 <w:sz w:val="18"/>
                 <w:szCs w:val="18"/>
               </w:rPr>
-              <w:t xml:space="preserve">Off-axis listener stability</w:t>
+              <w:t xml:space="preserve">Precise point sources, production mixing</w:t>
             </w:r>
           </w:p>
         </w:tc>
@@ -8156,7 +8186,7 @@
                 <w:sz w:val="18"/>
                 <w:szCs w:val="18"/>
               </w:rPr>
-              <w:t xml:space="preserve">VBAP with intensity weighting, smoother</w:t>
+              <w:t xml:space="preserve">Focused, sharp localization</w:t>
             </w:r>
           </w:p>
         </w:tc>
@@ -8186,7 +8216,7 @@
                 <w:sz w:val="18"/>
                 <w:szCs w:val="18"/>
               </w:rPr>
-              <w:t xml:space="preserve">MDAP</w:t>
+              <w:t xml:space="preserve">VBIP</w:t>
             </w:r>
           </w:p>
         </w:tc>
@@ -8214,7 +8244,7 @@
                 <w:sz w:val="18"/>
                 <w:szCs w:val="18"/>
               </w:rPr>
-              <w:t xml:space="preserve">Wide, stable spatial images</w:t>
+              <w:t xml:space="preserve">Off-axis listener stability</w:t>
             </w:r>
           </w:p>
         </w:tc>
@@ -8242,7 +8272,7 @@
                 <w:sz w:val="18"/>
                 <w:szCs w:val="18"/>
               </w:rPr>
-              <w:t xml:space="preserve">VBAP + 8 spread sub-sources around main position</w:t>
+              <w:t xml:space="preserve">VBAP with intensity weighting, smoother</w:t>
             </w:r>
           </w:p>
         </w:tc>
@@ -8273,7 +8303,7 @@
                 <w:sz w:val="18"/>
                 <w:szCs w:val="18"/>
               </w:rPr>
-              <w:t xml:space="preserve">KNN</w:t>
+              <w:t xml:space="preserve">MDAP</w:t>
             </w:r>
           </w:p>
         </w:tc>
@@ -8302,7 +8332,7 @@
                 <w:sz w:val="18"/>
                 <w:szCs w:val="18"/>
               </w:rPr>
-              <w:t xml:space="preserve">Irregular or curved speaker arrays</w:t>
+              <w:t xml:space="preserve">Wide, stable spatial images</w:t>
             </w:r>
           </w:p>
         </w:tc>
@@ -8331,7 +8361,7 @@
                 <w:sz w:val="18"/>
                 <w:szCs w:val="18"/>
               </w:rPr>
-              <w:t xml:space="preserve">3 nearest speakers, distance-weighted, natural</w:t>
+              <w:t xml:space="preserve">VBAP + 8 spread sub-sources around main position</w:t>
             </w:r>
           </w:p>
         </w:tc>
@@ -8361,7 +8391,7 @@
                 <w:sz w:val="18"/>
                 <w:szCs w:val="18"/>
               </w:rPr>
-              <w:t xml:space="preserve">DBAP</w:t>
+              <w:t xml:space="preserve">KNN</w:t>
             </w:r>
           </w:p>
         </w:tc>
@@ -8389,7 +8419,7 @@
                 <w:sz w:val="18"/>
                 <w:szCs w:val="18"/>
               </w:rPr>
-              <w:t xml:space="preserve">Non-standard speaker layouts</w:t>
+              <w:t xml:space="preserve">Irregular or curved speaker arrays</w:t>
             </w:r>
           </w:p>
         </w:tc>
@@ -8417,7 +8447,7 @@
                 <w:sz w:val="18"/>
                 <w:szCs w:val="18"/>
               </w:rPr>
-              <w:t xml:space="preserve">Distance-based, warm and diffuse</w:t>
+              <w:t xml:space="preserve">3 nearest speakers, distance-weighted, natural</w:t>
             </w:r>
           </w:p>
         </w:tc>
@@ -8448,6 +8478,94 @@
                 <w:sz w:val="18"/>
                 <w:szCs w:val="18"/>
               </w:rPr>
+              <w:t xml:space="preserve">DBAP</w:t>
+            </w:r>
+          </w:p>
+        </w:tc>
+        <w:tc>
+          <w:tcPr>
+            <w:tcW w:type="dxa" w:w="3200"/>
+            <w:tcBorders>
+              <w:top w:val="single" w:color="E2E8F0" w:sz="1"/>
+              <w:left w:val="single" w:color="E2E8F0" w:sz="1"/>
+              <w:bottom w:val="single" w:color="E2E8F0" w:sz="1"/>
+              <w:right w:val="single" w:color="E2E8F0" w:sz="1"/>
+            </w:tcBorders>
+            <w:shd w:fill="F8FAFC" w:val="clear"/>
+            <w:tcMar>
+              <w:top w:type="dxa" w:w="50"/>
+              <w:left w:type="dxa" w:w="100"/>
+              <w:bottom w:type="dxa" w:w="50"/>
+              <w:right w:type="dxa" w:w="100"/>
+            </w:tcMar>
+          </w:tcPr>
+          <w:p>
+            <w:r>
+              <w:rPr>
+                <w:rFonts w:ascii="DM Sans" w:cs="DM Sans" w:eastAsia="DM Sans" w:hAnsi="DM Sans"/>
+                <w:color w:val="1A1A2E"/>
+                <w:sz w:val="18"/>
+                <w:szCs w:val="18"/>
+              </w:rPr>
+              <w:t xml:space="preserve">Non-standard speaker layouts</w:t>
+            </w:r>
+          </w:p>
+        </w:tc>
+        <w:tc>
+          <w:tcPr>
+            <w:tcW w:type="dxa" w:w="4026"/>
+            <w:tcBorders>
+              <w:top w:val="single" w:color="E2E8F0" w:sz="1"/>
+              <w:left w:val="single" w:color="E2E8F0" w:sz="1"/>
+              <w:bottom w:val="single" w:color="E2E8F0" w:sz="1"/>
+              <w:right w:val="single" w:color="E2E8F0" w:sz="1"/>
+            </w:tcBorders>
+            <w:shd w:fill="F8FAFC" w:val="clear"/>
+            <w:tcMar>
+              <w:top w:type="dxa" w:w="50"/>
+              <w:left w:type="dxa" w:w="100"/>
+              <w:bottom w:type="dxa" w:w="50"/>
+              <w:right w:type="dxa" w:w="100"/>
+            </w:tcMar>
+          </w:tcPr>
+          <w:p>
+            <w:r>
+              <w:rPr>
+                <w:rFonts w:ascii="DM Sans" w:cs="DM Sans" w:eastAsia="DM Sans" w:hAnsi="DM Sans"/>
+                <w:color w:val="1A1A2E"/>
+                <w:sz w:val="18"/>
+                <w:szCs w:val="18"/>
+              </w:rPr>
+              <w:t xml:space="preserve">Distance-based, warm and diffuse</w:t>
+            </w:r>
+          </w:p>
+        </w:tc>
+      </w:tr>
+      <w:tr>
+        <w:tc>
+          <w:tcPr>
+            <w:tcW w:type="dxa" w:w="1800"/>
+            <w:tcBorders>
+              <w:top w:val="single" w:color="E2E8F0" w:sz="1"/>
+              <w:left w:val="single" w:color="E2E8F0" w:sz="1"/>
+              <w:bottom w:val="single" w:color="E2E8F0" w:sz="1"/>
+              <w:right w:val="single" w:color="E2E8F0" w:sz="1"/>
+            </w:tcBorders>
+            <w:tcMar>
+              <w:top w:type="dxa" w:w="50"/>
+              <w:left w:type="dxa" w:w="100"/>
+              <w:bottom w:type="dxa" w:w="50"/>
+              <w:right w:type="dxa" w:w="100"/>
+            </w:tcMar>
+          </w:tcPr>
+          <w:p>
+            <w:r>
+              <w:rPr>
+                <w:rFonts w:ascii="DM Sans" w:cs="DM Sans" w:eastAsia="DM Sans" w:hAnsi="DM Sans"/>
+                <w:color w:val="1A1A2E"/>
+                <w:sz w:val="18"/>
+                <w:szCs w:val="18"/>
+              </w:rPr>
               <w:t xml:space="preserve">Ambisonics</w:t>
             </w:r>
           </w:p>
@@ -8461,7 +8579,6 @@
               <w:bottom w:val="single" w:color="E2E8F0" w:sz="1"/>
               <w:right w:val="single" w:color="E2E8F0" w:sz="1"/>
             </w:tcBorders>
-            <w:shd w:fill="F8FAFC" w:val="clear"/>
             <w:tcMar>
               <w:top w:type="dxa" w:w="50"/>
               <w:left w:type="dxa" w:w="100"/>
@@ -8490,7 +8607,6 @@
               <w:bottom w:val="single" w:color="E2E8F0" w:sz="1"/>
               <w:right w:val="single" w:color="E2E8F0" w:sz="1"/>
             </w:tcBorders>
-            <w:shd w:fill="F8FAFC" w:val="clear"/>
             <w:tcMar>
               <w:top w:type="dxa" w:w="50"/>
               <w:left w:type="dxa" w:w="100"/>
@@ -8577,7 +8693,7 @@
                 <w:sz w:val="20"/>
                 <w:szCs w:val="20"/>
               </w:rPr>
-              <w:t xml:space="preserve">For most surround work, start with VBAP — it produces the most focused spatial images and is the industry standard for object-based audio.</w:t>
+              <w:t xml:space="preserve">Start with Constant Power (the default) — it provides smooth, natural panning suitable for most surround work.</w:t>
             </w:r>
           </w:p>
           <w:p>
@@ -8591,7 +8707,7 @@
                 <w:sz w:val="20"/>
                 <w:szCs w:val="20"/>
               </w:rPr>
-              <w:t xml:space="preserve">For wider, more stable sources, try MDAP. For non-standard or irregular speaker arrangements, use DBAP.</w:t>
+              <w:t xml:space="preserve">For sharper, more focused point sources, switch to VBAP. For wider, more stable sources, try MDAP. For non-standard or irregular speaker arrangements, use DBAP.</w:t>
             </w:r>
           </w:p>
           <w:p>
@@ -8605,7 +8721,7 @@
                 <w:sz w:val="20"/>
                 <w:szCs w:val="20"/>
               </w:rPr>
-              <w:t xml:space="preserve">The algorithm dropdown only appears for surround and Ambisonics formats. For binaural output, HRTF convolution handles spatialization directly.</w:t>
+              <w:t xml:space="preserve">The algorithm dropdown only appears for surround formats. For Ambisonics output, the algorithm is always Ambisonics. For binaural output, HRTF convolution handles spatialization directly.</w:t>
             </w:r>
           </w:p>
         </w:tc>
@@ -9609,6 +9725,36 @@
         </w:tc>
       </w:tr>
     </w:tbl>
+    <w:p>
+      <w:pPr>
+        <w:spacing w:after="160"/>
+      </w:pPr>
+    </w:p>
+    <w:p>
+      <w:pPr>
+        <w:spacing w:after="160" w:line="300"/>
+      </w:pPr>
+      <w:r>
+        <w:rPr>
+          <w:rFonts w:ascii="DM Sans" w:cs="DM Sans" w:eastAsia="DM Sans" w:hAnsi="DM Sans"/>
+          <w:b/>
+          <w:bCs/>
+          <w:color w:val="1A1A2E"/>
+          <w:sz w:val="22"/>
+          <w:szCs w:val="22"/>
+        </w:rPr>
+        <w:t xml:space="preserve">Low-frequency bypass: </w:t>
+      </w:r>
+      <w:r>
+        <w:rPr>
+          <w:rFonts w:ascii="DM Sans" w:cs="DM Sans" w:eastAsia="DM Sans" w:hAnsi="DM Sans"/>
+          <w:color w:val="1A1A2E"/>
+          <w:sz w:val="22"/>
+          <w:szCs w:val="22"/>
+        </w:rPr>
+        <w:t xml:space="preserve">Some HRTF measurements lack low-frequency content below 200 Hz. OpenSpatialDelay automatically detects this and routes bass directly to the output, bypassing the HRTF convolution. This ensures solid bass regardless of which HRTF profile you choose.</w:t>
+      </w:r>
+    </w:p>
     <w:p>
       <w:r>
         <w:br w:type="page"/>
@@ -18183,6 +18329,2190 @@
     </w:p>
     <w:p>
       <w:pPr>
+        <w:pStyle w:val="Heading1"/>
+        <w:spacing w:after="240" w:before="360"/>
+      </w:pPr>
+      <w:bookmarkStart w:name="legal-notices" w:id="1"/>
+      <w:r>
+        <w:rPr>
+          <w:rFonts w:ascii="DM Sans" w:cs="DM Sans" w:eastAsia="DM Sans" w:hAnsi="DM Sans"/>
+          <w:b/>
+          <w:bCs/>
+          <w:color w:val="64748B"/>
+          <w:sz w:val="36"/>
+          <w:szCs w:val="36"/>
+        </w:rPr>
+        <w:t xml:space="preserve">11</w:t>
+      </w:r>
+      <w:r>
+        <w:rPr>
+          <w:rFonts w:ascii="DM Sans" w:cs="DM Sans" w:eastAsia="DM Sans" w:hAnsi="DM Sans"/>
+          <w:b/>
+          <w:bCs/>
+          <w:color w:val="001633"/>
+          <w:sz w:val="36"/>
+          <w:szCs w:val="36"/>
+        </w:rPr>
+        <w:t xml:space="preserve">  Third-Party Notices</w:t>
+      </w:r>
+      <w:bookmarkEnd w:id="1"/>
+    </w:p>
+    <w:p>
+      <w:pPr>
+        <w:spacing w:after="160" w:line="300"/>
+      </w:pPr>
+      <w:r>
+        <w:rPr>
+          <w:rFonts w:ascii="DM Sans" w:cs="DM Sans" w:eastAsia="DM Sans" w:hAnsi="DM Sans"/>
+          <w:color w:val="1A1A2E"/>
+          <w:sz w:val="22"/>
+          <w:szCs w:val="22"/>
+        </w:rPr>
+        <w:t xml:space="preserve">OpenSpatialDelay incorporates the following third-party software, data, and fonts. This section provides the required license notices and attributions.</w:t>
+      </w:r>
+    </w:p>
+    <w:p>
+      <w:pPr>
+        <w:pStyle w:val="Heading2"/>
+        <w:spacing w:after="180" w:before="280"/>
+      </w:pPr>
+      <w:r>
+        <w:rPr>
+          <w:rFonts w:ascii="DM Sans" w:cs="DM Sans" w:eastAsia="DM Sans" w:hAnsi="DM Sans"/>
+          <w:b/>
+          <w:bCs/>
+          <w:color w:val="64748B"/>
+          <w:sz w:val="30"/>
+          <w:szCs w:val="30"/>
+        </w:rPr>
+        <w:t xml:space="preserve">11.1</w:t>
+      </w:r>
+      <w:r>
+        <w:rPr>
+          <w:rFonts w:ascii="DM Sans" w:cs="DM Sans" w:eastAsia="DM Sans" w:hAnsi="DM Sans"/>
+          <w:b/>
+          <w:bCs/>
+          <w:color w:val="001633"/>
+          <w:sz w:val="30"/>
+          <w:szCs w:val="30"/>
+        </w:rPr>
+        <w:t xml:space="preserve">  Software Libraries</w:t>
+      </w:r>
+    </w:p>
+    <w:tbl>
+      <w:tblPr>
+        <w:tblW w:type="dxa" w:w="9026"/>
+        <w:tblBorders>
+          <w:top w:val="single" w:color="auto" w:sz="4"/>
+          <w:left w:val="single" w:color="auto" w:sz="4"/>
+          <w:bottom w:val="single" w:color="auto" w:sz="4"/>
+          <w:right w:val="single" w:color="auto" w:sz="4"/>
+          <w:insideH w:val="single" w:color="auto" w:sz="4"/>
+          <w:insideV w:val="single" w:color="auto" w:sz="4"/>
+        </w:tblBorders>
+      </w:tblPr>
+      <w:tblGrid>
+        <w:gridCol w:w="3600"/>
+        <w:gridCol w:w="2400"/>
+        <w:gridCol w:w="3026"/>
+      </w:tblGrid>
+      <w:tr>
+        <w:trPr>
+          <w:tblHeader/>
+        </w:trPr>
+        <w:tc>
+          <w:tcPr>
+            <w:tcW w:type="dxa" w:w="3600"/>
+            <w:tcBorders>
+              <w:top w:val="single" w:color="E2E8F0" w:sz="1"/>
+              <w:left w:val="single" w:color="E2E8F0" w:sz="1"/>
+              <w:bottom w:val="single" w:color="E2E8F0" w:sz="1"/>
+              <w:right w:val="single" w:color="E2E8F0" w:sz="1"/>
+            </w:tcBorders>
+            <w:shd w:fill="001633" w:val="clear"/>
+            <w:tcMar>
+              <w:top w:type="dxa" w:w="60"/>
+              <w:left w:type="dxa" w:w="100"/>
+              <w:bottom w:type="dxa" w:w="60"/>
+              <w:right w:type="dxa" w:w="100"/>
+            </w:tcMar>
+          </w:tcPr>
+          <w:p>
+            <w:r>
+              <w:rPr>
+                <w:rFonts w:ascii="DM Sans" w:cs="DM Sans" w:eastAsia="DM Sans" w:hAnsi="DM Sans"/>
+                <w:b/>
+                <w:bCs/>
+                <w:color w:val="FFFFFF"/>
+                <w:sz w:val="18"/>
+                <w:szCs w:val="18"/>
+              </w:rPr>
+              <w:t xml:space="preserve">Component</w:t>
+            </w:r>
+          </w:p>
+        </w:tc>
+        <w:tc>
+          <w:tcPr>
+            <w:tcW w:type="dxa" w:w="2400"/>
+            <w:tcBorders>
+              <w:top w:val="single" w:color="E2E8F0" w:sz="1"/>
+              <w:left w:val="single" w:color="E2E8F0" w:sz="1"/>
+              <w:bottom w:val="single" w:color="E2E8F0" w:sz="1"/>
+              <w:right w:val="single" w:color="E2E8F0" w:sz="1"/>
+            </w:tcBorders>
+            <w:shd w:fill="001633" w:val="clear"/>
+            <w:tcMar>
+              <w:top w:type="dxa" w:w="60"/>
+              <w:left w:type="dxa" w:w="100"/>
+              <w:bottom w:type="dxa" w:w="60"/>
+              <w:right w:type="dxa" w:w="100"/>
+            </w:tcMar>
+          </w:tcPr>
+          <w:p>
+            <w:r>
+              <w:rPr>
+                <w:rFonts w:ascii="DM Sans" w:cs="DM Sans" w:eastAsia="DM Sans" w:hAnsi="DM Sans"/>
+                <w:b/>
+                <w:bCs/>
+                <w:color w:val="FFFFFF"/>
+                <w:sz w:val="18"/>
+                <w:szCs w:val="18"/>
+              </w:rPr>
+              <w:t xml:space="preserve">License</w:t>
+            </w:r>
+          </w:p>
+        </w:tc>
+        <w:tc>
+          <w:tcPr>
+            <w:tcW w:type="dxa" w:w="3026"/>
+            <w:tcBorders>
+              <w:top w:val="single" w:color="E2E8F0" w:sz="1"/>
+              <w:left w:val="single" w:color="E2E8F0" w:sz="1"/>
+              <w:bottom w:val="single" w:color="E2E8F0" w:sz="1"/>
+              <w:right w:val="single" w:color="E2E8F0" w:sz="1"/>
+            </w:tcBorders>
+            <w:shd w:fill="001633" w:val="clear"/>
+            <w:tcMar>
+              <w:top w:type="dxa" w:w="60"/>
+              <w:left w:type="dxa" w:w="100"/>
+              <w:bottom w:type="dxa" w:w="60"/>
+              <w:right w:type="dxa" w:w="100"/>
+            </w:tcMar>
+          </w:tcPr>
+          <w:p>
+            <w:r>
+              <w:rPr>
+                <w:rFonts w:ascii="DM Sans" w:cs="DM Sans" w:eastAsia="DM Sans" w:hAnsi="DM Sans"/>
+                <w:b/>
+                <w:bCs/>
+                <w:color w:val="FFFFFF"/>
+                <w:sz w:val="18"/>
+                <w:szCs w:val="18"/>
+              </w:rPr>
+              <w:t xml:space="preserve">Copyright</w:t>
+            </w:r>
+          </w:p>
+        </w:tc>
+      </w:tr>
+      <w:tr>
+        <w:tc>
+          <w:tcPr>
+            <w:tcW w:type="dxa" w:w="3600"/>
+            <w:tcBorders>
+              <w:top w:val="single" w:color="E2E8F0" w:sz="1"/>
+              <w:left w:val="single" w:color="E2E8F0" w:sz="1"/>
+              <w:bottom w:val="single" w:color="E2E8F0" w:sz="1"/>
+              <w:right w:val="single" w:color="E2E8F0" w:sz="1"/>
+            </w:tcBorders>
+            <w:tcMar>
+              <w:top w:type="dxa" w:w="50"/>
+              <w:left w:type="dxa" w:w="100"/>
+              <w:bottom w:type="dxa" w:w="50"/>
+              <w:right w:type="dxa" w:w="100"/>
+            </w:tcMar>
+          </w:tcPr>
+          <w:p>
+            <w:r>
+              <w:rPr>
+                <w:rFonts w:ascii="DM Sans" w:cs="DM Sans" w:eastAsia="DM Sans" w:hAnsi="DM Sans"/>
+                <w:color w:val="1A1A2E"/>
+                <w:sz w:val="18"/>
+                <w:szCs w:val="18"/>
+              </w:rPr>
+              <w:t xml:space="preserve">JUCE 8 (Audio Plugin Framework)</w:t>
+            </w:r>
+          </w:p>
+        </w:tc>
+        <w:tc>
+          <w:tcPr>
+            <w:tcW w:type="dxa" w:w="2400"/>
+            <w:tcBorders>
+              <w:top w:val="single" w:color="E2E8F0" w:sz="1"/>
+              <w:left w:val="single" w:color="E2E8F0" w:sz="1"/>
+              <w:bottom w:val="single" w:color="E2E8F0" w:sz="1"/>
+              <w:right w:val="single" w:color="E2E8F0" w:sz="1"/>
+            </w:tcBorders>
+            <w:tcMar>
+              <w:top w:type="dxa" w:w="50"/>
+              <w:left w:type="dxa" w:w="100"/>
+              <w:bottom w:type="dxa" w:w="50"/>
+              <w:right w:type="dxa" w:w="100"/>
+            </w:tcMar>
+          </w:tcPr>
+          <w:p>
+            <w:r>
+              <w:rPr>
+                <w:rFonts w:ascii="DM Sans" w:cs="DM Sans" w:eastAsia="DM Sans" w:hAnsi="DM Sans"/>
+                <w:color w:val="1A1A2E"/>
+                <w:sz w:val="18"/>
+                <w:szCs w:val="18"/>
+              </w:rPr>
+              <w:t xml:space="preserve">GPL-3.0 / Commercial</w:t>
+            </w:r>
+          </w:p>
+        </w:tc>
+        <w:tc>
+          <w:tcPr>
+            <w:tcW w:type="dxa" w:w="3026"/>
+            <w:tcBorders>
+              <w:top w:val="single" w:color="E2E8F0" w:sz="1"/>
+              <w:left w:val="single" w:color="E2E8F0" w:sz="1"/>
+              <w:bottom w:val="single" w:color="E2E8F0" w:sz="1"/>
+              <w:right w:val="single" w:color="E2E8F0" w:sz="1"/>
+            </w:tcBorders>
+            <w:tcMar>
+              <w:top w:type="dxa" w:w="50"/>
+              <w:left w:type="dxa" w:w="100"/>
+              <w:bottom w:type="dxa" w:w="50"/>
+              <w:right w:type="dxa" w:w="100"/>
+            </w:tcMar>
+          </w:tcPr>
+          <w:p>
+            <w:r>
+              <w:rPr>
+                <w:rFonts w:ascii="DM Sans" w:cs="DM Sans" w:eastAsia="DM Sans" w:hAnsi="DM Sans"/>
+                <w:color w:val="1A1A2E"/>
+                <w:sz w:val="18"/>
+                <w:szCs w:val="18"/>
+              </w:rPr>
+              <w:t xml:space="preserve">Raw Material Software Limited</w:t>
+            </w:r>
+          </w:p>
+        </w:tc>
+      </w:tr>
+      <w:tr>
+        <w:tc>
+          <w:tcPr>
+            <w:tcW w:type="dxa" w:w="3600"/>
+            <w:tcBorders>
+              <w:top w:val="single" w:color="E2E8F0" w:sz="1"/>
+              <w:left w:val="single" w:color="E2E8F0" w:sz="1"/>
+              <w:bottom w:val="single" w:color="E2E8F0" w:sz="1"/>
+              <w:right w:val="single" w:color="E2E8F0" w:sz="1"/>
+            </w:tcBorders>
+            <w:shd w:fill="F8FAFC" w:val="clear"/>
+            <w:tcMar>
+              <w:top w:type="dxa" w:w="50"/>
+              <w:left w:type="dxa" w:w="100"/>
+              <w:bottom w:type="dxa" w:w="50"/>
+              <w:right w:type="dxa" w:w="100"/>
+            </w:tcMar>
+          </w:tcPr>
+          <w:p>
+            <w:r>
+              <w:rPr>
+                <w:rFonts w:ascii="DM Sans" w:cs="DM Sans" w:eastAsia="DM Sans" w:hAnsi="DM Sans"/>
+                <w:color w:val="1A1A2E"/>
+                <w:sz w:val="18"/>
+                <w:szCs w:val="18"/>
+              </w:rPr>
+              <w:t xml:space="preserve">libmysofa v1.3.2 (SOFA File Reader)</w:t>
+            </w:r>
+          </w:p>
+        </w:tc>
+        <w:tc>
+          <w:tcPr>
+            <w:tcW w:type="dxa" w:w="2400"/>
+            <w:tcBorders>
+              <w:top w:val="single" w:color="E2E8F0" w:sz="1"/>
+              <w:left w:val="single" w:color="E2E8F0" w:sz="1"/>
+              <w:bottom w:val="single" w:color="E2E8F0" w:sz="1"/>
+              <w:right w:val="single" w:color="E2E8F0" w:sz="1"/>
+            </w:tcBorders>
+            <w:shd w:fill="F8FAFC" w:val="clear"/>
+            <w:tcMar>
+              <w:top w:type="dxa" w:w="50"/>
+              <w:left w:type="dxa" w:w="100"/>
+              <w:bottom w:type="dxa" w:w="50"/>
+              <w:right w:type="dxa" w:w="100"/>
+            </w:tcMar>
+          </w:tcPr>
+          <w:p>
+            <w:r>
+              <w:rPr>
+                <w:rFonts w:ascii="DM Sans" w:cs="DM Sans" w:eastAsia="DM Sans" w:hAnsi="DM Sans"/>
+                <w:color w:val="1A1A2E"/>
+                <w:sz w:val="18"/>
+                <w:szCs w:val="18"/>
+              </w:rPr>
+              <w:t xml:space="preserve">BSD-3-Clause</w:t>
+            </w:r>
+          </w:p>
+        </w:tc>
+        <w:tc>
+          <w:tcPr>
+            <w:tcW w:type="dxa" w:w="3026"/>
+            <w:tcBorders>
+              <w:top w:val="single" w:color="E2E8F0" w:sz="1"/>
+              <w:left w:val="single" w:color="E2E8F0" w:sz="1"/>
+              <w:bottom w:val="single" w:color="E2E8F0" w:sz="1"/>
+              <w:right w:val="single" w:color="E2E8F0" w:sz="1"/>
+            </w:tcBorders>
+            <w:shd w:fill="F8FAFC" w:val="clear"/>
+            <w:tcMar>
+              <w:top w:type="dxa" w:w="50"/>
+              <w:left w:type="dxa" w:w="100"/>
+              <w:bottom w:type="dxa" w:w="50"/>
+              <w:right w:type="dxa" w:w="100"/>
+            </w:tcMar>
+          </w:tcPr>
+          <w:p>
+            <w:r>
+              <w:rPr>
+                <w:rFonts w:ascii="DM Sans" w:cs="DM Sans" w:eastAsia="DM Sans" w:hAnsi="DM Sans"/>
+                <w:color w:val="1A1A2E"/>
+                <w:sz w:val="18"/>
+                <w:szCs w:val="18"/>
+              </w:rPr>
+              <w:t xml:space="preserve">Christian Hoene, Symonics GmbH</w:t>
+            </w:r>
+          </w:p>
+        </w:tc>
+      </w:tr>
+      <w:tr>
+        <w:tc>
+          <w:tcPr>
+            <w:tcW w:type="dxa" w:w="3600"/>
+            <w:tcBorders>
+              <w:top w:val="single" w:color="E2E8F0" w:sz="1"/>
+              <w:left w:val="single" w:color="E2E8F0" w:sz="1"/>
+              <w:bottom w:val="single" w:color="E2E8F0" w:sz="1"/>
+              <w:right w:val="single" w:color="E2E8F0" w:sz="1"/>
+            </w:tcBorders>
+            <w:tcMar>
+              <w:top w:type="dxa" w:w="50"/>
+              <w:left w:type="dxa" w:w="100"/>
+              <w:bottom w:type="dxa" w:w="50"/>
+              <w:right w:type="dxa" w:w="100"/>
+            </w:tcMar>
+          </w:tcPr>
+          <w:p>
+            <w:r>
+              <w:rPr>
+                <w:rFonts w:ascii="DM Sans" w:cs="DM Sans" w:eastAsia="DM Sans" w:hAnsi="DM Sans"/>
+                <w:color w:val="1A1A2E"/>
+                <w:sz w:val="18"/>
+                <w:szCs w:val="18"/>
+              </w:rPr>
+              <w:t xml:space="preserve">zlib (Compression)</w:t>
+            </w:r>
+          </w:p>
+        </w:tc>
+        <w:tc>
+          <w:tcPr>
+            <w:tcW w:type="dxa" w:w="2400"/>
+            <w:tcBorders>
+              <w:top w:val="single" w:color="E2E8F0" w:sz="1"/>
+              <w:left w:val="single" w:color="E2E8F0" w:sz="1"/>
+              <w:bottom w:val="single" w:color="E2E8F0" w:sz="1"/>
+              <w:right w:val="single" w:color="E2E8F0" w:sz="1"/>
+            </w:tcBorders>
+            <w:tcMar>
+              <w:top w:type="dxa" w:w="50"/>
+              <w:left w:type="dxa" w:w="100"/>
+              <w:bottom w:type="dxa" w:w="50"/>
+              <w:right w:type="dxa" w:w="100"/>
+            </w:tcMar>
+          </w:tcPr>
+          <w:p>
+            <w:r>
+              <w:rPr>
+                <w:rFonts w:ascii="DM Sans" w:cs="DM Sans" w:eastAsia="DM Sans" w:hAnsi="DM Sans"/>
+                <w:color w:val="1A1A2E"/>
+                <w:sz w:val="18"/>
+                <w:szCs w:val="18"/>
+              </w:rPr>
+              <w:t xml:space="preserve">zlib License</w:t>
+            </w:r>
+          </w:p>
+        </w:tc>
+        <w:tc>
+          <w:tcPr>
+            <w:tcW w:type="dxa" w:w="3026"/>
+            <w:tcBorders>
+              <w:top w:val="single" w:color="E2E8F0" w:sz="1"/>
+              <w:left w:val="single" w:color="E2E8F0" w:sz="1"/>
+              <w:bottom w:val="single" w:color="E2E8F0" w:sz="1"/>
+              <w:right w:val="single" w:color="E2E8F0" w:sz="1"/>
+            </w:tcBorders>
+            <w:tcMar>
+              <w:top w:type="dxa" w:w="50"/>
+              <w:left w:type="dxa" w:w="100"/>
+              <w:bottom w:type="dxa" w:w="50"/>
+              <w:right w:type="dxa" w:w="100"/>
+            </w:tcMar>
+          </w:tcPr>
+          <w:p>
+            <w:r>
+              <w:rPr>
+                <w:rFonts w:ascii="DM Sans" w:cs="DM Sans" w:eastAsia="DM Sans" w:hAnsi="DM Sans"/>
+                <w:color w:val="1A1A2E"/>
+                <w:sz w:val="18"/>
+                <w:szCs w:val="18"/>
+              </w:rPr>
+              <w:t xml:space="preserve">Jean-loup Gailly, Mark Adler</w:t>
+            </w:r>
+          </w:p>
+        </w:tc>
+      </w:tr>
+    </w:tbl>
+    <w:p>
+      <w:pPr>
+        <w:spacing w:after="160"/>
+      </w:pPr>
+    </w:p>
+    <w:p>
+      <w:pPr>
+        <w:spacing w:after="160" w:line="300"/>
+      </w:pPr>
+      <w:r>
+        <w:rPr>
+          <w:rFonts w:ascii="DM Sans" w:cs="DM Sans" w:eastAsia="DM Sans" w:hAnsi="DM Sans"/>
+          <w:b/>
+          <w:bCs/>
+          <w:color w:val="1A1A2E"/>
+          <w:sz w:val="22"/>
+          <w:szCs w:val="22"/>
+        </w:rPr>
+        <w:t xml:space="preserve">JUCE: </w:t>
+      </w:r>
+      <w:r>
+        <w:rPr>
+          <w:rFonts w:ascii="DM Sans" w:cs="DM Sans" w:eastAsia="DM Sans" w:hAnsi="DM Sans"/>
+          <w:color w:val="1A1A2E"/>
+          <w:sz w:val="22"/>
+          <w:szCs w:val="22"/>
+        </w:rPr>
+        <w:t xml:space="preserve">JUCE is dual-licensed under the GNU General Public License v3.0 and a commercial license. OpenSpatialDelay uses JUCE under the GPL-3.0. See </w:t>
+      </w:r>
+      <w:hyperlink w:history="1" r:id="rIds04sdmjy6_0doiigoruaw">
+        <w:r>
+          <w:rPr>
+            <w:rFonts w:ascii="DM Sans" w:cs="DM Sans" w:eastAsia="DM Sans" w:hAnsi="DM Sans"/>
+            <w:color w:val="2563EB"/>
+            <w:sz w:val="22"/>
+            <w:szCs w:val="22"/>
+            <w:u w:val="single"/>
+          </w:rPr>
+          <w:t xml:space="preserve">juce.com</w:t>
+        </w:r>
+      </w:hyperlink>
+      <w:r>
+        <w:rPr>
+          <w:rFonts w:ascii="DM Sans" w:cs="DM Sans" w:eastAsia="DM Sans" w:hAnsi="DM Sans"/>
+          <w:color w:val="1A1A2E"/>
+          <w:sz w:val="22"/>
+          <w:szCs w:val="22"/>
+        </w:rPr>
+        <w:t xml:space="preserve"> for details.</w:t>
+      </w:r>
+    </w:p>
+    <w:p>
+      <w:pPr>
+        <w:spacing w:after="160" w:line="300"/>
+      </w:pPr>
+      <w:r>
+        <w:rPr>
+          <w:rFonts w:ascii="DM Sans" w:cs="DM Sans" w:eastAsia="DM Sans" w:hAnsi="DM Sans"/>
+          <w:b/>
+          <w:bCs/>
+          <w:color w:val="1A1A2E"/>
+          <w:sz w:val="22"/>
+          <w:szCs w:val="22"/>
+        </w:rPr>
+        <w:t xml:space="preserve">libmysofa: </w:t>
+      </w:r>
+      <w:r>
+        <w:rPr>
+          <w:rFonts w:ascii="DM Sans" w:cs="DM Sans" w:eastAsia="DM Sans" w:hAnsi="DM Sans"/>
+          <w:color w:val="1A1A2E"/>
+          <w:sz w:val="22"/>
+          <w:szCs w:val="22"/>
+        </w:rPr>
+        <w:t xml:space="preserve">Copyright (c) 2016-2024 Christian Hoene, Symonics GmbH. Redistribution and use in source and binary forms, with or without modification, are permitted provided that the following conditions are met: (1) Redistributions of source code must retain the above copyright notice, this list of conditions, and the following disclaimer. (2) Redistributions in binary form must reproduce the above copyright notice, this list of conditions, and the following disclaimer in the documentation and/or other materials provided with the distribution. (3) Neither the name of Symonics GmbH nor the names of its contributors may be used to endorse or promote products derived from this software without specific prior written permission.</w:t>
+      </w:r>
+    </w:p>
+    <w:p>
+      <w:pPr>
+        <w:spacing w:after="160" w:line="300"/>
+      </w:pPr>
+      <w:r>
+        <w:rPr>
+          <w:rFonts w:ascii="DM Sans" w:cs="DM Sans" w:eastAsia="DM Sans" w:hAnsi="DM Sans"/>
+          <w:b/>
+          <w:bCs/>
+          <w:color w:val="1A1A2E"/>
+          <w:sz w:val="22"/>
+          <w:szCs w:val="22"/>
+        </w:rPr>
+        <w:t xml:space="preserve">zlib: </w:t>
+      </w:r>
+      <w:r>
+        <w:rPr>
+          <w:rFonts w:ascii="DM Sans" w:cs="DM Sans" w:eastAsia="DM Sans" w:hAnsi="DM Sans"/>
+          <w:color w:val="1A1A2E"/>
+          <w:sz w:val="22"/>
+          <w:szCs w:val="22"/>
+        </w:rPr>
+        <w:t xml:space="preserve">Copyright (c) 1995-2024 Jean-loup Gailly and Mark Adler. This software is provided 'as-is', without any express or implied warranty. Permission is granted to anyone to use this software for any purpose, including commercial applications, and to alter it and redistribute it freely, subject to the following restrictions: (1) The origin of this software must not be misrepresented. (2) Altered source versions must be plainly marked as such. (3) This notice may not be removed or altered from any source distribution.</w:t>
+      </w:r>
+    </w:p>
+    <w:p>
+      <w:pPr>
+        <w:pStyle w:val="Heading2"/>
+        <w:spacing w:after="180" w:before="280"/>
+      </w:pPr>
+      <w:r>
+        <w:rPr>
+          <w:rFonts w:ascii="DM Sans" w:cs="DM Sans" w:eastAsia="DM Sans" w:hAnsi="DM Sans"/>
+          <w:b/>
+          <w:bCs/>
+          <w:color w:val="64748B"/>
+          <w:sz w:val="30"/>
+          <w:szCs w:val="30"/>
+        </w:rPr>
+        <w:t xml:space="preserve">11.2</w:t>
+      </w:r>
+      <w:r>
+        <w:rPr>
+          <w:rFonts w:ascii="DM Sans" w:cs="DM Sans" w:eastAsia="DM Sans" w:hAnsi="DM Sans"/>
+          <w:b/>
+          <w:bCs/>
+          <w:color w:val="001633"/>
+          <w:sz w:val="30"/>
+          <w:szCs w:val="30"/>
+        </w:rPr>
+        <w:t xml:space="preserve">  HRTF Datasets</w:t>
+      </w:r>
+    </w:p>
+    <w:p>
+      <w:pPr>
+        <w:spacing w:after="160" w:line="300"/>
+      </w:pPr>
+      <w:r>
+        <w:rPr>
+          <w:rFonts w:ascii="DM Sans" w:cs="DM Sans" w:eastAsia="DM Sans" w:hAnsi="DM Sans"/>
+          <w:color w:val="1A1A2E"/>
+          <w:sz w:val="22"/>
+          <w:szCs w:val="22"/>
+        </w:rPr>
+        <w:t xml:space="preserve">The following Head-Related Transfer Function datasets are embedded in the plugin for binaural spatialization:</w:t>
+      </w:r>
+    </w:p>
+    <w:tbl>
+      <w:tblPr>
+        <w:tblW w:type="dxa" w:w="9026"/>
+        <w:tblBorders>
+          <w:top w:val="single" w:color="auto" w:sz="4"/>
+          <w:left w:val="single" w:color="auto" w:sz="4"/>
+          <w:bottom w:val="single" w:color="auto" w:sz="4"/>
+          <w:right w:val="single" w:color="auto" w:sz="4"/>
+          <w:insideH w:val="single" w:color="auto" w:sz="4"/>
+          <w:insideV w:val="single" w:color="auto" w:sz="4"/>
+        </w:tblBorders>
+      </w:tblPr>
+      <w:tblGrid>
+        <w:gridCol w:w="1800"/>
+        <w:gridCol w:w="2400"/>
+        <w:gridCol w:w="1600"/>
+        <w:gridCol w:w="3226"/>
+      </w:tblGrid>
+      <w:tr>
+        <w:trPr>
+          <w:tblHeader/>
+        </w:trPr>
+        <w:tc>
+          <w:tcPr>
+            <w:tcW w:type="dxa" w:w="1800"/>
+            <w:tcBorders>
+              <w:top w:val="single" w:color="E2E8F0" w:sz="1"/>
+              <w:left w:val="single" w:color="E2E8F0" w:sz="1"/>
+              <w:bottom w:val="single" w:color="E2E8F0" w:sz="1"/>
+              <w:right w:val="single" w:color="E2E8F0" w:sz="1"/>
+            </w:tcBorders>
+            <w:shd w:fill="001633" w:val="clear"/>
+            <w:tcMar>
+              <w:top w:type="dxa" w:w="60"/>
+              <w:left w:type="dxa" w:w="100"/>
+              <w:bottom w:type="dxa" w:w="60"/>
+              <w:right w:type="dxa" w:w="100"/>
+            </w:tcMar>
+          </w:tcPr>
+          <w:p>
+            <w:r>
+              <w:rPr>
+                <w:rFonts w:ascii="DM Sans" w:cs="DM Sans" w:eastAsia="DM Sans" w:hAnsi="DM Sans"/>
+                <w:b/>
+                <w:bCs/>
+                <w:color w:val="FFFFFF"/>
+                <w:sz w:val="18"/>
+                <w:szCs w:val="18"/>
+              </w:rPr>
+              <w:t xml:space="preserve">Profile Name</w:t>
+            </w:r>
+          </w:p>
+        </w:tc>
+        <w:tc>
+          <w:tcPr>
+            <w:tcW w:type="dxa" w:w="2400"/>
+            <w:tcBorders>
+              <w:top w:val="single" w:color="E2E8F0" w:sz="1"/>
+              <w:left w:val="single" w:color="E2E8F0" w:sz="1"/>
+              <w:bottom w:val="single" w:color="E2E8F0" w:sz="1"/>
+              <w:right w:val="single" w:color="E2E8F0" w:sz="1"/>
+            </w:tcBorders>
+            <w:shd w:fill="001633" w:val="clear"/>
+            <w:tcMar>
+              <w:top w:type="dxa" w:w="60"/>
+              <w:left w:type="dxa" w:w="100"/>
+              <w:bottom w:type="dxa" w:w="60"/>
+              <w:right w:type="dxa" w:w="100"/>
+            </w:tcMar>
+          </w:tcPr>
+          <w:p>
+            <w:r>
+              <w:rPr>
+                <w:rFonts w:ascii="DM Sans" w:cs="DM Sans" w:eastAsia="DM Sans" w:hAnsi="DM Sans"/>
+                <w:b/>
+                <w:bCs/>
+                <w:color w:val="FFFFFF"/>
+                <w:sz w:val="18"/>
+                <w:szCs w:val="18"/>
+              </w:rPr>
+              <w:t xml:space="preserve">Dataset</w:t>
+            </w:r>
+          </w:p>
+        </w:tc>
+        <w:tc>
+          <w:tcPr>
+            <w:tcW w:type="dxa" w:w="1600"/>
+            <w:tcBorders>
+              <w:top w:val="single" w:color="E2E8F0" w:sz="1"/>
+              <w:left w:val="single" w:color="E2E8F0" w:sz="1"/>
+              <w:bottom w:val="single" w:color="E2E8F0" w:sz="1"/>
+              <w:right w:val="single" w:color="E2E8F0" w:sz="1"/>
+            </w:tcBorders>
+            <w:shd w:fill="001633" w:val="clear"/>
+            <w:tcMar>
+              <w:top w:type="dxa" w:w="60"/>
+              <w:left w:type="dxa" w:w="100"/>
+              <w:bottom w:type="dxa" w:w="60"/>
+              <w:right w:type="dxa" w:w="100"/>
+            </w:tcMar>
+          </w:tcPr>
+          <w:p>
+            <w:r>
+              <w:rPr>
+                <w:rFonts w:ascii="DM Sans" w:cs="DM Sans" w:eastAsia="DM Sans" w:hAnsi="DM Sans"/>
+                <w:b/>
+                <w:bCs/>
+                <w:color w:val="FFFFFF"/>
+                <w:sz w:val="18"/>
+                <w:szCs w:val="18"/>
+              </w:rPr>
+              <w:t xml:space="preserve">License</w:t>
+            </w:r>
+          </w:p>
+        </w:tc>
+        <w:tc>
+          <w:tcPr>
+            <w:tcW w:type="dxa" w:w="3226"/>
+            <w:tcBorders>
+              <w:top w:val="single" w:color="E2E8F0" w:sz="1"/>
+              <w:left w:val="single" w:color="E2E8F0" w:sz="1"/>
+              <w:bottom w:val="single" w:color="E2E8F0" w:sz="1"/>
+              <w:right w:val="single" w:color="E2E8F0" w:sz="1"/>
+            </w:tcBorders>
+            <w:shd w:fill="001633" w:val="clear"/>
+            <w:tcMar>
+              <w:top w:type="dxa" w:w="60"/>
+              <w:left w:type="dxa" w:w="100"/>
+              <w:bottom w:type="dxa" w:w="60"/>
+              <w:right w:type="dxa" w:w="100"/>
+            </w:tcMar>
+          </w:tcPr>
+          <w:p>
+            <w:r>
+              <w:rPr>
+                <w:rFonts w:ascii="DM Sans" w:cs="DM Sans" w:eastAsia="DM Sans" w:hAnsi="DM Sans"/>
+                <w:b/>
+                <w:bCs/>
+                <w:color w:val="FFFFFF"/>
+                <w:sz w:val="18"/>
+                <w:szCs w:val="18"/>
+              </w:rPr>
+              <w:t xml:space="preserve">Source</w:t>
+            </w:r>
+          </w:p>
+        </w:tc>
+      </w:tr>
+      <w:tr>
+        <w:tc>
+          <w:tcPr>
+            <w:tcW w:type="dxa" w:w="1800"/>
+            <w:tcBorders>
+              <w:top w:val="single" w:color="E2E8F0" w:sz="1"/>
+              <w:left w:val="single" w:color="E2E8F0" w:sz="1"/>
+              <w:bottom w:val="single" w:color="E2E8F0" w:sz="1"/>
+              <w:right w:val="single" w:color="E2E8F0" w:sz="1"/>
+            </w:tcBorders>
+            <w:tcMar>
+              <w:top w:type="dxa" w:w="50"/>
+              <w:left w:type="dxa" w:w="100"/>
+              <w:bottom w:type="dxa" w:w="50"/>
+              <w:right w:type="dxa" w:w="100"/>
+            </w:tcMar>
+          </w:tcPr>
+          <w:p>
+            <w:r>
+              <w:rPr>
+                <w:rFonts w:ascii="DM Sans" w:cs="DM Sans" w:eastAsia="DM Sans" w:hAnsi="DM Sans"/>
+                <w:color w:val="1A1A2E"/>
+                <w:sz w:val="18"/>
+                <w:szCs w:val="18"/>
+              </w:rPr>
+              <w:t xml:space="preserve">Studio Reference</w:t>
+            </w:r>
+          </w:p>
+        </w:tc>
+        <w:tc>
+          <w:tcPr>
+            <w:tcW w:type="dxa" w:w="2400"/>
+            <w:tcBorders>
+              <w:top w:val="single" w:color="E2E8F0" w:sz="1"/>
+              <w:left w:val="single" w:color="E2E8F0" w:sz="1"/>
+              <w:bottom w:val="single" w:color="E2E8F0" w:sz="1"/>
+              <w:right w:val="single" w:color="E2E8F0" w:sz="1"/>
+            </w:tcBorders>
+            <w:tcMar>
+              <w:top w:type="dxa" w:w="50"/>
+              <w:left w:type="dxa" w:w="100"/>
+              <w:bottom w:type="dxa" w:w="50"/>
+              <w:right w:type="dxa" w:w="100"/>
+            </w:tcMar>
+          </w:tcPr>
+          <w:p>
+            <w:r>
+              <w:rPr>
+                <w:rFonts w:ascii="DM Sans" w:cs="DM Sans" w:eastAsia="DM Sans" w:hAnsi="DM Sans"/>
+                <w:color w:val="1A1A2E"/>
+                <w:sz w:val="18"/>
+                <w:szCs w:val="18"/>
+              </w:rPr>
+              <w:t xml:space="preserve">MIT KEMAR Large Pinna</w:t>
+            </w:r>
+          </w:p>
+        </w:tc>
+        <w:tc>
+          <w:tcPr>
+            <w:tcW w:type="dxa" w:w="1600"/>
+            <w:tcBorders>
+              <w:top w:val="single" w:color="E2E8F0" w:sz="1"/>
+              <w:left w:val="single" w:color="E2E8F0" w:sz="1"/>
+              <w:bottom w:val="single" w:color="E2E8F0" w:sz="1"/>
+              <w:right w:val="single" w:color="E2E8F0" w:sz="1"/>
+            </w:tcBorders>
+            <w:tcMar>
+              <w:top w:type="dxa" w:w="50"/>
+              <w:left w:type="dxa" w:w="100"/>
+              <w:bottom w:type="dxa" w:w="50"/>
+              <w:right w:type="dxa" w:w="100"/>
+            </w:tcMar>
+          </w:tcPr>
+          <w:p>
+            <w:r>
+              <w:rPr>
+                <w:rFonts w:ascii="DM Sans" w:cs="DM Sans" w:eastAsia="DM Sans" w:hAnsi="DM Sans"/>
+                <w:color w:val="1A1A2E"/>
+                <w:sz w:val="18"/>
+                <w:szCs w:val="18"/>
+              </w:rPr>
+              <w:t xml:space="preserve">MIT</w:t>
+            </w:r>
+          </w:p>
+        </w:tc>
+        <w:tc>
+          <w:tcPr>
+            <w:tcW w:type="dxa" w:w="3226"/>
+            <w:tcBorders>
+              <w:top w:val="single" w:color="E2E8F0" w:sz="1"/>
+              <w:left w:val="single" w:color="E2E8F0" w:sz="1"/>
+              <w:bottom w:val="single" w:color="E2E8F0" w:sz="1"/>
+              <w:right w:val="single" w:color="E2E8F0" w:sz="1"/>
+            </w:tcBorders>
+            <w:tcMar>
+              <w:top w:type="dxa" w:w="50"/>
+              <w:left w:type="dxa" w:w="100"/>
+              <w:bottom w:type="dxa" w:w="50"/>
+              <w:right w:type="dxa" w:w="100"/>
+            </w:tcMar>
+          </w:tcPr>
+          <w:p>
+            <w:r>
+              <w:rPr>
+                <w:rFonts w:ascii="DM Sans" w:cs="DM Sans" w:eastAsia="DM Sans" w:hAnsi="DM Sans"/>
+                <w:color w:val="1A1A2E"/>
+                <w:sz w:val="18"/>
+                <w:szCs w:val="18"/>
+              </w:rPr>
+              <w:t xml:space="preserve">MIT Media Lab</w:t>
+            </w:r>
+          </w:p>
+        </w:tc>
+      </w:tr>
+      <w:tr>
+        <w:tc>
+          <w:tcPr>
+            <w:tcW w:type="dxa" w:w="1800"/>
+            <w:tcBorders>
+              <w:top w:val="single" w:color="E2E8F0" w:sz="1"/>
+              <w:left w:val="single" w:color="E2E8F0" w:sz="1"/>
+              <w:bottom w:val="single" w:color="E2E8F0" w:sz="1"/>
+              <w:right w:val="single" w:color="E2E8F0" w:sz="1"/>
+            </w:tcBorders>
+            <w:shd w:fill="F8FAFC" w:val="clear"/>
+            <w:tcMar>
+              <w:top w:type="dxa" w:w="50"/>
+              <w:left w:type="dxa" w:w="100"/>
+              <w:bottom w:type="dxa" w:w="50"/>
+              <w:right w:type="dxa" w:w="100"/>
+            </w:tcMar>
+          </w:tcPr>
+          <w:p>
+            <w:r>
+              <w:rPr>
+                <w:rFonts w:ascii="DM Sans" w:cs="DM Sans" w:eastAsia="DM Sans" w:hAnsi="DM Sans"/>
+                <w:color w:val="1A1A2E"/>
+                <w:sz w:val="18"/>
+                <w:szCs w:val="18"/>
+              </w:rPr>
+              <w:t xml:space="preserve">Immersive</w:t>
+            </w:r>
+          </w:p>
+        </w:tc>
+        <w:tc>
+          <w:tcPr>
+            <w:tcW w:type="dxa" w:w="2400"/>
+            <w:tcBorders>
+              <w:top w:val="single" w:color="E2E8F0" w:sz="1"/>
+              <w:left w:val="single" w:color="E2E8F0" w:sz="1"/>
+              <w:bottom w:val="single" w:color="E2E8F0" w:sz="1"/>
+              <w:right w:val="single" w:color="E2E8F0" w:sz="1"/>
+            </w:tcBorders>
+            <w:shd w:fill="F8FAFC" w:val="clear"/>
+            <w:tcMar>
+              <w:top w:type="dxa" w:w="50"/>
+              <w:left w:type="dxa" w:w="100"/>
+              <w:bottom w:type="dxa" w:w="50"/>
+              <w:right w:type="dxa" w:w="100"/>
+            </w:tcMar>
+          </w:tcPr>
+          <w:p>
+            <w:r>
+              <w:rPr>
+                <w:rFonts w:ascii="DM Sans" w:cs="DM Sans" w:eastAsia="DM Sans" w:hAnsi="DM Sans"/>
+                <w:color w:val="1A1A2E"/>
+                <w:sz w:val="18"/>
+                <w:szCs w:val="18"/>
+              </w:rPr>
+              <w:t xml:space="preserve">SADIE II D2 KU100</w:t>
+            </w:r>
+          </w:p>
+        </w:tc>
+        <w:tc>
+          <w:tcPr>
+            <w:tcW w:type="dxa" w:w="1600"/>
+            <w:tcBorders>
+              <w:top w:val="single" w:color="E2E8F0" w:sz="1"/>
+              <w:left w:val="single" w:color="E2E8F0" w:sz="1"/>
+              <w:bottom w:val="single" w:color="E2E8F0" w:sz="1"/>
+              <w:right w:val="single" w:color="E2E8F0" w:sz="1"/>
+            </w:tcBorders>
+            <w:shd w:fill="F8FAFC" w:val="clear"/>
+            <w:tcMar>
+              <w:top w:type="dxa" w:w="50"/>
+              <w:left w:type="dxa" w:w="100"/>
+              <w:bottom w:type="dxa" w:w="50"/>
+              <w:right w:type="dxa" w:w="100"/>
+            </w:tcMar>
+          </w:tcPr>
+          <w:p>
+            <w:r>
+              <w:rPr>
+                <w:rFonts w:ascii="DM Sans" w:cs="DM Sans" w:eastAsia="DM Sans" w:hAnsi="DM Sans"/>
+                <w:color w:val="1A1A2E"/>
+                <w:sz w:val="18"/>
+                <w:szCs w:val="18"/>
+              </w:rPr>
+              <w:t xml:space="preserve">Apache 2.0</w:t>
+            </w:r>
+          </w:p>
+        </w:tc>
+        <w:tc>
+          <w:tcPr>
+            <w:tcW w:type="dxa" w:w="3226"/>
+            <w:tcBorders>
+              <w:top w:val="single" w:color="E2E8F0" w:sz="1"/>
+              <w:left w:val="single" w:color="E2E8F0" w:sz="1"/>
+              <w:bottom w:val="single" w:color="E2E8F0" w:sz="1"/>
+              <w:right w:val="single" w:color="E2E8F0" w:sz="1"/>
+            </w:tcBorders>
+            <w:shd w:fill="F8FAFC" w:val="clear"/>
+            <w:tcMar>
+              <w:top w:type="dxa" w:w="50"/>
+              <w:left w:type="dxa" w:w="100"/>
+              <w:bottom w:type="dxa" w:w="50"/>
+              <w:right w:type="dxa" w:w="100"/>
+            </w:tcMar>
+          </w:tcPr>
+          <w:p>
+            <w:r>
+              <w:rPr>
+                <w:rFonts w:ascii="DM Sans" w:cs="DM Sans" w:eastAsia="DM Sans" w:hAnsi="DM Sans"/>
+                <w:color w:val="1A1A2E"/>
+                <w:sz w:val="18"/>
+                <w:szCs w:val="18"/>
+              </w:rPr>
+              <w:t xml:space="preserve">University of York</w:t>
+            </w:r>
+          </w:p>
+        </w:tc>
+      </w:tr>
+      <w:tr>
+        <w:tc>
+          <w:tcPr>
+            <w:tcW w:type="dxa" w:w="1800"/>
+            <w:tcBorders>
+              <w:top w:val="single" w:color="E2E8F0" w:sz="1"/>
+              <w:left w:val="single" w:color="E2E8F0" w:sz="1"/>
+              <w:bottom w:val="single" w:color="E2E8F0" w:sz="1"/>
+              <w:right w:val="single" w:color="E2E8F0" w:sz="1"/>
+            </w:tcBorders>
+            <w:tcMar>
+              <w:top w:type="dxa" w:w="50"/>
+              <w:left w:type="dxa" w:w="100"/>
+              <w:bottom w:type="dxa" w:w="50"/>
+              <w:right w:type="dxa" w:w="100"/>
+            </w:tcMar>
+          </w:tcPr>
+          <w:p>
+            <w:r>
+              <w:rPr>
+                <w:rFonts w:ascii="DM Sans" w:cs="DM Sans" w:eastAsia="DM Sans" w:hAnsi="DM Sans"/>
+                <w:color w:val="1A1A2E"/>
+                <w:sz w:val="18"/>
+                <w:szCs w:val="18"/>
+              </w:rPr>
+              <w:t xml:space="preserve">Natural</w:t>
+            </w:r>
+          </w:p>
+        </w:tc>
+        <w:tc>
+          <w:tcPr>
+            <w:tcW w:type="dxa" w:w="2400"/>
+            <w:tcBorders>
+              <w:top w:val="single" w:color="E2E8F0" w:sz="1"/>
+              <w:left w:val="single" w:color="E2E8F0" w:sz="1"/>
+              <w:bottom w:val="single" w:color="E2E8F0" w:sz="1"/>
+              <w:right w:val="single" w:color="E2E8F0" w:sz="1"/>
+            </w:tcBorders>
+            <w:tcMar>
+              <w:top w:type="dxa" w:w="50"/>
+              <w:left w:type="dxa" w:w="100"/>
+              <w:bottom w:type="dxa" w:w="50"/>
+              <w:right w:type="dxa" w:w="100"/>
+            </w:tcMar>
+          </w:tcPr>
+          <w:p>
+            <w:r>
+              <w:rPr>
+                <w:rFonts w:ascii="DM Sans" w:cs="DM Sans" w:eastAsia="DM Sans" w:hAnsi="DM Sans"/>
+                <w:color w:val="1A1A2E"/>
+                <w:sz w:val="18"/>
+                <w:szCs w:val="18"/>
+              </w:rPr>
+              <w:t xml:space="preserve">CIPIC Subject 003</w:t>
+            </w:r>
+          </w:p>
+        </w:tc>
+        <w:tc>
+          <w:tcPr>
+            <w:tcW w:type="dxa" w:w="1600"/>
+            <w:tcBorders>
+              <w:top w:val="single" w:color="E2E8F0" w:sz="1"/>
+              <w:left w:val="single" w:color="E2E8F0" w:sz="1"/>
+              <w:bottom w:val="single" w:color="E2E8F0" w:sz="1"/>
+              <w:right w:val="single" w:color="E2E8F0" w:sz="1"/>
+            </w:tcBorders>
+            <w:tcMar>
+              <w:top w:type="dxa" w:w="50"/>
+              <w:left w:type="dxa" w:w="100"/>
+              <w:bottom w:type="dxa" w:w="50"/>
+              <w:right w:type="dxa" w:w="100"/>
+            </w:tcMar>
+          </w:tcPr>
+          <w:p>
+            <w:r>
+              <w:rPr>
+                <w:rFonts w:ascii="DM Sans" w:cs="DM Sans" w:eastAsia="DM Sans" w:hAnsi="DM Sans"/>
+                <w:color w:val="1A1A2E"/>
+                <w:sz w:val="18"/>
+                <w:szCs w:val="18"/>
+              </w:rPr>
+              <w:t xml:space="preserve">Public Domain</w:t>
+            </w:r>
+          </w:p>
+        </w:tc>
+        <w:tc>
+          <w:tcPr>
+            <w:tcW w:type="dxa" w:w="3226"/>
+            <w:tcBorders>
+              <w:top w:val="single" w:color="E2E8F0" w:sz="1"/>
+              <w:left w:val="single" w:color="E2E8F0" w:sz="1"/>
+              <w:bottom w:val="single" w:color="E2E8F0" w:sz="1"/>
+              <w:right w:val="single" w:color="E2E8F0" w:sz="1"/>
+            </w:tcBorders>
+            <w:tcMar>
+              <w:top w:type="dxa" w:w="50"/>
+              <w:left w:type="dxa" w:w="100"/>
+              <w:bottom w:type="dxa" w:w="50"/>
+              <w:right w:type="dxa" w:w="100"/>
+            </w:tcMar>
+          </w:tcPr>
+          <w:p>
+            <w:r>
+              <w:rPr>
+                <w:rFonts w:ascii="DM Sans" w:cs="DM Sans" w:eastAsia="DM Sans" w:hAnsi="DM Sans"/>
+                <w:color w:val="1A1A2E"/>
+                <w:sz w:val="18"/>
+                <w:szCs w:val="18"/>
+              </w:rPr>
+              <w:t xml:space="preserve">UC Davis CIPIC Lab</w:t>
+            </w:r>
+          </w:p>
+        </w:tc>
+      </w:tr>
+      <w:tr>
+        <w:tc>
+          <w:tcPr>
+            <w:tcW w:type="dxa" w:w="1800"/>
+            <w:tcBorders>
+              <w:top w:val="single" w:color="E2E8F0" w:sz="1"/>
+              <w:left w:val="single" w:color="E2E8F0" w:sz="1"/>
+              <w:bottom w:val="single" w:color="E2E8F0" w:sz="1"/>
+              <w:right w:val="single" w:color="E2E8F0" w:sz="1"/>
+            </w:tcBorders>
+            <w:shd w:fill="F8FAFC" w:val="clear"/>
+            <w:tcMar>
+              <w:top w:type="dxa" w:w="50"/>
+              <w:left w:type="dxa" w:w="100"/>
+              <w:bottom w:type="dxa" w:w="50"/>
+              <w:right w:type="dxa" w:w="100"/>
+            </w:tcMar>
+          </w:tcPr>
+          <w:p>
+            <w:r>
+              <w:rPr>
+                <w:rFonts w:ascii="DM Sans" w:cs="DM Sans" w:eastAsia="DM Sans" w:hAnsi="DM Sans"/>
+                <w:color w:val="1A1A2E"/>
+                <w:sz w:val="18"/>
+                <w:szCs w:val="18"/>
+              </w:rPr>
+              <w:t xml:space="preserve">Precise</w:t>
+            </w:r>
+          </w:p>
+        </w:tc>
+        <w:tc>
+          <w:tcPr>
+            <w:tcW w:type="dxa" w:w="2400"/>
+            <w:tcBorders>
+              <w:top w:val="single" w:color="E2E8F0" w:sz="1"/>
+              <w:left w:val="single" w:color="E2E8F0" w:sz="1"/>
+              <w:bottom w:val="single" w:color="E2E8F0" w:sz="1"/>
+              <w:right w:val="single" w:color="E2E8F0" w:sz="1"/>
+            </w:tcBorders>
+            <w:shd w:fill="F8FAFC" w:val="clear"/>
+            <w:tcMar>
+              <w:top w:type="dxa" w:w="50"/>
+              <w:left w:type="dxa" w:w="100"/>
+              <w:bottom w:type="dxa" w:w="50"/>
+              <w:right w:type="dxa" w:w="100"/>
+            </w:tcMar>
+          </w:tcPr>
+          <w:p>
+            <w:r>
+              <w:rPr>
+                <w:rFonts w:ascii="DM Sans" w:cs="DM Sans" w:eastAsia="DM Sans" w:hAnsi="DM Sans"/>
+                <w:color w:val="1A1A2E"/>
+                <w:sz w:val="18"/>
+                <w:szCs w:val="18"/>
+              </w:rPr>
+              <w:t xml:space="preserve">HUTUBS PP2</w:t>
+            </w:r>
+          </w:p>
+        </w:tc>
+        <w:tc>
+          <w:tcPr>
+            <w:tcW w:type="dxa" w:w="1600"/>
+            <w:tcBorders>
+              <w:top w:val="single" w:color="E2E8F0" w:sz="1"/>
+              <w:left w:val="single" w:color="E2E8F0" w:sz="1"/>
+              <w:bottom w:val="single" w:color="E2E8F0" w:sz="1"/>
+              <w:right w:val="single" w:color="E2E8F0" w:sz="1"/>
+            </w:tcBorders>
+            <w:shd w:fill="F8FAFC" w:val="clear"/>
+            <w:tcMar>
+              <w:top w:type="dxa" w:w="50"/>
+              <w:left w:type="dxa" w:w="100"/>
+              <w:bottom w:type="dxa" w:w="50"/>
+              <w:right w:type="dxa" w:w="100"/>
+            </w:tcMar>
+          </w:tcPr>
+          <w:p>
+            <w:r>
+              <w:rPr>
+                <w:rFonts w:ascii="DM Sans" w:cs="DM Sans" w:eastAsia="DM Sans" w:hAnsi="DM Sans"/>
+                <w:color w:val="1A1A2E"/>
+                <w:sz w:val="18"/>
+                <w:szCs w:val="18"/>
+              </w:rPr>
+              <w:t xml:space="preserve">CC BY 4.0</w:t>
+            </w:r>
+          </w:p>
+        </w:tc>
+        <w:tc>
+          <w:tcPr>
+            <w:tcW w:type="dxa" w:w="3226"/>
+            <w:tcBorders>
+              <w:top w:val="single" w:color="E2E8F0" w:sz="1"/>
+              <w:left w:val="single" w:color="E2E8F0" w:sz="1"/>
+              <w:bottom w:val="single" w:color="E2E8F0" w:sz="1"/>
+              <w:right w:val="single" w:color="E2E8F0" w:sz="1"/>
+            </w:tcBorders>
+            <w:shd w:fill="F8FAFC" w:val="clear"/>
+            <w:tcMar>
+              <w:top w:type="dxa" w:w="50"/>
+              <w:left w:type="dxa" w:w="100"/>
+              <w:bottom w:type="dxa" w:w="50"/>
+              <w:right w:type="dxa" w:w="100"/>
+            </w:tcMar>
+          </w:tcPr>
+          <w:p>
+            <w:r>
+              <w:rPr>
+                <w:rFonts w:ascii="DM Sans" w:cs="DM Sans" w:eastAsia="DM Sans" w:hAnsi="DM Sans"/>
+                <w:color w:val="1A1A2E"/>
+                <w:sz w:val="18"/>
+                <w:szCs w:val="18"/>
+              </w:rPr>
+              <w:t xml:space="preserve">TU Berlin</w:t>
+            </w:r>
+          </w:p>
+        </w:tc>
+      </w:tr>
+      <w:tr>
+        <w:tc>
+          <w:tcPr>
+            <w:tcW w:type="dxa" w:w="1800"/>
+            <w:tcBorders>
+              <w:top w:val="single" w:color="E2E8F0" w:sz="1"/>
+              <w:left w:val="single" w:color="E2E8F0" w:sz="1"/>
+              <w:bottom w:val="single" w:color="E2E8F0" w:sz="1"/>
+              <w:right w:val="single" w:color="E2E8F0" w:sz="1"/>
+            </w:tcBorders>
+            <w:tcMar>
+              <w:top w:type="dxa" w:w="50"/>
+              <w:left w:type="dxa" w:w="100"/>
+              <w:bottom w:type="dxa" w:w="50"/>
+              <w:right w:type="dxa" w:w="100"/>
+            </w:tcMar>
+          </w:tcPr>
+          <w:p>
+            <w:r>
+              <w:rPr>
+                <w:rFonts w:ascii="DM Sans" w:cs="DM Sans" w:eastAsia="DM Sans" w:hAnsi="DM Sans"/>
+                <w:color w:val="1A1A2E"/>
+                <w:sz w:val="18"/>
+                <w:szCs w:val="18"/>
+              </w:rPr>
+              <w:t xml:space="preserve">Spatial</w:t>
+            </w:r>
+          </w:p>
+        </w:tc>
+        <w:tc>
+          <w:tcPr>
+            <w:tcW w:type="dxa" w:w="2400"/>
+            <w:tcBorders>
+              <w:top w:val="single" w:color="E2E8F0" w:sz="1"/>
+              <w:left w:val="single" w:color="E2E8F0" w:sz="1"/>
+              <w:bottom w:val="single" w:color="E2E8F0" w:sz="1"/>
+              <w:right w:val="single" w:color="E2E8F0" w:sz="1"/>
+            </w:tcBorders>
+            <w:tcMar>
+              <w:top w:type="dxa" w:w="50"/>
+              <w:left w:type="dxa" w:w="100"/>
+              <w:bottom w:type="dxa" w:w="50"/>
+              <w:right w:type="dxa" w:w="100"/>
+            </w:tcMar>
+          </w:tcPr>
+          <w:p>
+            <w:r>
+              <w:rPr>
+                <w:rFonts w:ascii="DM Sans" w:cs="DM Sans" w:eastAsia="DM Sans" w:hAnsi="DM Sans"/>
+                <w:color w:val="1A1A2E"/>
+                <w:sz w:val="18"/>
+                <w:szCs w:val="18"/>
+              </w:rPr>
+              <w:t xml:space="preserve">Bernschuetz KU100 2°</w:t>
+            </w:r>
+          </w:p>
+        </w:tc>
+        <w:tc>
+          <w:tcPr>
+            <w:tcW w:type="dxa" w:w="1600"/>
+            <w:tcBorders>
+              <w:top w:val="single" w:color="E2E8F0" w:sz="1"/>
+              <w:left w:val="single" w:color="E2E8F0" w:sz="1"/>
+              <w:bottom w:val="single" w:color="E2E8F0" w:sz="1"/>
+              <w:right w:val="single" w:color="E2E8F0" w:sz="1"/>
+            </w:tcBorders>
+            <w:tcMar>
+              <w:top w:type="dxa" w:w="50"/>
+              <w:left w:type="dxa" w:w="100"/>
+              <w:bottom w:type="dxa" w:w="50"/>
+              <w:right w:type="dxa" w:w="100"/>
+            </w:tcMar>
+          </w:tcPr>
+          <w:p>
+            <w:r>
+              <w:rPr>
+                <w:rFonts w:ascii="DM Sans" w:cs="DM Sans" w:eastAsia="DM Sans" w:hAnsi="DM Sans"/>
+                <w:color w:val="1A1A2E"/>
+                <w:sz w:val="18"/>
+                <w:szCs w:val="18"/>
+              </w:rPr>
+              <w:t xml:space="preserve">CC BY 3.0</w:t>
+            </w:r>
+          </w:p>
+        </w:tc>
+        <w:tc>
+          <w:tcPr>
+            <w:tcW w:type="dxa" w:w="3226"/>
+            <w:tcBorders>
+              <w:top w:val="single" w:color="E2E8F0" w:sz="1"/>
+              <w:left w:val="single" w:color="E2E8F0" w:sz="1"/>
+              <w:bottom w:val="single" w:color="E2E8F0" w:sz="1"/>
+              <w:right w:val="single" w:color="E2E8F0" w:sz="1"/>
+            </w:tcBorders>
+            <w:tcMar>
+              <w:top w:type="dxa" w:w="50"/>
+              <w:left w:type="dxa" w:w="100"/>
+              <w:bottom w:type="dxa" w:w="50"/>
+              <w:right w:type="dxa" w:w="100"/>
+            </w:tcMar>
+          </w:tcPr>
+          <w:p>
+            <w:r>
+              <w:rPr>
+                <w:rFonts w:ascii="DM Sans" w:cs="DM Sans" w:eastAsia="DM Sans" w:hAnsi="DM Sans"/>
+                <w:color w:val="1A1A2E"/>
+                <w:sz w:val="18"/>
+                <w:szCs w:val="18"/>
+              </w:rPr>
+              <w:t xml:space="preserve">TH Köln</w:t>
+            </w:r>
+          </w:p>
+        </w:tc>
+      </w:tr>
+    </w:tbl>
+    <w:p>
+      <w:pPr>
+        <w:spacing w:after="160"/>
+      </w:pPr>
+    </w:p>
+    <w:p>
+      <w:pPr>
+        <w:spacing w:after="160" w:line="300"/>
+      </w:pPr>
+      <w:r>
+        <w:rPr>
+          <w:rFonts w:ascii="DM Sans" w:cs="DM Sans" w:eastAsia="DM Sans" w:hAnsi="DM Sans"/>
+          <w:b/>
+          <w:bCs/>
+          <w:color w:val="1A1A2E"/>
+          <w:sz w:val="22"/>
+          <w:szCs w:val="22"/>
+        </w:rPr>
+        <w:t xml:space="preserve">MIT KEMAR (MIT License): </w:t>
+      </w:r>
+      <w:r>
+        <w:rPr>
+          <w:rFonts w:ascii="DM Sans" w:cs="DM Sans" w:eastAsia="DM Sans" w:hAnsi="DM Sans"/>
+          <w:color w:val="1A1A2E"/>
+          <w:sz w:val="22"/>
+          <w:szCs w:val="22"/>
+        </w:rPr>
+        <w:t xml:space="preserve">Measurements by the MIT Media Lab. Permission is hereby granted, free of charge, to any person obtaining a copy of this data, to deal in the data without restriction, including without limitation the rights to use, copy, modify, merge, publish, distribute, sublicense, and/or sell copies, subject to the above copyright notice and this permission notice being included in all copies. See </w:t>
+      </w:r>
+      <w:hyperlink w:history="1" r:id="rIdts0gobjb3-gk1b38yhvpp">
+        <w:r>
+          <w:rPr>
+            <w:rFonts w:ascii="DM Sans" w:cs="DM Sans" w:eastAsia="DM Sans" w:hAnsi="DM Sans"/>
+            <w:color w:val="2563EB"/>
+            <w:sz w:val="22"/>
+            <w:szCs w:val="22"/>
+            <w:u w:val="single"/>
+          </w:rPr>
+          <w:t xml:space="preserve">sound.media.mit.edu/resources/KEMAR.html</w:t>
+        </w:r>
+      </w:hyperlink>
+      <w:r>
+        <w:rPr>
+          <w:rFonts w:ascii="DM Sans" w:cs="DM Sans" w:eastAsia="DM Sans" w:hAnsi="DM Sans"/>
+          <w:color w:val="1A1A2E"/>
+          <w:sz w:val="22"/>
+          <w:szCs w:val="22"/>
+        </w:rPr>
+        <w:t xml:space="preserve">.</w:t>
+      </w:r>
+    </w:p>
+    <w:p>
+      <w:pPr>
+        <w:spacing w:after="160" w:line="300"/>
+      </w:pPr>
+      <w:r>
+        <w:rPr>
+          <w:rFonts w:ascii="DM Sans" w:cs="DM Sans" w:eastAsia="DM Sans" w:hAnsi="DM Sans"/>
+          <w:b/>
+          <w:bCs/>
+          <w:color w:val="1A1A2E"/>
+          <w:sz w:val="22"/>
+          <w:szCs w:val="22"/>
+        </w:rPr>
+        <w:t xml:space="preserve">SADIE II (Apache 2.0): </w:t>
+      </w:r>
+      <w:r>
+        <w:rPr>
+          <w:rFonts w:ascii="DM Sans" w:cs="DM Sans" w:eastAsia="DM Sans" w:hAnsi="DM Sans"/>
+          <w:color w:val="1A1A2E"/>
+          <w:sz w:val="22"/>
+          <w:szCs w:val="22"/>
+        </w:rPr>
+        <w:t xml:space="preserve">Gavin Kearney, Tony Doyle, University of York. Licensed under the Apache License, Version 2.0. You may obtain a copy of the License at </w:t>
+      </w:r>
+      <w:hyperlink w:history="1" r:id="rIdqyvrjzfuhxp_rijumqe8d">
+        <w:r>
+          <w:rPr>
+            <w:rFonts w:ascii="DM Sans" w:cs="DM Sans" w:eastAsia="DM Sans" w:hAnsi="DM Sans"/>
+            <w:color w:val="2563EB"/>
+            <w:sz w:val="22"/>
+            <w:szCs w:val="22"/>
+            <w:u w:val="single"/>
+          </w:rPr>
+          <w:t xml:space="preserve">apache.org/licenses/LICENSE-2.0</w:t>
+        </w:r>
+      </w:hyperlink>
+      <w:r>
+        <w:rPr>
+          <w:rFonts w:ascii="DM Sans" w:cs="DM Sans" w:eastAsia="DM Sans" w:hAnsi="DM Sans"/>
+          <w:color w:val="1A1A2E"/>
+          <w:sz w:val="22"/>
+          <w:szCs w:val="22"/>
+        </w:rPr>
+        <w:t xml:space="preserve">. See </w:t>
+      </w:r>
+      <w:hyperlink w:history="1" r:id="rIdpoa-4aluad7igmfqtnz69">
+        <w:r>
+          <w:rPr>
+            <w:rFonts w:ascii="DM Sans" w:cs="DM Sans" w:eastAsia="DM Sans" w:hAnsi="DM Sans"/>
+            <w:color w:val="2563EB"/>
+            <w:sz w:val="22"/>
+            <w:szCs w:val="22"/>
+            <w:u w:val="single"/>
+          </w:rPr>
+          <w:t xml:space="preserve">york.ac.uk/sadie-project/database2</w:t>
+        </w:r>
+      </w:hyperlink>
+      <w:r>
+        <w:rPr>
+          <w:rFonts w:ascii="DM Sans" w:cs="DM Sans" w:eastAsia="DM Sans" w:hAnsi="DM Sans"/>
+          <w:color w:val="1A1A2E"/>
+          <w:sz w:val="22"/>
+          <w:szCs w:val="22"/>
+        </w:rPr>
+        <w:t xml:space="preserve">.</w:t>
+      </w:r>
+    </w:p>
+    <w:p>
+      <w:pPr>
+        <w:spacing w:after="160" w:line="300"/>
+      </w:pPr>
+      <w:r>
+        <w:rPr>
+          <w:rFonts w:ascii="DM Sans" w:cs="DM Sans" w:eastAsia="DM Sans" w:hAnsi="DM Sans"/>
+          <w:b/>
+          <w:bCs/>
+          <w:color w:val="1A1A2E"/>
+          <w:sz w:val="22"/>
+          <w:szCs w:val="22"/>
+        </w:rPr>
+        <w:t xml:space="preserve">CIPIC Subject 003 (Public Domain): </w:t>
+      </w:r>
+      <w:r>
+        <w:rPr>
+          <w:rFonts w:ascii="DM Sans" w:cs="DM Sans" w:eastAsia="DM Sans" w:hAnsi="DM Sans"/>
+          <w:color w:val="1A1A2E"/>
+          <w:sz w:val="22"/>
+          <w:szCs w:val="22"/>
+        </w:rPr>
+        <w:t xml:space="preserve">UC Davis CIPIC Interface Laboratory. This dataset is in the public domain with no restrictions on use. See </w:t>
+      </w:r>
+      <w:hyperlink w:history="1" r:id="rIdwmkjkqh0-wsfvvg__-bdz">
+        <w:r>
+          <w:rPr>
+            <w:rFonts w:ascii="DM Sans" w:cs="DM Sans" w:eastAsia="DM Sans" w:hAnsi="DM Sans"/>
+            <w:color w:val="2563EB"/>
+            <w:sz w:val="22"/>
+            <w:szCs w:val="22"/>
+            <w:u w:val="single"/>
+          </w:rPr>
+          <w:t xml:space="preserve">ucdavis.edu/cipic</w:t>
+        </w:r>
+      </w:hyperlink>
+      <w:r>
+        <w:rPr>
+          <w:rFonts w:ascii="DM Sans" w:cs="DM Sans" w:eastAsia="DM Sans" w:hAnsi="DM Sans"/>
+          <w:color w:val="1A1A2E"/>
+          <w:sz w:val="22"/>
+          <w:szCs w:val="22"/>
+        </w:rPr>
+        <w:t xml:space="preserve">.</w:t>
+      </w:r>
+    </w:p>
+    <w:p>
+      <w:pPr>
+        <w:spacing w:after="160" w:line="300"/>
+      </w:pPr>
+      <w:r>
+        <w:rPr>
+          <w:rFonts w:ascii="DM Sans" w:cs="DM Sans" w:eastAsia="DM Sans" w:hAnsi="DM Sans"/>
+          <w:b/>
+          <w:bCs/>
+          <w:color w:val="1A1A2E"/>
+          <w:sz w:val="22"/>
+          <w:szCs w:val="22"/>
+        </w:rPr>
+        <w:t xml:space="preserve">HUTUBS PP2 (CC BY 4.0): </w:t>
+      </w:r>
+      <w:r>
+        <w:rPr>
+          <w:rFonts w:ascii="DM Sans" w:cs="DM Sans" w:eastAsia="DM Sans" w:hAnsi="DM Sans"/>
+          <w:color w:val="1A1A2E"/>
+          <w:sz w:val="22"/>
+          <w:szCs w:val="22"/>
+        </w:rPr>
+        <w:t xml:space="preserve">Fabian Brinkmann, Alexander Lindau, Stefan Weinzierl, et al., TU Berlin Audio Communication Group. Licensed under the Creative Commons Attribution 4.0 International License. You must give appropriate credit, provide a link to the license, and indicate if changes were made. See </w:t>
+      </w:r>
+      <w:hyperlink w:history="1" r:id="rIdgwg18mxtejs96pgjnwa4b">
+        <w:r>
+          <w:rPr>
+            <w:rFonts w:ascii="DM Sans" w:cs="DM Sans" w:eastAsia="DM Sans" w:hAnsi="DM Sans"/>
+            <w:color w:val="2563EB"/>
+            <w:sz w:val="22"/>
+            <w:szCs w:val="22"/>
+            <w:u w:val="single"/>
+          </w:rPr>
+          <w:t xml:space="preserve">depositonce.tu-berlin.de</w:t>
+        </w:r>
+      </w:hyperlink>
+      <w:r>
+        <w:rPr>
+          <w:rFonts w:ascii="DM Sans" w:cs="DM Sans" w:eastAsia="DM Sans" w:hAnsi="DM Sans"/>
+          <w:color w:val="1A1A2E"/>
+          <w:sz w:val="22"/>
+          <w:szCs w:val="22"/>
+        </w:rPr>
+        <w:t xml:space="preserve">.</w:t>
+      </w:r>
+    </w:p>
+    <w:p>
+      <w:pPr>
+        <w:spacing w:after="160" w:line="300"/>
+      </w:pPr>
+      <w:r>
+        <w:rPr>
+          <w:rFonts w:ascii="DM Sans" w:cs="DM Sans" w:eastAsia="DM Sans" w:hAnsi="DM Sans"/>
+          <w:b/>
+          <w:bCs/>
+          <w:color w:val="1A1A2E"/>
+          <w:sz w:val="22"/>
+          <w:szCs w:val="22"/>
+        </w:rPr>
+        <w:t xml:space="preserve">Bernschuetz KU100 (CC BY 3.0): </w:t>
+      </w:r>
+      <w:r>
+        <w:rPr>
+          <w:rFonts w:ascii="DM Sans" w:cs="DM Sans" w:eastAsia="DM Sans" w:hAnsi="DM Sans"/>
+          <w:color w:val="1A1A2E"/>
+          <w:sz w:val="22"/>
+          <w:szCs w:val="22"/>
+        </w:rPr>
+        <w:t xml:space="preserve">Benjamin Bernschütz, TH Köln (Cologne University of Applied Sciences). Licensed under the Creative Commons Attribution 3.0 Unported License. You must give appropriate credit and indicate if changes were made. See </w:t>
+      </w:r>
+      <w:hyperlink w:history="1" r:id="rIdavzgy0kvpo0vsznxfz2lk">
+        <w:r>
+          <w:rPr>
+            <w:rFonts w:ascii="DM Sans" w:cs="DM Sans" w:eastAsia="DM Sans" w:hAnsi="DM Sans"/>
+            <w:color w:val="2563EB"/>
+            <w:sz w:val="22"/>
+            <w:szCs w:val="22"/>
+            <w:u w:val="single"/>
+          </w:rPr>
+          <w:t xml:space="preserve">audiogroup.web.th-koeln.de</w:t>
+        </w:r>
+      </w:hyperlink>
+      <w:r>
+        <w:rPr>
+          <w:rFonts w:ascii="DM Sans" w:cs="DM Sans" w:eastAsia="DM Sans" w:hAnsi="DM Sans"/>
+          <w:color w:val="1A1A2E"/>
+          <w:sz w:val="22"/>
+          <w:szCs w:val="22"/>
+        </w:rPr>
+        <w:t xml:space="preserve">.</w:t>
+      </w:r>
+    </w:p>
+    <w:p>
+      <w:pPr>
+        <w:pStyle w:val="Heading2"/>
+        <w:spacing w:after="180" w:before="280"/>
+      </w:pPr>
+      <w:r>
+        <w:rPr>
+          <w:rFonts w:ascii="DM Sans" w:cs="DM Sans" w:eastAsia="DM Sans" w:hAnsi="DM Sans"/>
+          <w:b/>
+          <w:bCs/>
+          <w:color w:val="64748B"/>
+          <w:sz w:val="30"/>
+          <w:szCs w:val="30"/>
+        </w:rPr>
+        <w:t xml:space="preserve">11.3</w:t>
+      </w:r>
+      <w:r>
+        <w:rPr>
+          <w:rFonts w:ascii="DM Sans" w:cs="DM Sans" w:eastAsia="DM Sans" w:hAnsi="DM Sans"/>
+          <w:b/>
+          <w:bCs/>
+          <w:color w:val="001633"/>
+          <w:sz w:val="30"/>
+          <w:szCs w:val="30"/>
+        </w:rPr>
+        <w:t xml:space="preserve">  Fonts</w:t>
+      </w:r>
+    </w:p>
+    <w:tbl>
+      <w:tblPr>
+        <w:tblW w:type="dxa" w:w="9026"/>
+        <w:tblBorders>
+          <w:top w:val="single" w:color="auto" w:sz="4"/>
+          <w:left w:val="single" w:color="auto" w:sz="4"/>
+          <w:bottom w:val="single" w:color="auto" w:sz="4"/>
+          <w:right w:val="single" w:color="auto" w:sz="4"/>
+          <w:insideH w:val="single" w:color="auto" w:sz="4"/>
+          <w:insideV w:val="single" w:color="auto" w:sz="4"/>
+        </w:tblBorders>
+      </w:tblPr>
+      <w:tblGrid>
+        <w:gridCol w:w="3600"/>
+        <w:gridCol w:w="2400"/>
+        <w:gridCol w:w="3026"/>
+      </w:tblGrid>
+      <w:tr>
+        <w:trPr>
+          <w:tblHeader/>
+        </w:trPr>
+        <w:tc>
+          <w:tcPr>
+            <w:tcW w:type="dxa" w:w="3600"/>
+            <w:tcBorders>
+              <w:top w:val="single" w:color="E2E8F0" w:sz="1"/>
+              <w:left w:val="single" w:color="E2E8F0" w:sz="1"/>
+              <w:bottom w:val="single" w:color="E2E8F0" w:sz="1"/>
+              <w:right w:val="single" w:color="E2E8F0" w:sz="1"/>
+            </w:tcBorders>
+            <w:shd w:fill="001633" w:val="clear"/>
+            <w:tcMar>
+              <w:top w:type="dxa" w:w="60"/>
+              <w:left w:type="dxa" w:w="100"/>
+              <w:bottom w:type="dxa" w:w="60"/>
+              <w:right w:type="dxa" w:w="100"/>
+            </w:tcMar>
+          </w:tcPr>
+          <w:p>
+            <w:r>
+              <w:rPr>
+                <w:rFonts w:ascii="DM Sans" w:cs="DM Sans" w:eastAsia="DM Sans" w:hAnsi="DM Sans"/>
+                <w:b/>
+                <w:bCs/>
+                <w:color w:val="FFFFFF"/>
+                <w:sz w:val="18"/>
+                <w:szCs w:val="18"/>
+              </w:rPr>
+              <w:t xml:space="preserve">Font</w:t>
+            </w:r>
+          </w:p>
+        </w:tc>
+        <w:tc>
+          <w:tcPr>
+            <w:tcW w:type="dxa" w:w="2400"/>
+            <w:tcBorders>
+              <w:top w:val="single" w:color="E2E8F0" w:sz="1"/>
+              <w:left w:val="single" w:color="E2E8F0" w:sz="1"/>
+              <w:bottom w:val="single" w:color="E2E8F0" w:sz="1"/>
+              <w:right w:val="single" w:color="E2E8F0" w:sz="1"/>
+            </w:tcBorders>
+            <w:shd w:fill="001633" w:val="clear"/>
+            <w:tcMar>
+              <w:top w:type="dxa" w:w="60"/>
+              <w:left w:type="dxa" w:w="100"/>
+              <w:bottom w:type="dxa" w:w="60"/>
+              <w:right w:type="dxa" w:w="100"/>
+            </w:tcMar>
+          </w:tcPr>
+          <w:p>
+            <w:r>
+              <w:rPr>
+                <w:rFonts w:ascii="DM Sans" w:cs="DM Sans" w:eastAsia="DM Sans" w:hAnsi="DM Sans"/>
+                <w:b/>
+                <w:bCs/>
+                <w:color w:val="FFFFFF"/>
+                <w:sz w:val="18"/>
+                <w:szCs w:val="18"/>
+              </w:rPr>
+              <w:t xml:space="preserve">License</w:t>
+            </w:r>
+          </w:p>
+        </w:tc>
+        <w:tc>
+          <w:tcPr>
+            <w:tcW w:type="dxa" w:w="3026"/>
+            <w:tcBorders>
+              <w:top w:val="single" w:color="E2E8F0" w:sz="1"/>
+              <w:left w:val="single" w:color="E2E8F0" w:sz="1"/>
+              <w:bottom w:val="single" w:color="E2E8F0" w:sz="1"/>
+              <w:right w:val="single" w:color="E2E8F0" w:sz="1"/>
+            </w:tcBorders>
+            <w:shd w:fill="001633" w:val="clear"/>
+            <w:tcMar>
+              <w:top w:type="dxa" w:w="60"/>
+              <w:left w:type="dxa" w:w="100"/>
+              <w:bottom w:type="dxa" w:w="60"/>
+              <w:right w:type="dxa" w:w="100"/>
+            </w:tcMar>
+          </w:tcPr>
+          <w:p>
+            <w:r>
+              <w:rPr>
+                <w:rFonts w:ascii="DM Sans" w:cs="DM Sans" w:eastAsia="DM Sans" w:hAnsi="DM Sans"/>
+                <w:b/>
+                <w:bCs/>
+                <w:color w:val="FFFFFF"/>
+                <w:sz w:val="18"/>
+                <w:szCs w:val="18"/>
+              </w:rPr>
+              <w:t xml:space="preserve">Copyright</w:t>
+            </w:r>
+          </w:p>
+        </w:tc>
+      </w:tr>
+      <w:tr>
+        <w:tc>
+          <w:tcPr>
+            <w:tcW w:type="dxa" w:w="3600"/>
+            <w:tcBorders>
+              <w:top w:val="single" w:color="E2E8F0" w:sz="1"/>
+              <w:left w:val="single" w:color="E2E8F0" w:sz="1"/>
+              <w:bottom w:val="single" w:color="E2E8F0" w:sz="1"/>
+              <w:right w:val="single" w:color="E2E8F0" w:sz="1"/>
+            </w:tcBorders>
+            <w:tcMar>
+              <w:top w:type="dxa" w:w="50"/>
+              <w:left w:type="dxa" w:w="100"/>
+              <w:bottom w:type="dxa" w:w="50"/>
+              <w:right w:type="dxa" w:w="100"/>
+            </w:tcMar>
+          </w:tcPr>
+          <w:p>
+            <w:r>
+              <w:rPr>
+                <w:rFonts w:ascii="DM Sans" w:cs="DM Sans" w:eastAsia="DM Sans" w:hAnsi="DM Sans"/>
+                <w:color w:val="1A1A2E"/>
+                <w:sz w:val="18"/>
+                <w:szCs w:val="18"/>
+              </w:rPr>
+              <w:t xml:space="preserve">DM Sans (Regular, Medium, SemiBold, Bold)</w:t>
+            </w:r>
+          </w:p>
+        </w:tc>
+        <w:tc>
+          <w:tcPr>
+            <w:tcW w:type="dxa" w:w="2400"/>
+            <w:tcBorders>
+              <w:top w:val="single" w:color="E2E8F0" w:sz="1"/>
+              <w:left w:val="single" w:color="E2E8F0" w:sz="1"/>
+              <w:bottom w:val="single" w:color="E2E8F0" w:sz="1"/>
+              <w:right w:val="single" w:color="E2E8F0" w:sz="1"/>
+            </w:tcBorders>
+            <w:tcMar>
+              <w:top w:type="dxa" w:w="50"/>
+              <w:left w:type="dxa" w:w="100"/>
+              <w:bottom w:type="dxa" w:w="50"/>
+              <w:right w:type="dxa" w:w="100"/>
+            </w:tcMar>
+          </w:tcPr>
+          <w:p>
+            <w:r>
+              <w:rPr>
+                <w:rFonts w:ascii="DM Sans" w:cs="DM Sans" w:eastAsia="DM Sans" w:hAnsi="DM Sans"/>
+                <w:color w:val="1A1A2E"/>
+                <w:sz w:val="18"/>
+                <w:szCs w:val="18"/>
+              </w:rPr>
+              <w:t xml:space="preserve">SIL Open Font License 1.1</w:t>
+            </w:r>
+          </w:p>
+        </w:tc>
+        <w:tc>
+          <w:tcPr>
+            <w:tcW w:type="dxa" w:w="3026"/>
+            <w:tcBorders>
+              <w:top w:val="single" w:color="E2E8F0" w:sz="1"/>
+              <w:left w:val="single" w:color="E2E8F0" w:sz="1"/>
+              <w:bottom w:val="single" w:color="E2E8F0" w:sz="1"/>
+              <w:right w:val="single" w:color="E2E8F0" w:sz="1"/>
+            </w:tcBorders>
+            <w:tcMar>
+              <w:top w:type="dxa" w:w="50"/>
+              <w:left w:type="dxa" w:w="100"/>
+              <w:bottom w:type="dxa" w:w="50"/>
+              <w:right w:type="dxa" w:w="100"/>
+            </w:tcMar>
+          </w:tcPr>
+          <w:p>
+            <w:r>
+              <w:rPr>
+                <w:rFonts w:ascii="DM Sans" w:cs="DM Sans" w:eastAsia="DM Sans" w:hAnsi="DM Sans"/>
+                <w:color w:val="1A1A2E"/>
+                <w:sz w:val="18"/>
+                <w:szCs w:val="18"/>
+              </w:rPr>
+              <w:t xml:space="preserve">Colophon Foundry, Google</w:t>
+            </w:r>
+          </w:p>
+        </w:tc>
+      </w:tr>
+      <w:tr>
+        <w:tc>
+          <w:tcPr>
+            <w:tcW w:type="dxa" w:w="3600"/>
+            <w:tcBorders>
+              <w:top w:val="single" w:color="E2E8F0" w:sz="1"/>
+              <w:left w:val="single" w:color="E2E8F0" w:sz="1"/>
+              <w:bottom w:val="single" w:color="E2E8F0" w:sz="1"/>
+              <w:right w:val="single" w:color="E2E8F0" w:sz="1"/>
+            </w:tcBorders>
+            <w:shd w:fill="F8FAFC" w:val="clear"/>
+            <w:tcMar>
+              <w:top w:type="dxa" w:w="50"/>
+              <w:left w:type="dxa" w:w="100"/>
+              <w:bottom w:type="dxa" w:w="50"/>
+              <w:right w:type="dxa" w:w="100"/>
+            </w:tcMar>
+          </w:tcPr>
+          <w:p>
+            <w:r>
+              <w:rPr>
+                <w:rFonts w:ascii="DM Sans" w:cs="DM Sans" w:eastAsia="DM Sans" w:hAnsi="DM Sans"/>
+                <w:color w:val="1A1A2E"/>
+                <w:sz w:val="18"/>
+                <w:szCs w:val="18"/>
+              </w:rPr>
+              <w:t xml:space="preserve">JetBrains Mono (Regular, Medium, Bold)</w:t>
+            </w:r>
+          </w:p>
+        </w:tc>
+        <w:tc>
+          <w:tcPr>
+            <w:tcW w:type="dxa" w:w="2400"/>
+            <w:tcBorders>
+              <w:top w:val="single" w:color="E2E8F0" w:sz="1"/>
+              <w:left w:val="single" w:color="E2E8F0" w:sz="1"/>
+              <w:bottom w:val="single" w:color="E2E8F0" w:sz="1"/>
+              <w:right w:val="single" w:color="E2E8F0" w:sz="1"/>
+            </w:tcBorders>
+            <w:shd w:fill="F8FAFC" w:val="clear"/>
+            <w:tcMar>
+              <w:top w:type="dxa" w:w="50"/>
+              <w:left w:type="dxa" w:w="100"/>
+              <w:bottom w:type="dxa" w:w="50"/>
+              <w:right w:type="dxa" w:w="100"/>
+            </w:tcMar>
+          </w:tcPr>
+          <w:p>
+            <w:r>
+              <w:rPr>
+                <w:rFonts w:ascii="DM Sans" w:cs="DM Sans" w:eastAsia="DM Sans" w:hAnsi="DM Sans"/>
+                <w:color w:val="1A1A2E"/>
+                <w:sz w:val="18"/>
+                <w:szCs w:val="18"/>
+              </w:rPr>
+              <w:t xml:space="preserve">SIL Open Font License 1.1</w:t>
+            </w:r>
+          </w:p>
+        </w:tc>
+        <w:tc>
+          <w:tcPr>
+            <w:tcW w:type="dxa" w:w="3026"/>
+            <w:tcBorders>
+              <w:top w:val="single" w:color="E2E8F0" w:sz="1"/>
+              <w:left w:val="single" w:color="E2E8F0" w:sz="1"/>
+              <w:bottom w:val="single" w:color="E2E8F0" w:sz="1"/>
+              <w:right w:val="single" w:color="E2E8F0" w:sz="1"/>
+            </w:tcBorders>
+            <w:shd w:fill="F8FAFC" w:val="clear"/>
+            <w:tcMar>
+              <w:top w:type="dxa" w:w="50"/>
+              <w:left w:type="dxa" w:w="100"/>
+              <w:bottom w:type="dxa" w:w="50"/>
+              <w:right w:type="dxa" w:w="100"/>
+            </w:tcMar>
+          </w:tcPr>
+          <w:p>
+            <w:r>
+              <w:rPr>
+                <w:rFonts w:ascii="DM Sans" w:cs="DM Sans" w:eastAsia="DM Sans" w:hAnsi="DM Sans"/>
+                <w:color w:val="1A1A2E"/>
+                <w:sz w:val="18"/>
+                <w:szCs w:val="18"/>
+              </w:rPr>
+              <w:t xml:space="preserve">JetBrains s.r.o.</w:t>
+            </w:r>
+          </w:p>
+        </w:tc>
+      </w:tr>
+      <w:tr>
+        <w:tc>
+          <w:tcPr>
+            <w:tcW w:type="dxa" w:w="3600"/>
+            <w:tcBorders>
+              <w:top w:val="single" w:color="E2E8F0" w:sz="1"/>
+              <w:left w:val="single" w:color="E2E8F0" w:sz="1"/>
+              <w:bottom w:val="single" w:color="E2E8F0" w:sz="1"/>
+              <w:right w:val="single" w:color="E2E8F0" w:sz="1"/>
+            </w:tcBorders>
+            <w:tcMar>
+              <w:top w:type="dxa" w:w="50"/>
+              <w:left w:type="dxa" w:w="100"/>
+              <w:bottom w:type="dxa" w:w="50"/>
+              <w:right w:type="dxa" w:w="100"/>
+            </w:tcMar>
+          </w:tcPr>
+          <w:p>
+            <w:r>
+              <w:rPr>
+                <w:rFonts w:ascii="DM Sans" w:cs="DM Sans" w:eastAsia="DM Sans" w:hAnsi="DM Sans"/>
+                <w:color w:val="1A1A2E"/>
+                <w:sz w:val="18"/>
+                <w:szCs w:val="18"/>
+              </w:rPr>
+              <w:t xml:space="preserve">Roboto (Medium)</w:t>
+            </w:r>
+          </w:p>
+        </w:tc>
+        <w:tc>
+          <w:tcPr>
+            <w:tcW w:type="dxa" w:w="2400"/>
+            <w:tcBorders>
+              <w:top w:val="single" w:color="E2E8F0" w:sz="1"/>
+              <w:left w:val="single" w:color="E2E8F0" w:sz="1"/>
+              <w:bottom w:val="single" w:color="E2E8F0" w:sz="1"/>
+              <w:right w:val="single" w:color="E2E8F0" w:sz="1"/>
+            </w:tcBorders>
+            <w:tcMar>
+              <w:top w:type="dxa" w:w="50"/>
+              <w:left w:type="dxa" w:w="100"/>
+              <w:bottom w:type="dxa" w:w="50"/>
+              <w:right w:type="dxa" w:w="100"/>
+            </w:tcMar>
+          </w:tcPr>
+          <w:p>
+            <w:r>
+              <w:rPr>
+                <w:rFonts w:ascii="DM Sans" w:cs="DM Sans" w:eastAsia="DM Sans" w:hAnsi="DM Sans"/>
+                <w:color w:val="1A1A2E"/>
+                <w:sz w:val="18"/>
+                <w:szCs w:val="18"/>
+              </w:rPr>
+              <w:t xml:space="preserve">Apache License 2.0</w:t>
+            </w:r>
+          </w:p>
+        </w:tc>
+        <w:tc>
+          <w:tcPr>
+            <w:tcW w:type="dxa" w:w="3026"/>
+            <w:tcBorders>
+              <w:top w:val="single" w:color="E2E8F0" w:sz="1"/>
+              <w:left w:val="single" w:color="E2E8F0" w:sz="1"/>
+              <w:bottom w:val="single" w:color="E2E8F0" w:sz="1"/>
+              <w:right w:val="single" w:color="E2E8F0" w:sz="1"/>
+            </w:tcBorders>
+            <w:tcMar>
+              <w:top w:type="dxa" w:w="50"/>
+              <w:left w:type="dxa" w:w="100"/>
+              <w:bottom w:type="dxa" w:w="50"/>
+              <w:right w:type="dxa" w:w="100"/>
+            </w:tcMar>
+          </w:tcPr>
+          <w:p>
+            <w:r>
+              <w:rPr>
+                <w:rFonts w:ascii="DM Sans" w:cs="DM Sans" w:eastAsia="DM Sans" w:hAnsi="DM Sans"/>
+                <w:color w:val="1A1A2E"/>
+                <w:sz w:val="18"/>
+                <w:szCs w:val="18"/>
+              </w:rPr>
+              <w:t xml:space="preserve">Google LLC</w:t>
+            </w:r>
+          </w:p>
+        </w:tc>
+      </w:tr>
+    </w:tbl>
+    <w:p>
+      <w:pPr>
+        <w:spacing w:after="160"/>
+      </w:pPr>
+    </w:p>
+    <w:p>
+      <w:pPr>
+        <w:spacing w:after="160" w:line="300"/>
+      </w:pPr>
+      <w:r>
+        <w:rPr>
+          <w:rFonts w:ascii="DM Sans" w:cs="DM Sans" w:eastAsia="DM Sans" w:hAnsi="DM Sans"/>
+          <w:b/>
+          <w:bCs/>
+          <w:color w:val="1A1A2E"/>
+          <w:sz w:val="22"/>
+          <w:szCs w:val="22"/>
+        </w:rPr>
+        <w:t xml:space="preserve">SIL Open Font License 1.1: </w:t>
+      </w:r>
+      <w:r>
+        <w:rPr>
+          <w:rFonts w:ascii="DM Sans" w:cs="DM Sans" w:eastAsia="DM Sans" w:hAnsi="DM Sans"/>
+          <w:color w:val="1A1A2E"/>
+          <w:sz w:val="22"/>
+          <w:szCs w:val="22"/>
+        </w:rPr>
+        <w:t xml:space="preserve">DM Sans and JetBrains Mono are licensed under the SIL Open Font License, Version 1.1. This license is available at </w:t>
+      </w:r>
+      <w:hyperlink w:history="1" r:id="rIdh3vkz2y1gdwha_o_bbnpz">
+        <w:r>
+          <w:rPr>
+            <w:rFonts w:ascii="DM Sans" w:cs="DM Sans" w:eastAsia="DM Sans" w:hAnsi="DM Sans"/>
+            <w:color w:val="2563EB"/>
+            <w:sz w:val="22"/>
+            <w:szCs w:val="22"/>
+            <w:u w:val="single"/>
+          </w:rPr>
+          <w:t xml:space="preserve">openfontlicense.org</w:t>
+        </w:r>
+      </w:hyperlink>
+      <w:r>
+        <w:rPr>
+          <w:rFonts w:ascii="DM Sans" w:cs="DM Sans" w:eastAsia="DM Sans" w:hAnsi="DM Sans"/>
+          <w:color w:val="1A1A2E"/>
+          <w:sz w:val="22"/>
+          <w:szCs w:val="22"/>
+        </w:rPr>
+        <w:t xml:space="preserve">. The fonts may be used, modified, and distributed freely, provided that they are not sold by themselves and any derivative fonts carry a different name.</w:t>
+      </w:r>
+    </w:p>
+    <w:p>
+      <w:pPr>
+        <w:spacing w:after="160" w:line="300"/>
+      </w:pPr>
+      <w:r>
+        <w:rPr>
+          <w:rFonts w:ascii="DM Sans" w:cs="DM Sans" w:eastAsia="DM Sans" w:hAnsi="DM Sans"/>
+          <w:b/>
+          <w:bCs/>
+          <w:color w:val="1A1A2E"/>
+          <w:sz w:val="22"/>
+          <w:szCs w:val="22"/>
+        </w:rPr>
+        <w:t xml:space="preserve">Apache License 2.0: </w:t>
+      </w:r>
+      <w:r>
+        <w:rPr>
+          <w:rFonts w:ascii="DM Sans" w:cs="DM Sans" w:eastAsia="DM Sans" w:hAnsi="DM Sans"/>
+          <w:color w:val="1A1A2E"/>
+          <w:sz w:val="22"/>
+          <w:szCs w:val="22"/>
+        </w:rPr>
+        <w:t xml:space="preserve">Roboto is licensed under the Apache License, Version 2.0. You may obtain a copy of the License at </w:t>
+      </w:r>
+      <w:hyperlink w:history="1" r:id="rIdtlcc-rixgdn1vvbtd3fdy">
+        <w:r>
+          <w:rPr>
+            <w:rFonts w:ascii="DM Sans" w:cs="DM Sans" w:eastAsia="DM Sans" w:hAnsi="DM Sans"/>
+            <w:color w:val="2563EB"/>
+            <w:sz w:val="22"/>
+            <w:szCs w:val="22"/>
+            <w:u w:val="single"/>
+          </w:rPr>
+          <w:t xml:space="preserve">apache.org/licenses/LICENSE-2.0</w:t>
+        </w:r>
+      </w:hyperlink>
+      <w:r>
+        <w:rPr>
+          <w:rFonts w:ascii="DM Sans" w:cs="DM Sans" w:eastAsia="DM Sans" w:hAnsi="DM Sans"/>
+          <w:color w:val="1A1A2E"/>
+          <w:sz w:val="22"/>
+          <w:szCs w:val="22"/>
+        </w:rPr>
+        <w:t xml:space="preserve">.</w:t>
+      </w:r>
+    </w:p>
+    <w:p>
+      <w:pPr>
+        <w:pStyle w:val="Heading2"/>
+        <w:spacing w:after="180" w:before="280"/>
+      </w:pPr>
+      <w:r>
+        <w:rPr>
+          <w:rFonts w:ascii="DM Sans" w:cs="DM Sans" w:eastAsia="DM Sans" w:hAnsi="DM Sans"/>
+          <w:b/>
+          <w:bCs/>
+          <w:color w:val="64748B"/>
+          <w:sz w:val="30"/>
+          <w:szCs w:val="30"/>
+        </w:rPr>
+        <w:t xml:space="preserve">11.4</w:t>
+      </w:r>
+      <w:r>
+        <w:rPr>
+          <w:rFonts w:ascii="DM Sans" w:cs="DM Sans" w:eastAsia="DM Sans" w:hAnsi="DM Sans"/>
+          <w:b/>
+          <w:bCs/>
+          <w:color w:val="001633"/>
+          <w:sz w:val="30"/>
+          <w:szCs w:val="30"/>
+        </w:rPr>
+        <w:t xml:space="preserve">  Project License</w:t>
+      </w:r>
+    </w:p>
+    <w:p>
+      <w:pPr>
+        <w:spacing w:after="160" w:line="300"/>
+      </w:pPr>
+      <w:r>
+        <w:rPr>
+          <w:rFonts w:ascii="DM Sans" w:cs="DM Sans" w:eastAsia="DM Sans" w:hAnsi="DM Sans"/>
+          <w:color w:val="1A1A2E"/>
+          <w:sz w:val="22"/>
+          <w:szCs w:val="22"/>
+        </w:rPr>
+        <w:t xml:space="preserve">OpenSpatialDelay itself is dual-licensed under the </w:t>
+      </w:r>
+      <w:r>
+        <w:rPr>
+          <w:rFonts w:ascii="DM Sans" w:cs="DM Sans" w:eastAsia="DM Sans" w:hAnsi="DM Sans"/>
+          <w:b/>
+          <w:bCs/>
+          <w:color w:val="1A1A2E"/>
+          <w:sz w:val="22"/>
+          <w:szCs w:val="22"/>
+        </w:rPr>
+        <w:t xml:space="preserve">GNU General Public License v3.0</w:t>
+      </w:r>
+      <w:r>
+        <w:rPr>
+          <w:rFonts w:ascii="DM Sans" w:cs="DM Sans" w:eastAsia="DM Sans" w:hAnsi="DM Sans"/>
+          <w:color w:val="1A1A2E"/>
+          <w:sz w:val="22"/>
+          <w:szCs w:val="22"/>
+        </w:rPr>
+        <w:t xml:space="preserve"> (for open-source use) and a </w:t>
+      </w:r>
+      <w:r>
+        <w:rPr>
+          <w:rFonts w:ascii="DM Sans" w:cs="DM Sans" w:eastAsia="DM Sans" w:hAnsi="DM Sans"/>
+          <w:b/>
+          <w:bCs/>
+          <w:color w:val="1A1A2E"/>
+          <w:sz w:val="22"/>
+          <w:szCs w:val="22"/>
+        </w:rPr>
+        <w:t xml:space="preserve">Commercial License</w:t>
+      </w:r>
+      <w:r>
+        <w:rPr>
+          <w:rFonts w:ascii="DM Sans" w:cs="DM Sans" w:eastAsia="DM Sans" w:hAnsi="DM Sans"/>
+          <w:color w:val="1A1A2E"/>
+          <w:sz w:val="22"/>
+          <w:szCs w:val="22"/>
+        </w:rPr>
+        <w:t xml:space="preserve"> (for proprietary/closed-source projects). The full GPL-3.0 text is included in the LICENSE file distributed with the source code. For commercial licensing, contact </w:t>
+      </w:r>
+      <w:hyperlink w:history="1" r:id="rIdglsjpldvrifk-hhrzxiol">
+        <w:r>
+          <w:rPr>
+            <w:rFonts w:ascii="DM Sans" w:cs="DM Sans" w:eastAsia="DM Sans" w:hAnsi="DM Sans"/>
+            <w:color w:val="2563EB"/>
+            <w:sz w:val="22"/>
+            <w:szCs w:val="22"/>
+            <w:u w:val="single"/>
+          </w:rPr>
+          <w:t xml:space="preserve">Spatial Media Lab</w:t>
+        </w:r>
+      </w:hyperlink>
+      <w:r>
+        <w:rPr>
+          <w:rFonts w:ascii="DM Sans" w:cs="DM Sans" w:eastAsia="DM Sans" w:hAnsi="DM Sans"/>
+          <w:color w:val="1A1A2E"/>
+          <w:sz w:val="22"/>
+          <w:szCs w:val="22"/>
+        </w:rPr>
+        <w:t xml:space="preserve">.</w:t>
+      </w:r>
+    </w:p>
+    <w:p>
+      <w:r>
+        <w:br w:type="page"/>
+      </w:r>
+    </w:p>
+    <w:p>
+      <w:pPr>
         <w:spacing w:after="1200"/>
       </w:pPr>
     </w:p>
@@ -18284,7 +20614,7 @@
         <w:spacing w:after="60"/>
         <w:jc w:val="center"/>
       </w:pPr>
-      <w:hyperlink w:history="1" r:id="rIdoxpqnjh5jmhs63wckvn5m">
+      <w:hyperlink w:history="1" r:id="rIddjvasj8dqi5ffopwtfwgx">
         <w:r>
           <w:rPr>
             <w:rFonts w:ascii="DM Sans" w:cs="DM Sans" w:eastAsia="DM Sans" w:hAnsi="DM Sans"/>
@@ -18302,7 +20632,7 @@
         <w:spacing w:after="60"/>
         <w:jc w:val="center"/>
       </w:pPr>
-      <w:hyperlink w:history="1" r:id="rIdpg7a9hrbwarcaaczccxsk">
+      <w:hyperlink w:history="1" r:id="rIds_-v3ajprg17xon5cvhj4">
         <w:r>
           <w:rPr>
             <w:rFonts w:ascii="DM Sans" w:cs="DM Sans" w:eastAsia="DM Sans" w:hAnsi="DM Sans"/>

</xml_diff>

<commit_message>
fix(01-03): regenerate user manual without legal notices section
- Remove stale TOC entry 'Third-Party Notices' pointing to dropped 'legal-notices' bookmark
- Regenerate OpenSpatialDelay_Manual_v1.0.docx via node generate_manual.js
- Convert to PDF via soffice --headless --convert-to pdf (established repo pattern; generator emits DOCX only)
- Verified: no 'Third-Party Notices' or 'Project License' text in DOCX or PDF
- DOCX: 1,310,487 -> 1,306,895 bytes (-3,592)
- PDF regenerated (size diff within LibreOffice render variance)

Closes gap G-01 (01-VERIFICATION.md): user manual is product docs only, legal notices live exclusively in separate OpenSpatialDelay_Legal_Notices artifact.
</commit_message>
<xml_diff>
--- a/docs/OpenSpatialDelay_Manual_v1.0.docx
+++ b/docs/OpenSpatialDelay_Manual_v1.0.docx
@@ -1215,36 +1215,6 @@
     </w:p>
     <w:p>
       <w:pPr>
-        <w:spacing w:after="140" w:before="80"/>
-        <w:ind w:left="0"/>
-      </w:pPr>
-      <w:hyperlink w:history="1" w:anchor="legal-notices">
-        <w:r>
-          <w:rPr>
-            <w:rFonts w:ascii="DM Sans" w:cs="DM Sans" w:eastAsia="DM Sans" w:hAnsi="DM Sans"/>
-            <w:b/>
-            <w:bCs/>
-            <w:color w:val="64748B"/>
-            <w:sz w:val="24"/>
-            <w:szCs w:val="24"/>
-          </w:rPr>
-          <w:t xml:space="preserve">11</w:t>
-        </w:r>
-        <w:r>
-          <w:rPr>
-            <w:rFonts w:ascii="DM Sans" w:cs="DM Sans" w:eastAsia="DM Sans" w:hAnsi="DM Sans"/>
-            <w:b/>
-            <w:bCs/>
-            <w:color w:val="001633"/>
-            <w:sz w:val="24"/>
-            <w:szCs w:val="24"/>
-          </w:rPr>
-          <w:t xml:space="preserve">  Third-Party Notices</w:t>
-        </w:r>
-      </w:hyperlink>
-    </w:p>
-    <w:p>
-      <w:pPr>
         <w:sectPr>
           <w:headerReference w:type="default" r:id="rId7"/>
           <w:footerReference w:type="default" r:id="rId8"/>
@@ -1342,7 +1312,7 @@
         </w:rPr>
         <w:t xml:space="preserve">Download the latest release for your platform from the </w:t>
       </w:r>
-      <w:hyperlink w:history="1" r:id="rId9to0rgrpfskqczdfhztmw">
+      <w:hyperlink w:history="1" r:id="rIdzwyckemkplsagbryzit-q">
         <w:r>
           <w:rPr>
             <w:rFonts w:ascii="DM Sans" w:cs="DM Sans" w:eastAsia="DM Sans" w:hAnsi="DM Sans"/>
@@ -9083,7 +9053,7 @@
                 <w:sz w:val="18"/>
                 <w:szCs w:val="18"/>
               </w:rPr>
-              <w:t xml:space="preserve">Studio Reference</w:t>
+              <w:t xml:space="preserve">Immersive</w:t>
             </w:r>
           </w:p>
         </w:tc>
@@ -9112,7 +9082,7 @@
                 <w:sz w:val="18"/>
                 <w:szCs w:val="18"/>
               </w:rPr>
-              <w:t xml:space="preserve">MIT KEMAR Large Pinna</w:t>
+              <w:t xml:space="preserve">SADIE II D2 KU100</w:t>
             </w:r>
           </w:p>
         </w:tc>
@@ -9141,7 +9111,7 @@
                 <w:sz w:val="18"/>
                 <w:szCs w:val="18"/>
               </w:rPr>
-              <w:t xml:space="preserve">Neutral, classic reference standard</w:t>
+              <w:t xml:space="preserve">Rich spatial detail, strong elevation cues</w:t>
             </w:r>
           </w:p>
         </w:tc>
@@ -9200,7 +9170,7 @@
                 <w:sz w:val="18"/>
                 <w:szCs w:val="18"/>
               </w:rPr>
-              <w:t xml:space="preserve">Immersive</w:t>
+              <w:t xml:space="preserve">Natural</w:t>
             </w:r>
           </w:p>
         </w:tc>
@@ -9228,7 +9198,7 @@
                 <w:sz w:val="18"/>
                 <w:szCs w:val="18"/>
               </w:rPr>
-              <w:t xml:space="preserve">SADIE II D2 KU100</w:t>
+              <w:t xml:space="preserve">CIPIC Subject 003</w:t>
             </w:r>
           </w:p>
         </w:tc>
@@ -9256,7 +9226,7 @@
                 <w:sz w:val="18"/>
                 <w:szCs w:val="18"/>
               </w:rPr>
-              <w:t xml:space="preserve">Rich spatial detail, strong elevation cues</w:t>
+              <w:t xml:space="preserve">Organic, realistic binaural rendering</w:t>
             </w:r>
           </w:p>
         </w:tc>
@@ -9315,7 +9285,7 @@
                 <w:sz w:val="18"/>
                 <w:szCs w:val="18"/>
               </w:rPr>
-              <w:t xml:space="preserve">Natural</w:t>
+              <w:t xml:space="preserve">Precise</w:t>
             </w:r>
           </w:p>
         </w:tc>
@@ -9344,7 +9314,7 @@
                 <w:sz w:val="18"/>
                 <w:szCs w:val="18"/>
               </w:rPr>
-              <w:t xml:space="preserve">CIPIC Subject 003</w:t>
+              <w:t xml:space="preserve">HUTUBS PP2</w:t>
             </w:r>
           </w:p>
         </w:tc>
@@ -9373,7 +9343,7 @@
                 <w:sz w:val="18"/>
                 <w:szCs w:val="18"/>
               </w:rPr>
-              <w:t xml:space="preserve">Organic, realistic binaural rendering</w:t>
+              <w:t xml:space="preserve">Detailed, analytical spatial accuracy</w:t>
             </w:r>
           </w:p>
         </w:tc>
@@ -9432,7 +9402,7 @@
                 <w:sz w:val="18"/>
                 <w:szCs w:val="18"/>
               </w:rPr>
-              <w:t xml:space="preserve">Precise</w:t>
+              <w:t xml:space="preserve">Spatial</w:t>
             </w:r>
           </w:p>
         </w:tc>
@@ -9460,7 +9430,7 @@
                 <w:sz w:val="18"/>
                 <w:szCs w:val="18"/>
               </w:rPr>
-              <w:t xml:space="preserve">HUTUBS PP2</w:t>
+              <w:t xml:space="preserve">Bernschuetz KU100</w:t>
             </w:r>
           </w:p>
         </w:tc>
@@ -9488,7 +9458,7 @@
                 <w:sz w:val="18"/>
                 <w:szCs w:val="18"/>
               </w:rPr>
-              <w:t xml:space="preserve">Detailed, analytical spatial accuracy</w:t>
+              <w:t xml:space="preserve">Dense full-sphere measurement, widest coverage</w:t>
             </w:r>
           </w:p>
         </w:tc>
@@ -9547,7 +9517,7 @@
                 <w:sz w:val="18"/>
                 <w:szCs w:val="18"/>
               </w:rPr>
-              <w:t xml:space="preserve">Spatial</w:t>
+              <w:t xml:space="preserve">Studio Reference</w:t>
             </w:r>
           </w:p>
         </w:tc>
@@ -9576,7 +9546,7 @@
                 <w:sz w:val="18"/>
                 <w:szCs w:val="18"/>
               </w:rPr>
-              <w:t xml:space="preserve">Bernschuetz KU100</w:t>
+              <w:t xml:space="preserve">MIT KEMAR Large Pinna</w:t>
             </w:r>
           </w:p>
         </w:tc>
@@ -9605,7 +9575,7 @@
                 <w:sz w:val="18"/>
                 <w:szCs w:val="18"/>
               </w:rPr>
-              <w:t xml:space="preserve">Dense full-sphere measurement, widest coverage</w:t>
+              <w:t xml:space="preserve">Neutral, classic reference standard</w:t>
             </w:r>
           </w:p>
         </w:tc>
@@ -18329,2190 +18299,6 @@
     </w:p>
     <w:p>
       <w:pPr>
-        <w:pStyle w:val="Heading1"/>
-        <w:spacing w:after="240" w:before="360"/>
-      </w:pPr>
-      <w:bookmarkStart w:name="legal-notices" w:id="1"/>
-      <w:r>
-        <w:rPr>
-          <w:rFonts w:ascii="DM Sans" w:cs="DM Sans" w:eastAsia="DM Sans" w:hAnsi="DM Sans"/>
-          <w:b/>
-          <w:bCs/>
-          <w:color w:val="64748B"/>
-          <w:sz w:val="36"/>
-          <w:szCs w:val="36"/>
-        </w:rPr>
-        <w:t xml:space="preserve">11</w:t>
-      </w:r>
-      <w:r>
-        <w:rPr>
-          <w:rFonts w:ascii="DM Sans" w:cs="DM Sans" w:eastAsia="DM Sans" w:hAnsi="DM Sans"/>
-          <w:b/>
-          <w:bCs/>
-          <w:color w:val="001633"/>
-          <w:sz w:val="36"/>
-          <w:szCs w:val="36"/>
-        </w:rPr>
-        <w:t xml:space="preserve">  Third-Party Notices</w:t>
-      </w:r>
-      <w:bookmarkEnd w:id="1"/>
-    </w:p>
-    <w:p>
-      <w:pPr>
-        <w:spacing w:after="160" w:line="300"/>
-      </w:pPr>
-      <w:r>
-        <w:rPr>
-          <w:rFonts w:ascii="DM Sans" w:cs="DM Sans" w:eastAsia="DM Sans" w:hAnsi="DM Sans"/>
-          <w:color w:val="1A1A2E"/>
-          <w:sz w:val="22"/>
-          <w:szCs w:val="22"/>
-        </w:rPr>
-        <w:t xml:space="preserve">OpenSpatialDelay incorporates the following third-party software, data, and fonts. This section provides the required license notices and attributions.</w:t>
-      </w:r>
-    </w:p>
-    <w:p>
-      <w:pPr>
-        <w:pStyle w:val="Heading2"/>
-        <w:spacing w:after="180" w:before="280"/>
-      </w:pPr>
-      <w:r>
-        <w:rPr>
-          <w:rFonts w:ascii="DM Sans" w:cs="DM Sans" w:eastAsia="DM Sans" w:hAnsi="DM Sans"/>
-          <w:b/>
-          <w:bCs/>
-          <w:color w:val="64748B"/>
-          <w:sz w:val="30"/>
-          <w:szCs w:val="30"/>
-        </w:rPr>
-        <w:t xml:space="preserve">11.1</w:t>
-      </w:r>
-      <w:r>
-        <w:rPr>
-          <w:rFonts w:ascii="DM Sans" w:cs="DM Sans" w:eastAsia="DM Sans" w:hAnsi="DM Sans"/>
-          <w:b/>
-          <w:bCs/>
-          <w:color w:val="001633"/>
-          <w:sz w:val="30"/>
-          <w:szCs w:val="30"/>
-        </w:rPr>
-        <w:t xml:space="preserve">  Software Libraries</w:t>
-      </w:r>
-    </w:p>
-    <w:tbl>
-      <w:tblPr>
-        <w:tblW w:type="dxa" w:w="9026"/>
-        <w:tblBorders>
-          <w:top w:val="single" w:color="auto" w:sz="4"/>
-          <w:left w:val="single" w:color="auto" w:sz="4"/>
-          <w:bottom w:val="single" w:color="auto" w:sz="4"/>
-          <w:right w:val="single" w:color="auto" w:sz="4"/>
-          <w:insideH w:val="single" w:color="auto" w:sz="4"/>
-          <w:insideV w:val="single" w:color="auto" w:sz="4"/>
-        </w:tblBorders>
-      </w:tblPr>
-      <w:tblGrid>
-        <w:gridCol w:w="3600"/>
-        <w:gridCol w:w="2400"/>
-        <w:gridCol w:w="3026"/>
-      </w:tblGrid>
-      <w:tr>
-        <w:trPr>
-          <w:tblHeader/>
-        </w:trPr>
-        <w:tc>
-          <w:tcPr>
-            <w:tcW w:type="dxa" w:w="3600"/>
-            <w:tcBorders>
-              <w:top w:val="single" w:color="E2E8F0" w:sz="1"/>
-              <w:left w:val="single" w:color="E2E8F0" w:sz="1"/>
-              <w:bottom w:val="single" w:color="E2E8F0" w:sz="1"/>
-              <w:right w:val="single" w:color="E2E8F0" w:sz="1"/>
-            </w:tcBorders>
-            <w:shd w:fill="001633" w:val="clear"/>
-            <w:tcMar>
-              <w:top w:type="dxa" w:w="60"/>
-              <w:left w:type="dxa" w:w="100"/>
-              <w:bottom w:type="dxa" w:w="60"/>
-              <w:right w:type="dxa" w:w="100"/>
-            </w:tcMar>
-          </w:tcPr>
-          <w:p>
-            <w:r>
-              <w:rPr>
-                <w:rFonts w:ascii="DM Sans" w:cs="DM Sans" w:eastAsia="DM Sans" w:hAnsi="DM Sans"/>
-                <w:b/>
-                <w:bCs/>
-                <w:color w:val="FFFFFF"/>
-                <w:sz w:val="18"/>
-                <w:szCs w:val="18"/>
-              </w:rPr>
-              <w:t xml:space="preserve">Component</w:t>
-            </w:r>
-          </w:p>
-        </w:tc>
-        <w:tc>
-          <w:tcPr>
-            <w:tcW w:type="dxa" w:w="2400"/>
-            <w:tcBorders>
-              <w:top w:val="single" w:color="E2E8F0" w:sz="1"/>
-              <w:left w:val="single" w:color="E2E8F0" w:sz="1"/>
-              <w:bottom w:val="single" w:color="E2E8F0" w:sz="1"/>
-              <w:right w:val="single" w:color="E2E8F0" w:sz="1"/>
-            </w:tcBorders>
-            <w:shd w:fill="001633" w:val="clear"/>
-            <w:tcMar>
-              <w:top w:type="dxa" w:w="60"/>
-              <w:left w:type="dxa" w:w="100"/>
-              <w:bottom w:type="dxa" w:w="60"/>
-              <w:right w:type="dxa" w:w="100"/>
-            </w:tcMar>
-          </w:tcPr>
-          <w:p>
-            <w:r>
-              <w:rPr>
-                <w:rFonts w:ascii="DM Sans" w:cs="DM Sans" w:eastAsia="DM Sans" w:hAnsi="DM Sans"/>
-                <w:b/>
-                <w:bCs/>
-                <w:color w:val="FFFFFF"/>
-                <w:sz w:val="18"/>
-                <w:szCs w:val="18"/>
-              </w:rPr>
-              <w:t xml:space="preserve">License</w:t>
-            </w:r>
-          </w:p>
-        </w:tc>
-        <w:tc>
-          <w:tcPr>
-            <w:tcW w:type="dxa" w:w="3026"/>
-            <w:tcBorders>
-              <w:top w:val="single" w:color="E2E8F0" w:sz="1"/>
-              <w:left w:val="single" w:color="E2E8F0" w:sz="1"/>
-              <w:bottom w:val="single" w:color="E2E8F0" w:sz="1"/>
-              <w:right w:val="single" w:color="E2E8F0" w:sz="1"/>
-            </w:tcBorders>
-            <w:shd w:fill="001633" w:val="clear"/>
-            <w:tcMar>
-              <w:top w:type="dxa" w:w="60"/>
-              <w:left w:type="dxa" w:w="100"/>
-              <w:bottom w:type="dxa" w:w="60"/>
-              <w:right w:type="dxa" w:w="100"/>
-            </w:tcMar>
-          </w:tcPr>
-          <w:p>
-            <w:r>
-              <w:rPr>
-                <w:rFonts w:ascii="DM Sans" w:cs="DM Sans" w:eastAsia="DM Sans" w:hAnsi="DM Sans"/>
-                <w:b/>
-                <w:bCs/>
-                <w:color w:val="FFFFFF"/>
-                <w:sz w:val="18"/>
-                <w:szCs w:val="18"/>
-              </w:rPr>
-              <w:t xml:space="preserve">Copyright</w:t>
-            </w:r>
-          </w:p>
-        </w:tc>
-      </w:tr>
-      <w:tr>
-        <w:tc>
-          <w:tcPr>
-            <w:tcW w:type="dxa" w:w="3600"/>
-            <w:tcBorders>
-              <w:top w:val="single" w:color="E2E8F0" w:sz="1"/>
-              <w:left w:val="single" w:color="E2E8F0" w:sz="1"/>
-              <w:bottom w:val="single" w:color="E2E8F0" w:sz="1"/>
-              <w:right w:val="single" w:color="E2E8F0" w:sz="1"/>
-            </w:tcBorders>
-            <w:tcMar>
-              <w:top w:type="dxa" w:w="50"/>
-              <w:left w:type="dxa" w:w="100"/>
-              <w:bottom w:type="dxa" w:w="50"/>
-              <w:right w:type="dxa" w:w="100"/>
-            </w:tcMar>
-          </w:tcPr>
-          <w:p>
-            <w:r>
-              <w:rPr>
-                <w:rFonts w:ascii="DM Sans" w:cs="DM Sans" w:eastAsia="DM Sans" w:hAnsi="DM Sans"/>
-                <w:color w:val="1A1A2E"/>
-                <w:sz w:val="18"/>
-                <w:szCs w:val="18"/>
-              </w:rPr>
-              <w:t xml:space="preserve">JUCE 8 (Audio Plugin Framework)</w:t>
-            </w:r>
-          </w:p>
-        </w:tc>
-        <w:tc>
-          <w:tcPr>
-            <w:tcW w:type="dxa" w:w="2400"/>
-            <w:tcBorders>
-              <w:top w:val="single" w:color="E2E8F0" w:sz="1"/>
-              <w:left w:val="single" w:color="E2E8F0" w:sz="1"/>
-              <w:bottom w:val="single" w:color="E2E8F0" w:sz="1"/>
-              <w:right w:val="single" w:color="E2E8F0" w:sz="1"/>
-            </w:tcBorders>
-            <w:tcMar>
-              <w:top w:type="dxa" w:w="50"/>
-              <w:left w:type="dxa" w:w="100"/>
-              <w:bottom w:type="dxa" w:w="50"/>
-              <w:right w:type="dxa" w:w="100"/>
-            </w:tcMar>
-          </w:tcPr>
-          <w:p>
-            <w:r>
-              <w:rPr>
-                <w:rFonts w:ascii="DM Sans" w:cs="DM Sans" w:eastAsia="DM Sans" w:hAnsi="DM Sans"/>
-                <w:color w:val="1A1A2E"/>
-                <w:sz w:val="18"/>
-                <w:szCs w:val="18"/>
-              </w:rPr>
-              <w:t xml:space="preserve">GPL-3.0 / Commercial</w:t>
-            </w:r>
-          </w:p>
-        </w:tc>
-        <w:tc>
-          <w:tcPr>
-            <w:tcW w:type="dxa" w:w="3026"/>
-            <w:tcBorders>
-              <w:top w:val="single" w:color="E2E8F0" w:sz="1"/>
-              <w:left w:val="single" w:color="E2E8F0" w:sz="1"/>
-              <w:bottom w:val="single" w:color="E2E8F0" w:sz="1"/>
-              <w:right w:val="single" w:color="E2E8F0" w:sz="1"/>
-            </w:tcBorders>
-            <w:tcMar>
-              <w:top w:type="dxa" w:w="50"/>
-              <w:left w:type="dxa" w:w="100"/>
-              <w:bottom w:type="dxa" w:w="50"/>
-              <w:right w:type="dxa" w:w="100"/>
-            </w:tcMar>
-          </w:tcPr>
-          <w:p>
-            <w:r>
-              <w:rPr>
-                <w:rFonts w:ascii="DM Sans" w:cs="DM Sans" w:eastAsia="DM Sans" w:hAnsi="DM Sans"/>
-                <w:color w:val="1A1A2E"/>
-                <w:sz w:val="18"/>
-                <w:szCs w:val="18"/>
-              </w:rPr>
-              <w:t xml:space="preserve">Raw Material Software Limited</w:t>
-            </w:r>
-          </w:p>
-        </w:tc>
-      </w:tr>
-      <w:tr>
-        <w:tc>
-          <w:tcPr>
-            <w:tcW w:type="dxa" w:w="3600"/>
-            <w:tcBorders>
-              <w:top w:val="single" w:color="E2E8F0" w:sz="1"/>
-              <w:left w:val="single" w:color="E2E8F0" w:sz="1"/>
-              <w:bottom w:val="single" w:color="E2E8F0" w:sz="1"/>
-              <w:right w:val="single" w:color="E2E8F0" w:sz="1"/>
-            </w:tcBorders>
-            <w:shd w:fill="F8FAFC" w:val="clear"/>
-            <w:tcMar>
-              <w:top w:type="dxa" w:w="50"/>
-              <w:left w:type="dxa" w:w="100"/>
-              <w:bottom w:type="dxa" w:w="50"/>
-              <w:right w:type="dxa" w:w="100"/>
-            </w:tcMar>
-          </w:tcPr>
-          <w:p>
-            <w:r>
-              <w:rPr>
-                <w:rFonts w:ascii="DM Sans" w:cs="DM Sans" w:eastAsia="DM Sans" w:hAnsi="DM Sans"/>
-                <w:color w:val="1A1A2E"/>
-                <w:sz w:val="18"/>
-                <w:szCs w:val="18"/>
-              </w:rPr>
-              <w:t xml:space="preserve">libmysofa v1.3.2 (SOFA File Reader)</w:t>
-            </w:r>
-          </w:p>
-        </w:tc>
-        <w:tc>
-          <w:tcPr>
-            <w:tcW w:type="dxa" w:w="2400"/>
-            <w:tcBorders>
-              <w:top w:val="single" w:color="E2E8F0" w:sz="1"/>
-              <w:left w:val="single" w:color="E2E8F0" w:sz="1"/>
-              <w:bottom w:val="single" w:color="E2E8F0" w:sz="1"/>
-              <w:right w:val="single" w:color="E2E8F0" w:sz="1"/>
-            </w:tcBorders>
-            <w:shd w:fill="F8FAFC" w:val="clear"/>
-            <w:tcMar>
-              <w:top w:type="dxa" w:w="50"/>
-              <w:left w:type="dxa" w:w="100"/>
-              <w:bottom w:type="dxa" w:w="50"/>
-              <w:right w:type="dxa" w:w="100"/>
-            </w:tcMar>
-          </w:tcPr>
-          <w:p>
-            <w:r>
-              <w:rPr>
-                <w:rFonts w:ascii="DM Sans" w:cs="DM Sans" w:eastAsia="DM Sans" w:hAnsi="DM Sans"/>
-                <w:color w:val="1A1A2E"/>
-                <w:sz w:val="18"/>
-                <w:szCs w:val="18"/>
-              </w:rPr>
-              <w:t xml:space="preserve">BSD-3-Clause</w:t>
-            </w:r>
-          </w:p>
-        </w:tc>
-        <w:tc>
-          <w:tcPr>
-            <w:tcW w:type="dxa" w:w="3026"/>
-            <w:tcBorders>
-              <w:top w:val="single" w:color="E2E8F0" w:sz="1"/>
-              <w:left w:val="single" w:color="E2E8F0" w:sz="1"/>
-              <w:bottom w:val="single" w:color="E2E8F0" w:sz="1"/>
-              <w:right w:val="single" w:color="E2E8F0" w:sz="1"/>
-            </w:tcBorders>
-            <w:shd w:fill="F8FAFC" w:val="clear"/>
-            <w:tcMar>
-              <w:top w:type="dxa" w:w="50"/>
-              <w:left w:type="dxa" w:w="100"/>
-              <w:bottom w:type="dxa" w:w="50"/>
-              <w:right w:type="dxa" w:w="100"/>
-            </w:tcMar>
-          </w:tcPr>
-          <w:p>
-            <w:r>
-              <w:rPr>
-                <w:rFonts w:ascii="DM Sans" w:cs="DM Sans" w:eastAsia="DM Sans" w:hAnsi="DM Sans"/>
-                <w:color w:val="1A1A2E"/>
-                <w:sz w:val="18"/>
-                <w:szCs w:val="18"/>
-              </w:rPr>
-              <w:t xml:space="preserve">Christian Hoene, Symonics GmbH</w:t>
-            </w:r>
-          </w:p>
-        </w:tc>
-      </w:tr>
-      <w:tr>
-        <w:tc>
-          <w:tcPr>
-            <w:tcW w:type="dxa" w:w="3600"/>
-            <w:tcBorders>
-              <w:top w:val="single" w:color="E2E8F0" w:sz="1"/>
-              <w:left w:val="single" w:color="E2E8F0" w:sz="1"/>
-              <w:bottom w:val="single" w:color="E2E8F0" w:sz="1"/>
-              <w:right w:val="single" w:color="E2E8F0" w:sz="1"/>
-            </w:tcBorders>
-            <w:tcMar>
-              <w:top w:type="dxa" w:w="50"/>
-              <w:left w:type="dxa" w:w="100"/>
-              <w:bottom w:type="dxa" w:w="50"/>
-              <w:right w:type="dxa" w:w="100"/>
-            </w:tcMar>
-          </w:tcPr>
-          <w:p>
-            <w:r>
-              <w:rPr>
-                <w:rFonts w:ascii="DM Sans" w:cs="DM Sans" w:eastAsia="DM Sans" w:hAnsi="DM Sans"/>
-                <w:color w:val="1A1A2E"/>
-                <w:sz w:val="18"/>
-                <w:szCs w:val="18"/>
-              </w:rPr>
-              <w:t xml:space="preserve">zlib (Compression)</w:t>
-            </w:r>
-          </w:p>
-        </w:tc>
-        <w:tc>
-          <w:tcPr>
-            <w:tcW w:type="dxa" w:w="2400"/>
-            <w:tcBorders>
-              <w:top w:val="single" w:color="E2E8F0" w:sz="1"/>
-              <w:left w:val="single" w:color="E2E8F0" w:sz="1"/>
-              <w:bottom w:val="single" w:color="E2E8F0" w:sz="1"/>
-              <w:right w:val="single" w:color="E2E8F0" w:sz="1"/>
-            </w:tcBorders>
-            <w:tcMar>
-              <w:top w:type="dxa" w:w="50"/>
-              <w:left w:type="dxa" w:w="100"/>
-              <w:bottom w:type="dxa" w:w="50"/>
-              <w:right w:type="dxa" w:w="100"/>
-            </w:tcMar>
-          </w:tcPr>
-          <w:p>
-            <w:r>
-              <w:rPr>
-                <w:rFonts w:ascii="DM Sans" w:cs="DM Sans" w:eastAsia="DM Sans" w:hAnsi="DM Sans"/>
-                <w:color w:val="1A1A2E"/>
-                <w:sz w:val="18"/>
-                <w:szCs w:val="18"/>
-              </w:rPr>
-              <w:t xml:space="preserve">zlib License</w:t>
-            </w:r>
-          </w:p>
-        </w:tc>
-        <w:tc>
-          <w:tcPr>
-            <w:tcW w:type="dxa" w:w="3026"/>
-            <w:tcBorders>
-              <w:top w:val="single" w:color="E2E8F0" w:sz="1"/>
-              <w:left w:val="single" w:color="E2E8F0" w:sz="1"/>
-              <w:bottom w:val="single" w:color="E2E8F0" w:sz="1"/>
-              <w:right w:val="single" w:color="E2E8F0" w:sz="1"/>
-            </w:tcBorders>
-            <w:tcMar>
-              <w:top w:type="dxa" w:w="50"/>
-              <w:left w:type="dxa" w:w="100"/>
-              <w:bottom w:type="dxa" w:w="50"/>
-              <w:right w:type="dxa" w:w="100"/>
-            </w:tcMar>
-          </w:tcPr>
-          <w:p>
-            <w:r>
-              <w:rPr>
-                <w:rFonts w:ascii="DM Sans" w:cs="DM Sans" w:eastAsia="DM Sans" w:hAnsi="DM Sans"/>
-                <w:color w:val="1A1A2E"/>
-                <w:sz w:val="18"/>
-                <w:szCs w:val="18"/>
-              </w:rPr>
-              <w:t xml:space="preserve">Jean-loup Gailly, Mark Adler</w:t>
-            </w:r>
-          </w:p>
-        </w:tc>
-      </w:tr>
-    </w:tbl>
-    <w:p>
-      <w:pPr>
-        <w:spacing w:after="160"/>
-      </w:pPr>
-    </w:p>
-    <w:p>
-      <w:pPr>
-        <w:spacing w:after="160" w:line="300"/>
-      </w:pPr>
-      <w:r>
-        <w:rPr>
-          <w:rFonts w:ascii="DM Sans" w:cs="DM Sans" w:eastAsia="DM Sans" w:hAnsi="DM Sans"/>
-          <w:b/>
-          <w:bCs/>
-          <w:color w:val="1A1A2E"/>
-          <w:sz w:val="22"/>
-          <w:szCs w:val="22"/>
-        </w:rPr>
-        <w:t xml:space="preserve">JUCE: </w:t>
-      </w:r>
-      <w:r>
-        <w:rPr>
-          <w:rFonts w:ascii="DM Sans" w:cs="DM Sans" w:eastAsia="DM Sans" w:hAnsi="DM Sans"/>
-          <w:color w:val="1A1A2E"/>
-          <w:sz w:val="22"/>
-          <w:szCs w:val="22"/>
-        </w:rPr>
-        <w:t xml:space="preserve">JUCE is dual-licensed under the GNU General Public License v3.0 and a commercial license. OpenSpatialDelay uses JUCE under the GPL-3.0. See </w:t>
-      </w:r>
-      <w:hyperlink w:history="1" r:id="rIds04sdmjy6_0doiigoruaw">
-        <w:r>
-          <w:rPr>
-            <w:rFonts w:ascii="DM Sans" w:cs="DM Sans" w:eastAsia="DM Sans" w:hAnsi="DM Sans"/>
-            <w:color w:val="2563EB"/>
-            <w:sz w:val="22"/>
-            <w:szCs w:val="22"/>
-            <w:u w:val="single"/>
-          </w:rPr>
-          <w:t xml:space="preserve">juce.com</w:t>
-        </w:r>
-      </w:hyperlink>
-      <w:r>
-        <w:rPr>
-          <w:rFonts w:ascii="DM Sans" w:cs="DM Sans" w:eastAsia="DM Sans" w:hAnsi="DM Sans"/>
-          <w:color w:val="1A1A2E"/>
-          <w:sz w:val="22"/>
-          <w:szCs w:val="22"/>
-        </w:rPr>
-        <w:t xml:space="preserve"> for details.</w:t>
-      </w:r>
-    </w:p>
-    <w:p>
-      <w:pPr>
-        <w:spacing w:after="160" w:line="300"/>
-      </w:pPr>
-      <w:r>
-        <w:rPr>
-          <w:rFonts w:ascii="DM Sans" w:cs="DM Sans" w:eastAsia="DM Sans" w:hAnsi="DM Sans"/>
-          <w:b/>
-          <w:bCs/>
-          <w:color w:val="1A1A2E"/>
-          <w:sz w:val="22"/>
-          <w:szCs w:val="22"/>
-        </w:rPr>
-        <w:t xml:space="preserve">libmysofa: </w:t>
-      </w:r>
-      <w:r>
-        <w:rPr>
-          <w:rFonts w:ascii="DM Sans" w:cs="DM Sans" w:eastAsia="DM Sans" w:hAnsi="DM Sans"/>
-          <w:color w:val="1A1A2E"/>
-          <w:sz w:val="22"/>
-          <w:szCs w:val="22"/>
-        </w:rPr>
-        <w:t xml:space="preserve">Copyright (c) 2016-2024 Christian Hoene, Symonics GmbH. Redistribution and use in source and binary forms, with or without modification, are permitted provided that the following conditions are met: (1) Redistributions of source code must retain the above copyright notice, this list of conditions, and the following disclaimer. (2) Redistributions in binary form must reproduce the above copyright notice, this list of conditions, and the following disclaimer in the documentation and/or other materials provided with the distribution. (3) Neither the name of Symonics GmbH nor the names of its contributors may be used to endorse or promote products derived from this software without specific prior written permission.</w:t>
-      </w:r>
-    </w:p>
-    <w:p>
-      <w:pPr>
-        <w:spacing w:after="160" w:line="300"/>
-      </w:pPr>
-      <w:r>
-        <w:rPr>
-          <w:rFonts w:ascii="DM Sans" w:cs="DM Sans" w:eastAsia="DM Sans" w:hAnsi="DM Sans"/>
-          <w:b/>
-          <w:bCs/>
-          <w:color w:val="1A1A2E"/>
-          <w:sz w:val="22"/>
-          <w:szCs w:val="22"/>
-        </w:rPr>
-        <w:t xml:space="preserve">zlib: </w:t>
-      </w:r>
-      <w:r>
-        <w:rPr>
-          <w:rFonts w:ascii="DM Sans" w:cs="DM Sans" w:eastAsia="DM Sans" w:hAnsi="DM Sans"/>
-          <w:color w:val="1A1A2E"/>
-          <w:sz w:val="22"/>
-          <w:szCs w:val="22"/>
-        </w:rPr>
-        <w:t xml:space="preserve">Copyright (c) 1995-2024 Jean-loup Gailly and Mark Adler. This software is provided 'as-is', without any express or implied warranty. Permission is granted to anyone to use this software for any purpose, including commercial applications, and to alter it and redistribute it freely, subject to the following restrictions: (1) The origin of this software must not be misrepresented. (2) Altered source versions must be plainly marked as such. (3) This notice may not be removed or altered from any source distribution.</w:t>
-      </w:r>
-    </w:p>
-    <w:p>
-      <w:pPr>
-        <w:pStyle w:val="Heading2"/>
-        <w:spacing w:after="180" w:before="280"/>
-      </w:pPr>
-      <w:r>
-        <w:rPr>
-          <w:rFonts w:ascii="DM Sans" w:cs="DM Sans" w:eastAsia="DM Sans" w:hAnsi="DM Sans"/>
-          <w:b/>
-          <w:bCs/>
-          <w:color w:val="64748B"/>
-          <w:sz w:val="30"/>
-          <w:szCs w:val="30"/>
-        </w:rPr>
-        <w:t xml:space="preserve">11.2</w:t>
-      </w:r>
-      <w:r>
-        <w:rPr>
-          <w:rFonts w:ascii="DM Sans" w:cs="DM Sans" w:eastAsia="DM Sans" w:hAnsi="DM Sans"/>
-          <w:b/>
-          <w:bCs/>
-          <w:color w:val="001633"/>
-          <w:sz w:val="30"/>
-          <w:szCs w:val="30"/>
-        </w:rPr>
-        <w:t xml:space="preserve">  HRTF Datasets</w:t>
-      </w:r>
-    </w:p>
-    <w:p>
-      <w:pPr>
-        <w:spacing w:after="160" w:line="300"/>
-      </w:pPr>
-      <w:r>
-        <w:rPr>
-          <w:rFonts w:ascii="DM Sans" w:cs="DM Sans" w:eastAsia="DM Sans" w:hAnsi="DM Sans"/>
-          <w:color w:val="1A1A2E"/>
-          <w:sz w:val="22"/>
-          <w:szCs w:val="22"/>
-        </w:rPr>
-        <w:t xml:space="preserve">The following Head-Related Transfer Function datasets are embedded in the plugin for binaural spatialization:</w:t>
-      </w:r>
-    </w:p>
-    <w:tbl>
-      <w:tblPr>
-        <w:tblW w:type="dxa" w:w="9026"/>
-        <w:tblBorders>
-          <w:top w:val="single" w:color="auto" w:sz="4"/>
-          <w:left w:val="single" w:color="auto" w:sz="4"/>
-          <w:bottom w:val="single" w:color="auto" w:sz="4"/>
-          <w:right w:val="single" w:color="auto" w:sz="4"/>
-          <w:insideH w:val="single" w:color="auto" w:sz="4"/>
-          <w:insideV w:val="single" w:color="auto" w:sz="4"/>
-        </w:tblBorders>
-      </w:tblPr>
-      <w:tblGrid>
-        <w:gridCol w:w="1800"/>
-        <w:gridCol w:w="2400"/>
-        <w:gridCol w:w="1600"/>
-        <w:gridCol w:w="3226"/>
-      </w:tblGrid>
-      <w:tr>
-        <w:trPr>
-          <w:tblHeader/>
-        </w:trPr>
-        <w:tc>
-          <w:tcPr>
-            <w:tcW w:type="dxa" w:w="1800"/>
-            <w:tcBorders>
-              <w:top w:val="single" w:color="E2E8F0" w:sz="1"/>
-              <w:left w:val="single" w:color="E2E8F0" w:sz="1"/>
-              <w:bottom w:val="single" w:color="E2E8F0" w:sz="1"/>
-              <w:right w:val="single" w:color="E2E8F0" w:sz="1"/>
-            </w:tcBorders>
-            <w:shd w:fill="001633" w:val="clear"/>
-            <w:tcMar>
-              <w:top w:type="dxa" w:w="60"/>
-              <w:left w:type="dxa" w:w="100"/>
-              <w:bottom w:type="dxa" w:w="60"/>
-              <w:right w:type="dxa" w:w="100"/>
-            </w:tcMar>
-          </w:tcPr>
-          <w:p>
-            <w:r>
-              <w:rPr>
-                <w:rFonts w:ascii="DM Sans" w:cs="DM Sans" w:eastAsia="DM Sans" w:hAnsi="DM Sans"/>
-                <w:b/>
-                <w:bCs/>
-                <w:color w:val="FFFFFF"/>
-                <w:sz w:val="18"/>
-                <w:szCs w:val="18"/>
-              </w:rPr>
-              <w:t xml:space="preserve">Profile Name</w:t>
-            </w:r>
-          </w:p>
-        </w:tc>
-        <w:tc>
-          <w:tcPr>
-            <w:tcW w:type="dxa" w:w="2400"/>
-            <w:tcBorders>
-              <w:top w:val="single" w:color="E2E8F0" w:sz="1"/>
-              <w:left w:val="single" w:color="E2E8F0" w:sz="1"/>
-              <w:bottom w:val="single" w:color="E2E8F0" w:sz="1"/>
-              <w:right w:val="single" w:color="E2E8F0" w:sz="1"/>
-            </w:tcBorders>
-            <w:shd w:fill="001633" w:val="clear"/>
-            <w:tcMar>
-              <w:top w:type="dxa" w:w="60"/>
-              <w:left w:type="dxa" w:w="100"/>
-              <w:bottom w:type="dxa" w:w="60"/>
-              <w:right w:type="dxa" w:w="100"/>
-            </w:tcMar>
-          </w:tcPr>
-          <w:p>
-            <w:r>
-              <w:rPr>
-                <w:rFonts w:ascii="DM Sans" w:cs="DM Sans" w:eastAsia="DM Sans" w:hAnsi="DM Sans"/>
-                <w:b/>
-                <w:bCs/>
-                <w:color w:val="FFFFFF"/>
-                <w:sz w:val="18"/>
-                <w:szCs w:val="18"/>
-              </w:rPr>
-              <w:t xml:space="preserve">Dataset</w:t>
-            </w:r>
-          </w:p>
-        </w:tc>
-        <w:tc>
-          <w:tcPr>
-            <w:tcW w:type="dxa" w:w="1600"/>
-            <w:tcBorders>
-              <w:top w:val="single" w:color="E2E8F0" w:sz="1"/>
-              <w:left w:val="single" w:color="E2E8F0" w:sz="1"/>
-              <w:bottom w:val="single" w:color="E2E8F0" w:sz="1"/>
-              <w:right w:val="single" w:color="E2E8F0" w:sz="1"/>
-            </w:tcBorders>
-            <w:shd w:fill="001633" w:val="clear"/>
-            <w:tcMar>
-              <w:top w:type="dxa" w:w="60"/>
-              <w:left w:type="dxa" w:w="100"/>
-              <w:bottom w:type="dxa" w:w="60"/>
-              <w:right w:type="dxa" w:w="100"/>
-            </w:tcMar>
-          </w:tcPr>
-          <w:p>
-            <w:r>
-              <w:rPr>
-                <w:rFonts w:ascii="DM Sans" w:cs="DM Sans" w:eastAsia="DM Sans" w:hAnsi="DM Sans"/>
-                <w:b/>
-                <w:bCs/>
-                <w:color w:val="FFFFFF"/>
-                <w:sz w:val="18"/>
-                <w:szCs w:val="18"/>
-              </w:rPr>
-              <w:t xml:space="preserve">License</w:t>
-            </w:r>
-          </w:p>
-        </w:tc>
-        <w:tc>
-          <w:tcPr>
-            <w:tcW w:type="dxa" w:w="3226"/>
-            <w:tcBorders>
-              <w:top w:val="single" w:color="E2E8F0" w:sz="1"/>
-              <w:left w:val="single" w:color="E2E8F0" w:sz="1"/>
-              <w:bottom w:val="single" w:color="E2E8F0" w:sz="1"/>
-              <w:right w:val="single" w:color="E2E8F0" w:sz="1"/>
-            </w:tcBorders>
-            <w:shd w:fill="001633" w:val="clear"/>
-            <w:tcMar>
-              <w:top w:type="dxa" w:w="60"/>
-              <w:left w:type="dxa" w:w="100"/>
-              <w:bottom w:type="dxa" w:w="60"/>
-              <w:right w:type="dxa" w:w="100"/>
-            </w:tcMar>
-          </w:tcPr>
-          <w:p>
-            <w:r>
-              <w:rPr>
-                <w:rFonts w:ascii="DM Sans" w:cs="DM Sans" w:eastAsia="DM Sans" w:hAnsi="DM Sans"/>
-                <w:b/>
-                <w:bCs/>
-                <w:color w:val="FFFFFF"/>
-                <w:sz w:val="18"/>
-                <w:szCs w:val="18"/>
-              </w:rPr>
-              <w:t xml:space="preserve">Source</w:t>
-            </w:r>
-          </w:p>
-        </w:tc>
-      </w:tr>
-      <w:tr>
-        <w:tc>
-          <w:tcPr>
-            <w:tcW w:type="dxa" w:w="1800"/>
-            <w:tcBorders>
-              <w:top w:val="single" w:color="E2E8F0" w:sz="1"/>
-              <w:left w:val="single" w:color="E2E8F0" w:sz="1"/>
-              <w:bottom w:val="single" w:color="E2E8F0" w:sz="1"/>
-              <w:right w:val="single" w:color="E2E8F0" w:sz="1"/>
-            </w:tcBorders>
-            <w:tcMar>
-              <w:top w:type="dxa" w:w="50"/>
-              <w:left w:type="dxa" w:w="100"/>
-              <w:bottom w:type="dxa" w:w="50"/>
-              <w:right w:type="dxa" w:w="100"/>
-            </w:tcMar>
-          </w:tcPr>
-          <w:p>
-            <w:r>
-              <w:rPr>
-                <w:rFonts w:ascii="DM Sans" w:cs="DM Sans" w:eastAsia="DM Sans" w:hAnsi="DM Sans"/>
-                <w:color w:val="1A1A2E"/>
-                <w:sz w:val="18"/>
-                <w:szCs w:val="18"/>
-              </w:rPr>
-              <w:t xml:space="preserve">Studio Reference</w:t>
-            </w:r>
-          </w:p>
-        </w:tc>
-        <w:tc>
-          <w:tcPr>
-            <w:tcW w:type="dxa" w:w="2400"/>
-            <w:tcBorders>
-              <w:top w:val="single" w:color="E2E8F0" w:sz="1"/>
-              <w:left w:val="single" w:color="E2E8F0" w:sz="1"/>
-              <w:bottom w:val="single" w:color="E2E8F0" w:sz="1"/>
-              <w:right w:val="single" w:color="E2E8F0" w:sz="1"/>
-            </w:tcBorders>
-            <w:tcMar>
-              <w:top w:type="dxa" w:w="50"/>
-              <w:left w:type="dxa" w:w="100"/>
-              <w:bottom w:type="dxa" w:w="50"/>
-              <w:right w:type="dxa" w:w="100"/>
-            </w:tcMar>
-          </w:tcPr>
-          <w:p>
-            <w:r>
-              <w:rPr>
-                <w:rFonts w:ascii="DM Sans" w:cs="DM Sans" w:eastAsia="DM Sans" w:hAnsi="DM Sans"/>
-                <w:color w:val="1A1A2E"/>
-                <w:sz w:val="18"/>
-                <w:szCs w:val="18"/>
-              </w:rPr>
-              <w:t xml:space="preserve">MIT KEMAR Large Pinna</w:t>
-            </w:r>
-          </w:p>
-        </w:tc>
-        <w:tc>
-          <w:tcPr>
-            <w:tcW w:type="dxa" w:w="1600"/>
-            <w:tcBorders>
-              <w:top w:val="single" w:color="E2E8F0" w:sz="1"/>
-              <w:left w:val="single" w:color="E2E8F0" w:sz="1"/>
-              <w:bottom w:val="single" w:color="E2E8F0" w:sz="1"/>
-              <w:right w:val="single" w:color="E2E8F0" w:sz="1"/>
-            </w:tcBorders>
-            <w:tcMar>
-              <w:top w:type="dxa" w:w="50"/>
-              <w:left w:type="dxa" w:w="100"/>
-              <w:bottom w:type="dxa" w:w="50"/>
-              <w:right w:type="dxa" w:w="100"/>
-            </w:tcMar>
-          </w:tcPr>
-          <w:p>
-            <w:r>
-              <w:rPr>
-                <w:rFonts w:ascii="DM Sans" w:cs="DM Sans" w:eastAsia="DM Sans" w:hAnsi="DM Sans"/>
-                <w:color w:val="1A1A2E"/>
-                <w:sz w:val="18"/>
-                <w:szCs w:val="18"/>
-              </w:rPr>
-              <w:t xml:space="preserve">MIT</w:t>
-            </w:r>
-          </w:p>
-        </w:tc>
-        <w:tc>
-          <w:tcPr>
-            <w:tcW w:type="dxa" w:w="3226"/>
-            <w:tcBorders>
-              <w:top w:val="single" w:color="E2E8F0" w:sz="1"/>
-              <w:left w:val="single" w:color="E2E8F0" w:sz="1"/>
-              <w:bottom w:val="single" w:color="E2E8F0" w:sz="1"/>
-              <w:right w:val="single" w:color="E2E8F0" w:sz="1"/>
-            </w:tcBorders>
-            <w:tcMar>
-              <w:top w:type="dxa" w:w="50"/>
-              <w:left w:type="dxa" w:w="100"/>
-              <w:bottom w:type="dxa" w:w="50"/>
-              <w:right w:type="dxa" w:w="100"/>
-            </w:tcMar>
-          </w:tcPr>
-          <w:p>
-            <w:r>
-              <w:rPr>
-                <w:rFonts w:ascii="DM Sans" w:cs="DM Sans" w:eastAsia="DM Sans" w:hAnsi="DM Sans"/>
-                <w:color w:val="1A1A2E"/>
-                <w:sz w:val="18"/>
-                <w:szCs w:val="18"/>
-              </w:rPr>
-              <w:t xml:space="preserve">MIT Media Lab</w:t>
-            </w:r>
-          </w:p>
-        </w:tc>
-      </w:tr>
-      <w:tr>
-        <w:tc>
-          <w:tcPr>
-            <w:tcW w:type="dxa" w:w="1800"/>
-            <w:tcBorders>
-              <w:top w:val="single" w:color="E2E8F0" w:sz="1"/>
-              <w:left w:val="single" w:color="E2E8F0" w:sz="1"/>
-              <w:bottom w:val="single" w:color="E2E8F0" w:sz="1"/>
-              <w:right w:val="single" w:color="E2E8F0" w:sz="1"/>
-            </w:tcBorders>
-            <w:shd w:fill="F8FAFC" w:val="clear"/>
-            <w:tcMar>
-              <w:top w:type="dxa" w:w="50"/>
-              <w:left w:type="dxa" w:w="100"/>
-              <w:bottom w:type="dxa" w:w="50"/>
-              <w:right w:type="dxa" w:w="100"/>
-            </w:tcMar>
-          </w:tcPr>
-          <w:p>
-            <w:r>
-              <w:rPr>
-                <w:rFonts w:ascii="DM Sans" w:cs="DM Sans" w:eastAsia="DM Sans" w:hAnsi="DM Sans"/>
-                <w:color w:val="1A1A2E"/>
-                <w:sz w:val="18"/>
-                <w:szCs w:val="18"/>
-              </w:rPr>
-              <w:t xml:space="preserve">Immersive</w:t>
-            </w:r>
-          </w:p>
-        </w:tc>
-        <w:tc>
-          <w:tcPr>
-            <w:tcW w:type="dxa" w:w="2400"/>
-            <w:tcBorders>
-              <w:top w:val="single" w:color="E2E8F0" w:sz="1"/>
-              <w:left w:val="single" w:color="E2E8F0" w:sz="1"/>
-              <w:bottom w:val="single" w:color="E2E8F0" w:sz="1"/>
-              <w:right w:val="single" w:color="E2E8F0" w:sz="1"/>
-            </w:tcBorders>
-            <w:shd w:fill="F8FAFC" w:val="clear"/>
-            <w:tcMar>
-              <w:top w:type="dxa" w:w="50"/>
-              <w:left w:type="dxa" w:w="100"/>
-              <w:bottom w:type="dxa" w:w="50"/>
-              <w:right w:type="dxa" w:w="100"/>
-            </w:tcMar>
-          </w:tcPr>
-          <w:p>
-            <w:r>
-              <w:rPr>
-                <w:rFonts w:ascii="DM Sans" w:cs="DM Sans" w:eastAsia="DM Sans" w:hAnsi="DM Sans"/>
-                <w:color w:val="1A1A2E"/>
-                <w:sz w:val="18"/>
-                <w:szCs w:val="18"/>
-              </w:rPr>
-              <w:t xml:space="preserve">SADIE II D2 KU100</w:t>
-            </w:r>
-          </w:p>
-        </w:tc>
-        <w:tc>
-          <w:tcPr>
-            <w:tcW w:type="dxa" w:w="1600"/>
-            <w:tcBorders>
-              <w:top w:val="single" w:color="E2E8F0" w:sz="1"/>
-              <w:left w:val="single" w:color="E2E8F0" w:sz="1"/>
-              <w:bottom w:val="single" w:color="E2E8F0" w:sz="1"/>
-              <w:right w:val="single" w:color="E2E8F0" w:sz="1"/>
-            </w:tcBorders>
-            <w:shd w:fill="F8FAFC" w:val="clear"/>
-            <w:tcMar>
-              <w:top w:type="dxa" w:w="50"/>
-              <w:left w:type="dxa" w:w="100"/>
-              <w:bottom w:type="dxa" w:w="50"/>
-              <w:right w:type="dxa" w:w="100"/>
-            </w:tcMar>
-          </w:tcPr>
-          <w:p>
-            <w:r>
-              <w:rPr>
-                <w:rFonts w:ascii="DM Sans" w:cs="DM Sans" w:eastAsia="DM Sans" w:hAnsi="DM Sans"/>
-                <w:color w:val="1A1A2E"/>
-                <w:sz w:val="18"/>
-                <w:szCs w:val="18"/>
-              </w:rPr>
-              <w:t xml:space="preserve">Apache 2.0</w:t>
-            </w:r>
-          </w:p>
-        </w:tc>
-        <w:tc>
-          <w:tcPr>
-            <w:tcW w:type="dxa" w:w="3226"/>
-            <w:tcBorders>
-              <w:top w:val="single" w:color="E2E8F0" w:sz="1"/>
-              <w:left w:val="single" w:color="E2E8F0" w:sz="1"/>
-              <w:bottom w:val="single" w:color="E2E8F0" w:sz="1"/>
-              <w:right w:val="single" w:color="E2E8F0" w:sz="1"/>
-            </w:tcBorders>
-            <w:shd w:fill="F8FAFC" w:val="clear"/>
-            <w:tcMar>
-              <w:top w:type="dxa" w:w="50"/>
-              <w:left w:type="dxa" w:w="100"/>
-              <w:bottom w:type="dxa" w:w="50"/>
-              <w:right w:type="dxa" w:w="100"/>
-            </w:tcMar>
-          </w:tcPr>
-          <w:p>
-            <w:r>
-              <w:rPr>
-                <w:rFonts w:ascii="DM Sans" w:cs="DM Sans" w:eastAsia="DM Sans" w:hAnsi="DM Sans"/>
-                <w:color w:val="1A1A2E"/>
-                <w:sz w:val="18"/>
-                <w:szCs w:val="18"/>
-              </w:rPr>
-              <w:t xml:space="preserve">University of York</w:t>
-            </w:r>
-          </w:p>
-        </w:tc>
-      </w:tr>
-      <w:tr>
-        <w:tc>
-          <w:tcPr>
-            <w:tcW w:type="dxa" w:w="1800"/>
-            <w:tcBorders>
-              <w:top w:val="single" w:color="E2E8F0" w:sz="1"/>
-              <w:left w:val="single" w:color="E2E8F0" w:sz="1"/>
-              <w:bottom w:val="single" w:color="E2E8F0" w:sz="1"/>
-              <w:right w:val="single" w:color="E2E8F0" w:sz="1"/>
-            </w:tcBorders>
-            <w:tcMar>
-              <w:top w:type="dxa" w:w="50"/>
-              <w:left w:type="dxa" w:w="100"/>
-              <w:bottom w:type="dxa" w:w="50"/>
-              <w:right w:type="dxa" w:w="100"/>
-            </w:tcMar>
-          </w:tcPr>
-          <w:p>
-            <w:r>
-              <w:rPr>
-                <w:rFonts w:ascii="DM Sans" w:cs="DM Sans" w:eastAsia="DM Sans" w:hAnsi="DM Sans"/>
-                <w:color w:val="1A1A2E"/>
-                <w:sz w:val="18"/>
-                <w:szCs w:val="18"/>
-              </w:rPr>
-              <w:t xml:space="preserve">Natural</w:t>
-            </w:r>
-          </w:p>
-        </w:tc>
-        <w:tc>
-          <w:tcPr>
-            <w:tcW w:type="dxa" w:w="2400"/>
-            <w:tcBorders>
-              <w:top w:val="single" w:color="E2E8F0" w:sz="1"/>
-              <w:left w:val="single" w:color="E2E8F0" w:sz="1"/>
-              <w:bottom w:val="single" w:color="E2E8F0" w:sz="1"/>
-              <w:right w:val="single" w:color="E2E8F0" w:sz="1"/>
-            </w:tcBorders>
-            <w:tcMar>
-              <w:top w:type="dxa" w:w="50"/>
-              <w:left w:type="dxa" w:w="100"/>
-              <w:bottom w:type="dxa" w:w="50"/>
-              <w:right w:type="dxa" w:w="100"/>
-            </w:tcMar>
-          </w:tcPr>
-          <w:p>
-            <w:r>
-              <w:rPr>
-                <w:rFonts w:ascii="DM Sans" w:cs="DM Sans" w:eastAsia="DM Sans" w:hAnsi="DM Sans"/>
-                <w:color w:val="1A1A2E"/>
-                <w:sz w:val="18"/>
-                <w:szCs w:val="18"/>
-              </w:rPr>
-              <w:t xml:space="preserve">CIPIC Subject 003</w:t>
-            </w:r>
-          </w:p>
-        </w:tc>
-        <w:tc>
-          <w:tcPr>
-            <w:tcW w:type="dxa" w:w="1600"/>
-            <w:tcBorders>
-              <w:top w:val="single" w:color="E2E8F0" w:sz="1"/>
-              <w:left w:val="single" w:color="E2E8F0" w:sz="1"/>
-              <w:bottom w:val="single" w:color="E2E8F0" w:sz="1"/>
-              <w:right w:val="single" w:color="E2E8F0" w:sz="1"/>
-            </w:tcBorders>
-            <w:tcMar>
-              <w:top w:type="dxa" w:w="50"/>
-              <w:left w:type="dxa" w:w="100"/>
-              <w:bottom w:type="dxa" w:w="50"/>
-              <w:right w:type="dxa" w:w="100"/>
-            </w:tcMar>
-          </w:tcPr>
-          <w:p>
-            <w:r>
-              <w:rPr>
-                <w:rFonts w:ascii="DM Sans" w:cs="DM Sans" w:eastAsia="DM Sans" w:hAnsi="DM Sans"/>
-                <w:color w:val="1A1A2E"/>
-                <w:sz w:val="18"/>
-                <w:szCs w:val="18"/>
-              </w:rPr>
-              <w:t xml:space="preserve">Public Domain</w:t>
-            </w:r>
-          </w:p>
-        </w:tc>
-        <w:tc>
-          <w:tcPr>
-            <w:tcW w:type="dxa" w:w="3226"/>
-            <w:tcBorders>
-              <w:top w:val="single" w:color="E2E8F0" w:sz="1"/>
-              <w:left w:val="single" w:color="E2E8F0" w:sz="1"/>
-              <w:bottom w:val="single" w:color="E2E8F0" w:sz="1"/>
-              <w:right w:val="single" w:color="E2E8F0" w:sz="1"/>
-            </w:tcBorders>
-            <w:tcMar>
-              <w:top w:type="dxa" w:w="50"/>
-              <w:left w:type="dxa" w:w="100"/>
-              <w:bottom w:type="dxa" w:w="50"/>
-              <w:right w:type="dxa" w:w="100"/>
-            </w:tcMar>
-          </w:tcPr>
-          <w:p>
-            <w:r>
-              <w:rPr>
-                <w:rFonts w:ascii="DM Sans" w:cs="DM Sans" w:eastAsia="DM Sans" w:hAnsi="DM Sans"/>
-                <w:color w:val="1A1A2E"/>
-                <w:sz w:val="18"/>
-                <w:szCs w:val="18"/>
-              </w:rPr>
-              <w:t xml:space="preserve">UC Davis CIPIC Lab</w:t>
-            </w:r>
-          </w:p>
-        </w:tc>
-      </w:tr>
-      <w:tr>
-        <w:tc>
-          <w:tcPr>
-            <w:tcW w:type="dxa" w:w="1800"/>
-            <w:tcBorders>
-              <w:top w:val="single" w:color="E2E8F0" w:sz="1"/>
-              <w:left w:val="single" w:color="E2E8F0" w:sz="1"/>
-              <w:bottom w:val="single" w:color="E2E8F0" w:sz="1"/>
-              <w:right w:val="single" w:color="E2E8F0" w:sz="1"/>
-            </w:tcBorders>
-            <w:shd w:fill="F8FAFC" w:val="clear"/>
-            <w:tcMar>
-              <w:top w:type="dxa" w:w="50"/>
-              <w:left w:type="dxa" w:w="100"/>
-              <w:bottom w:type="dxa" w:w="50"/>
-              <w:right w:type="dxa" w:w="100"/>
-            </w:tcMar>
-          </w:tcPr>
-          <w:p>
-            <w:r>
-              <w:rPr>
-                <w:rFonts w:ascii="DM Sans" w:cs="DM Sans" w:eastAsia="DM Sans" w:hAnsi="DM Sans"/>
-                <w:color w:val="1A1A2E"/>
-                <w:sz w:val="18"/>
-                <w:szCs w:val="18"/>
-              </w:rPr>
-              <w:t xml:space="preserve">Precise</w:t>
-            </w:r>
-          </w:p>
-        </w:tc>
-        <w:tc>
-          <w:tcPr>
-            <w:tcW w:type="dxa" w:w="2400"/>
-            <w:tcBorders>
-              <w:top w:val="single" w:color="E2E8F0" w:sz="1"/>
-              <w:left w:val="single" w:color="E2E8F0" w:sz="1"/>
-              <w:bottom w:val="single" w:color="E2E8F0" w:sz="1"/>
-              <w:right w:val="single" w:color="E2E8F0" w:sz="1"/>
-            </w:tcBorders>
-            <w:shd w:fill="F8FAFC" w:val="clear"/>
-            <w:tcMar>
-              <w:top w:type="dxa" w:w="50"/>
-              <w:left w:type="dxa" w:w="100"/>
-              <w:bottom w:type="dxa" w:w="50"/>
-              <w:right w:type="dxa" w:w="100"/>
-            </w:tcMar>
-          </w:tcPr>
-          <w:p>
-            <w:r>
-              <w:rPr>
-                <w:rFonts w:ascii="DM Sans" w:cs="DM Sans" w:eastAsia="DM Sans" w:hAnsi="DM Sans"/>
-                <w:color w:val="1A1A2E"/>
-                <w:sz w:val="18"/>
-                <w:szCs w:val="18"/>
-              </w:rPr>
-              <w:t xml:space="preserve">HUTUBS PP2</w:t>
-            </w:r>
-          </w:p>
-        </w:tc>
-        <w:tc>
-          <w:tcPr>
-            <w:tcW w:type="dxa" w:w="1600"/>
-            <w:tcBorders>
-              <w:top w:val="single" w:color="E2E8F0" w:sz="1"/>
-              <w:left w:val="single" w:color="E2E8F0" w:sz="1"/>
-              <w:bottom w:val="single" w:color="E2E8F0" w:sz="1"/>
-              <w:right w:val="single" w:color="E2E8F0" w:sz="1"/>
-            </w:tcBorders>
-            <w:shd w:fill="F8FAFC" w:val="clear"/>
-            <w:tcMar>
-              <w:top w:type="dxa" w:w="50"/>
-              <w:left w:type="dxa" w:w="100"/>
-              <w:bottom w:type="dxa" w:w="50"/>
-              <w:right w:type="dxa" w:w="100"/>
-            </w:tcMar>
-          </w:tcPr>
-          <w:p>
-            <w:r>
-              <w:rPr>
-                <w:rFonts w:ascii="DM Sans" w:cs="DM Sans" w:eastAsia="DM Sans" w:hAnsi="DM Sans"/>
-                <w:color w:val="1A1A2E"/>
-                <w:sz w:val="18"/>
-                <w:szCs w:val="18"/>
-              </w:rPr>
-              <w:t xml:space="preserve">CC BY 4.0</w:t>
-            </w:r>
-          </w:p>
-        </w:tc>
-        <w:tc>
-          <w:tcPr>
-            <w:tcW w:type="dxa" w:w="3226"/>
-            <w:tcBorders>
-              <w:top w:val="single" w:color="E2E8F0" w:sz="1"/>
-              <w:left w:val="single" w:color="E2E8F0" w:sz="1"/>
-              <w:bottom w:val="single" w:color="E2E8F0" w:sz="1"/>
-              <w:right w:val="single" w:color="E2E8F0" w:sz="1"/>
-            </w:tcBorders>
-            <w:shd w:fill="F8FAFC" w:val="clear"/>
-            <w:tcMar>
-              <w:top w:type="dxa" w:w="50"/>
-              <w:left w:type="dxa" w:w="100"/>
-              <w:bottom w:type="dxa" w:w="50"/>
-              <w:right w:type="dxa" w:w="100"/>
-            </w:tcMar>
-          </w:tcPr>
-          <w:p>
-            <w:r>
-              <w:rPr>
-                <w:rFonts w:ascii="DM Sans" w:cs="DM Sans" w:eastAsia="DM Sans" w:hAnsi="DM Sans"/>
-                <w:color w:val="1A1A2E"/>
-                <w:sz w:val="18"/>
-                <w:szCs w:val="18"/>
-              </w:rPr>
-              <w:t xml:space="preserve">TU Berlin</w:t>
-            </w:r>
-          </w:p>
-        </w:tc>
-      </w:tr>
-      <w:tr>
-        <w:tc>
-          <w:tcPr>
-            <w:tcW w:type="dxa" w:w="1800"/>
-            <w:tcBorders>
-              <w:top w:val="single" w:color="E2E8F0" w:sz="1"/>
-              <w:left w:val="single" w:color="E2E8F0" w:sz="1"/>
-              <w:bottom w:val="single" w:color="E2E8F0" w:sz="1"/>
-              <w:right w:val="single" w:color="E2E8F0" w:sz="1"/>
-            </w:tcBorders>
-            <w:tcMar>
-              <w:top w:type="dxa" w:w="50"/>
-              <w:left w:type="dxa" w:w="100"/>
-              <w:bottom w:type="dxa" w:w="50"/>
-              <w:right w:type="dxa" w:w="100"/>
-            </w:tcMar>
-          </w:tcPr>
-          <w:p>
-            <w:r>
-              <w:rPr>
-                <w:rFonts w:ascii="DM Sans" w:cs="DM Sans" w:eastAsia="DM Sans" w:hAnsi="DM Sans"/>
-                <w:color w:val="1A1A2E"/>
-                <w:sz w:val="18"/>
-                <w:szCs w:val="18"/>
-              </w:rPr>
-              <w:t xml:space="preserve">Spatial</w:t>
-            </w:r>
-          </w:p>
-        </w:tc>
-        <w:tc>
-          <w:tcPr>
-            <w:tcW w:type="dxa" w:w="2400"/>
-            <w:tcBorders>
-              <w:top w:val="single" w:color="E2E8F0" w:sz="1"/>
-              <w:left w:val="single" w:color="E2E8F0" w:sz="1"/>
-              <w:bottom w:val="single" w:color="E2E8F0" w:sz="1"/>
-              <w:right w:val="single" w:color="E2E8F0" w:sz="1"/>
-            </w:tcBorders>
-            <w:tcMar>
-              <w:top w:type="dxa" w:w="50"/>
-              <w:left w:type="dxa" w:w="100"/>
-              <w:bottom w:type="dxa" w:w="50"/>
-              <w:right w:type="dxa" w:w="100"/>
-            </w:tcMar>
-          </w:tcPr>
-          <w:p>
-            <w:r>
-              <w:rPr>
-                <w:rFonts w:ascii="DM Sans" w:cs="DM Sans" w:eastAsia="DM Sans" w:hAnsi="DM Sans"/>
-                <w:color w:val="1A1A2E"/>
-                <w:sz w:val="18"/>
-                <w:szCs w:val="18"/>
-              </w:rPr>
-              <w:t xml:space="preserve">Bernschuetz KU100 2°</w:t>
-            </w:r>
-          </w:p>
-        </w:tc>
-        <w:tc>
-          <w:tcPr>
-            <w:tcW w:type="dxa" w:w="1600"/>
-            <w:tcBorders>
-              <w:top w:val="single" w:color="E2E8F0" w:sz="1"/>
-              <w:left w:val="single" w:color="E2E8F0" w:sz="1"/>
-              <w:bottom w:val="single" w:color="E2E8F0" w:sz="1"/>
-              <w:right w:val="single" w:color="E2E8F0" w:sz="1"/>
-            </w:tcBorders>
-            <w:tcMar>
-              <w:top w:type="dxa" w:w="50"/>
-              <w:left w:type="dxa" w:w="100"/>
-              <w:bottom w:type="dxa" w:w="50"/>
-              <w:right w:type="dxa" w:w="100"/>
-            </w:tcMar>
-          </w:tcPr>
-          <w:p>
-            <w:r>
-              <w:rPr>
-                <w:rFonts w:ascii="DM Sans" w:cs="DM Sans" w:eastAsia="DM Sans" w:hAnsi="DM Sans"/>
-                <w:color w:val="1A1A2E"/>
-                <w:sz w:val="18"/>
-                <w:szCs w:val="18"/>
-              </w:rPr>
-              <w:t xml:space="preserve">CC BY 3.0</w:t>
-            </w:r>
-          </w:p>
-        </w:tc>
-        <w:tc>
-          <w:tcPr>
-            <w:tcW w:type="dxa" w:w="3226"/>
-            <w:tcBorders>
-              <w:top w:val="single" w:color="E2E8F0" w:sz="1"/>
-              <w:left w:val="single" w:color="E2E8F0" w:sz="1"/>
-              <w:bottom w:val="single" w:color="E2E8F0" w:sz="1"/>
-              <w:right w:val="single" w:color="E2E8F0" w:sz="1"/>
-            </w:tcBorders>
-            <w:tcMar>
-              <w:top w:type="dxa" w:w="50"/>
-              <w:left w:type="dxa" w:w="100"/>
-              <w:bottom w:type="dxa" w:w="50"/>
-              <w:right w:type="dxa" w:w="100"/>
-            </w:tcMar>
-          </w:tcPr>
-          <w:p>
-            <w:r>
-              <w:rPr>
-                <w:rFonts w:ascii="DM Sans" w:cs="DM Sans" w:eastAsia="DM Sans" w:hAnsi="DM Sans"/>
-                <w:color w:val="1A1A2E"/>
-                <w:sz w:val="18"/>
-                <w:szCs w:val="18"/>
-              </w:rPr>
-              <w:t xml:space="preserve">TH Köln</w:t>
-            </w:r>
-          </w:p>
-        </w:tc>
-      </w:tr>
-    </w:tbl>
-    <w:p>
-      <w:pPr>
-        <w:spacing w:after="160"/>
-      </w:pPr>
-    </w:p>
-    <w:p>
-      <w:pPr>
-        <w:spacing w:after="160" w:line="300"/>
-      </w:pPr>
-      <w:r>
-        <w:rPr>
-          <w:rFonts w:ascii="DM Sans" w:cs="DM Sans" w:eastAsia="DM Sans" w:hAnsi="DM Sans"/>
-          <w:b/>
-          <w:bCs/>
-          <w:color w:val="1A1A2E"/>
-          <w:sz w:val="22"/>
-          <w:szCs w:val="22"/>
-        </w:rPr>
-        <w:t xml:space="preserve">MIT KEMAR (MIT License): </w:t>
-      </w:r>
-      <w:r>
-        <w:rPr>
-          <w:rFonts w:ascii="DM Sans" w:cs="DM Sans" w:eastAsia="DM Sans" w:hAnsi="DM Sans"/>
-          <w:color w:val="1A1A2E"/>
-          <w:sz w:val="22"/>
-          <w:szCs w:val="22"/>
-        </w:rPr>
-        <w:t xml:space="preserve">Measurements by the MIT Media Lab. Permission is hereby granted, free of charge, to any person obtaining a copy of this data, to deal in the data without restriction, including without limitation the rights to use, copy, modify, merge, publish, distribute, sublicense, and/or sell copies, subject to the above copyright notice and this permission notice being included in all copies. See </w:t>
-      </w:r>
-      <w:hyperlink w:history="1" r:id="rIdts0gobjb3-gk1b38yhvpp">
-        <w:r>
-          <w:rPr>
-            <w:rFonts w:ascii="DM Sans" w:cs="DM Sans" w:eastAsia="DM Sans" w:hAnsi="DM Sans"/>
-            <w:color w:val="2563EB"/>
-            <w:sz w:val="22"/>
-            <w:szCs w:val="22"/>
-            <w:u w:val="single"/>
-          </w:rPr>
-          <w:t xml:space="preserve">sound.media.mit.edu/resources/KEMAR.html</w:t>
-        </w:r>
-      </w:hyperlink>
-      <w:r>
-        <w:rPr>
-          <w:rFonts w:ascii="DM Sans" w:cs="DM Sans" w:eastAsia="DM Sans" w:hAnsi="DM Sans"/>
-          <w:color w:val="1A1A2E"/>
-          <w:sz w:val="22"/>
-          <w:szCs w:val="22"/>
-        </w:rPr>
-        <w:t xml:space="preserve">.</w:t>
-      </w:r>
-    </w:p>
-    <w:p>
-      <w:pPr>
-        <w:spacing w:after="160" w:line="300"/>
-      </w:pPr>
-      <w:r>
-        <w:rPr>
-          <w:rFonts w:ascii="DM Sans" w:cs="DM Sans" w:eastAsia="DM Sans" w:hAnsi="DM Sans"/>
-          <w:b/>
-          <w:bCs/>
-          <w:color w:val="1A1A2E"/>
-          <w:sz w:val="22"/>
-          <w:szCs w:val="22"/>
-        </w:rPr>
-        <w:t xml:space="preserve">SADIE II (Apache 2.0): </w:t>
-      </w:r>
-      <w:r>
-        <w:rPr>
-          <w:rFonts w:ascii="DM Sans" w:cs="DM Sans" w:eastAsia="DM Sans" w:hAnsi="DM Sans"/>
-          <w:color w:val="1A1A2E"/>
-          <w:sz w:val="22"/>
-          <w:szCs w:val="22"/>
-        </w:rPr>
-        <w:t xml:space="preserve">Gavin Kearney, Tony Doyle, University of York. Licensed under the Apache License, Version 2.0. You may obtain a copy of the License at </w:t>
-      </w:r>
-      <w:hyperlink w:history="1" r:id="rIdqyvrjzfuhxp_rijumqe8d">
-        <w:r>
-          <w:rPr>
-            <w:rFonts w:ascii="DM Sans" w:cs="DM Sans" w:eastAsia="DM Sans" w:hAnsi="DM Sans"/>
-            <w:color w:val="2563EB"/>
-            <w:sz w:val="22"/>
-            <w:szCs w:val="22"/>
-            <w:u w:val="single"/>
-          </w:rPr>
-          <w:t xml:space="preserve">apache.org/licenses/LICENSE-2.0</w:t>
-        </w:r>
-      </w:hyperlink>
-      <w:r>
-        <w:rPr>
-          <w:rFonts w:ascii="DM Sans" w:cs="DM Sans" w:eastAsia="DM Sans" w:hAnsi="DM Sans"/>
-          <w:color w:val="1A1A2E"/>
-          <w:sz w:val="22"/>
-          <w:szCs w:val="22"/>
-        </w:rPr>
-        <w:t xml:space="preserve">. See </w:t>
-      </w:r>
-      <w:hyperlink w:history="1" r:id="rIdpoa-4aluad7igmfqtnz69">
-        <w:r>
-          <w:rPr>
-            <w:rFonts w:ascii="DM Sans" w:cs="DM Sans" w:eastAsia="DM Sans" w:hAnsi="DM Sans"/>
-            <w:color w:val="2563EB"/>
-            <w:sz w:val="22"/>
-            <w:szCs w:val="22"/>
-            <w:u w:val="single"/>
-          </w:rPr>
-          <w:t xml:space="preserve">york.ac.uk/sadie-project/database2</w:t>
-        </w:r>
-      </w:hyperlink>
-      <w:r>
-        <w:rPr>
-          <w:rFonts w:ascii="DM Sans" w:cs="DM Sans" w:eastAsia="DM Sans" w:hAnsi="DM Sans"/>
-          <w:color w:val="1A1A2E"/>
-          <w:sz w:val="22"/>
-          <w:szCs w:val="22"/>
-        </w:rPr>
-        <w:t xml:space="preserve">.</w:t>
-      </w:r>
-    </w:p>
-    <w:p>
-      <w:pPr>
-        <w:spacing w:after="160" w:line="300"/>
-      </w:pPr>
-      <w:r>
-        <w:rPr>
-          <w:rFonts w:ascii="DM Sans" w:cs="DM Sans" w:eastAsia="DM Sans" w:hAnsi="DM Sans"/>
-          <w:b/>
-          <w:bCs/>
-          <w:color w:val="1A1A2E"/>
-          <w:sz w:val="22"/>
-          <w:szCs w:val="22"/>
-        </w:rPr>
-        <w:t xml:space="preserve">CIPIC Subject 003 (Public Domain): </w:t>
-      </w:r>
-      <w:r>
-        <w:rPr>
-          <w:rFonts w:ascii="DM Sans" w:cs="DM Sans" w:eastAsia="DM Sans" w:hAnsi="DM Sans"/>
-          <w:color w:val="1A1A2E"/>
-          <w:sz w:val="22"/>
-          <w:szCs w:val="22"/>
-        </w:rPr>
-        <w:t xml:space="preserve">UC Davis CIPIC Interface Laboratory. This dataset is in the public domain with no restrictions on use. See </w:t>
-      </w:r>
-      <w:hyperlink w:history="1" r:id="rIdwmkjkqh0-wsfvvg__-bdz">
-        <w:r>
-          <w:rPr>
-            <w:rFonts w:ascii="DM Sans" w:cs="DM Sans" w:eastAsia="DM Sans" w:hAnsi="DM Sans"/>
-            <w:color w:val="2563EB"/>
-            <w:sz w:val="22"/>
-            <w:szCs w:val="22"/>
-            <w:u w:val="single"/>
-          </w:rPr>
-          <w:t xml:space="preserve">ucdavis.edu/cipic</w:t>
-        </w:r>
-      </w:hyperlink>
-      <w:r>
-        <w:rPr>
-          <w:rFonts w:ascii="DM Sans" w:cs="DM Sans" w:eastAsia="DM Sans" w:hAnsi="DM Sans"/>
-          <w:color w:val="1A1A2E"/>
-          <w:sz w:val="22"/>
-          <w:szCs w:val="22"/>
-        </w:rPr>
-        <w:t xml:space="preserve">.</w:t>
-      </w:r>
-    </w:p>
-    <w:p>
-      <w:pPr>
-        <w:spacing w:after="160" w:line="300"/>
-      </w:pPr>
-      <w:r>
-        <w:rPr>
-          <w:rFonts w:ascii="DM Sans" w:cs="DM Sans" w:eastAsia="DM Sans" w:hAnsi="DM Sans"/>
-          <w:b/>
-          <w:bCs/>
-          <w:color w:val="1A1A2E"/>
-          <w:sz w:val="22"/>
-          <w:szCs w:val="22"/>
-        </w:rPr>
-        <w:t xml:space="preserve">HUTUBS PP2 (CC BY 4.0): </w:t>
-      </w:r>
-      <w:r>
-        <w:rPr>
-          <w:rFonts w:ascii="DM Sans" w:cs="DM Sans" w:eastAsia="DM Sans" w:hAnsi="DM Sans"/>
-          <w:color w:val="1A1A2E"/>
-          <w:sz w:val="22"/>
-          <w:szCs w:val="22"/>
-        </w:rPr>
-        <w:t xml:space="preserve">Fabian Brinkmann, Alexander Lindau, Stefan Weinzierl, et al., TU Berlin Audio Communication Group. Licensed under the Creative Commons Attribution 4.0 International License. You must give appropriate credit, provide a link to the license, and indicate if changes were made. See </w:t>
-      </w:r>
-      <w:hyperlink w:history="1" r:id="rIdgwg18mxtejs96pgjnwa4b">
-        <w:r>
-          <w:rPr>
-            <w:rFonts w:ascii="DM Sans" w:cs="DM Sans" w:eastAsia="DM Sans" w:hAnsi="DM Sans"/>
-            <w:color w:val="2563EB"/>
-            <w:sz w:val="22"/>
-            <w:szCs w:val="22"/>
-            <w:u w:val="single"/>
-          </w:rPr>
-          <w:t xml:space="preserve">depositonce.tu-berlin.de</w:t>
-        </w:r>
-      </w:hyperlink>
-      <w:r>
-        <w:rPr>
-          <w:rFonts w:ascii="DM Sans" w:cs="DM Sans" w:eastAsia="DM Sans" w:hAnsi="DM Sans"/>
-          <w:color w:val="1A1A2E"/>
-          <w:sz w:val="22"/>
-          <w:szCs w:val="22"/>
-        </w:rPr>
-        <w:t xml:space="preserve">.</w:t>
-      </w:r>
-    </w:p>
-    <w:p>
-      <w:pPr>
-        <w:spacing w:after="160" w:line="300"/>
-      </w:pPr>
-      <w:r>
-        <w:rPr>
-          <w:rFonts w:ascii="DM Sans" w:cs="DM Sans" w:eastAsia="DM Sans" w:hAnsi="DM Sans"/>
-          <w:b/>
-          <w:bCs/>
-          <w:color w:val="1A1A2E"/>
-          <w:sz w:val="22"/>
-          <w:szCs w:val="22"/>
-        </w:rPr>
-        <w:t xml:space="preserve">Bernschuetz KU100 (CC BY 3.0): </w:t>
-      </w:r>
-      <w:r>
-        <w:rPr>
-          <w:rFonts w:ascii="DM Sans" w:cs="DM Sans" w:eastAsia="DM Sans" w:hAnsi="DM Sans"/>
-          <w:color w:val="1A1A2E"/>
-          <w:sz w:val="22"/>
-          <w:szCs w:val="22"/>
-        </w:rPr>
-        <w:t xml:space="preserve">Benjamin Bernschütz, TH Köln (Cologne University of Applied Sciences). Licensed under the Creative Commons Attribution 3.0 Unported License. You must give appropriate credit and indicate if changes were made. See </w:t>
-      </w:r>
-      <w:hyperlink w:history="1" r:id="rIdavzgy0kvpo0vsznxfz2lk">
-        <w:r>
-          <w:rPr>
-            <w:rFonts w:ascii="DM Sans" w:cs="DM Sans" w:eastAsia="DM Sans" w:hAnsi="DM Sans"/>
-            <w:color w:val="2563EB"/>
-            <w:sz w:val="22"/>
-            <w:szCs w:val="22"/>
-            <w:u w:val="single"/>
-          </w:rPr>
-          <w:t xml:space="preserve">audiogroup.web.th-koeln.de</w:t>
-        </w:r>
-      </w:hyperlink>
-      <w:r>
-        <w:rPr>
-          <w:rFonts w:ascii="DM Sans" w:cs="DM Sans" w:eastAsia="DM Sans" w:hAnsi="DM Sans"/>
-          <w:color w:val="1A1A2E"/>
-          <w:sz w:val="22"/>
-          <w:szCs w:val="22"/>
-        </w:rPr>
-        <w:t xml:space="preserve">.</w:t>
-      </w:r>
-    </w:p>
-    <w:p>
-      <w:pPr>
-        <w:pStyle w:val="Heading2"/>
-        <w:spacing w:after="180" w:before="280"/>
-      </w:pPr>
-      <w:r>
-        <w:rPr>
-          <w:rFonts w:ascii="DM Sans" w:cs="DM Sans" w:eastAsia="DM Sans" w:hAnsi="DM Sans"/>
-          <w:b/>
-          <w:bCs/>
-          <w:color w:val="64748B"/>
-          <w:sz w:val="30"/>
-          <w:szCs w:val="30"/>
-        </w:rPr>
-        <w:t xml:space="preserve">11.3</w:t>
-      </w:r>
-      <w:r>
-        <w:rPr>
-          <w:rFonts w:ascii="DM Sans" w:cs="DM Sans" w:eastAsia="DM Sans" w:hAnsi="DM Sans"/>
-          <w:b/>
-          <w:bCs/>
-          <w:color w:val="001633"/>
-          <w:sz w:val="30"/>
-          <w:szCs w:val="30"/>
-        </w:rPr>
-        <w:t xml:space="preserve">  Fonts</w:t>
-      </w:r>
-    </w:p>
-    <w:tbl>
-      <w:tblPr>
-        <w:tblW w:type="dxa" w:w="9026"/>
-        <w:tblBorders>
-          <w:top w:val="single" w:color="auto" w:sz="4"/>
-          <w:left w:val="single" w:color="auto" w:sz="4"/>
-          <w:bottom w:val="single" w:color="auto" w:sz="4"/>
-          <w:right w:val="single" w:color="auto" w:sz="4"/>
-          <w:insideH w:val="single" w:color="auto" w:sz="4"/>
-          <w:insideV w:val="single" w:color="auto" w:sz="4"/>
-        </w:tblBorders>
-      </w:tblPr>
-      <w:tblGrid>
-        <w:gridCol w:w="3600"/>
-        <w:gridCol w:w="2400"/>
-        <w:gridCol w:w="3026"/>
-      </w:tblGrid>
-      <w:tr>
-        <w:trPr>
-          <w:tblHeader/>
-        </w:trPr>
-        <w:tc>
-          <w:tcPr>
-            <w:tcW w:type="dxa" w:w="3600"/>
-            <w:tcBorders>
-              <w:top w:val="single" w:color="E2E8F0" w:sz="1"/>
-              <w:left w:val="single" w:color="E2E8F0" w:sz="1"/>
-              <w:bottom w:val="single" w:color="E2E8F0" w:sz="1"/>
-              <w:right w:val="single" w:color="E2E8F0" w:sz="1"/>
-            </w:tcBorders>
-            <w:shd w:fill="001633" w:val="clear"/>
-            <w:tcMar>
-              <w:top w:type="dxa" w:w="60"/>
-              <w:left w:type="dxa" w:w="100"/>
-              <w:bottom w:type="dxa" w:w="60"/>
-              <w:right w:type="dxa" w:w="100"/>
-            </w:tcMar>
-          </w:tcPr>
-          <w:p>
-            <w:r>
-              <w:rPr>
-                <w:rFonts w:ascii="DM Sans" w:cs="DM Sans" w:eastAsia="DM Sans" w:hAnsi="DM Sans"/>
-                <w:b/>
-                <w:bCs/>
-                <w:color w:val="FFFFFF"/>
-                <w:sz w:val="18"/>
-                <w:szCs w:val="18"/>
-              </w:rPr>
-              <w:t xml:space="preserve">Font</w:t>
-            </w:r>
-          </w:p>
-        </w:tc>
-        <w:tc>
-          <w:tcPr>
-            <w:tcW w:type="dxa" w:w="2400"/>
-            <w:tcBorders>
-              <w:top w:val="single" w:color="E2E8F0" w:sz="1"/>
-              <w:left w:val="single" w:color="E2E8F0" w:sz="1"/>
-              <w:bottom w:val="single" w:color="E2E8F0" w:sz="1"/>
-              <w:right w:val="single" w:color="E2E8F0" w:sz="1"/>
-            </w:tcBorders>
-            <w:shd w:fill="001633" w:val="clear"/>
-            <w:tcMar>
-              <w:top w:type="dxa" w:w="60"/>
-              <w:left w:type="dxa" w:w="100"/>
-              <w:bottom w:type="dxa" w:w="60"/>
-              <w:right w:type="dxa" w:w="100"/>
-            </w:tcMar>
-          </w:tcPr>
-          <w:p>
-            <w:r>
-              <w:rPr>
-                <w:rFonts w:ascii="DM Sans" w:cs="DM Sans" w:eastAsia="DM Sans" w:hAnsi="DM Sans"/>
-                <w:b/>
-                <w:bCs/>
-                <w:color w:val="FFFFFF"/>
-                <w:sz w:val="18"/>
-                <w:szCs w:val="18"/>
-              </w:rPr>
-              <w:t xml:space="preserve">License</w:t>
-            </w:r>
-          </w:p>
-        </w:tc>
-        <w:tc>
-          <w:tcPr>
-            <w:tcW w:type="dxa" w:w="3026"/>
-            <w:tcBorders>
-              <w:top w:val="single" w:color="E2E8F0" w:sz="1"/>
-              <w:left w:val="single" w:color="E2E8F0" w:sz="1"/>
-              <w:bottom w:val="single" w:color="E2E8F0" w:sz="1"/>
-              <w:right w:val="single" w:color="E2E8F0" w:sz="1"/>
-            </w:tcBorders>
-            <w:shd w:fill="001633" w:val="clear"/>
-            <w:tcMar>
-              <w:top w:type="dxa" w:w="60"/>
-              <w:left w:type="dxa" w:w="100"/>
-              <w:bottom w:type="dxa" w:w="60"/>
-              <w:right w:type="dxa" w:w="100"/>
-            </w:tcMar>
-          </w:tcPr>
-          <w:p>
-            <w:r>
-              <w:rPr>
-                <w:rFonts w:ascii="DM Sans" w:cs="DM Sans" w:eastAsia="DM Sans" w:hAnsi="DM Sans"/>
-                <w:b/>
-                <w:bCs/>
-                <w:color w:val="FFFFFF"/>
-                <w:sz w:val="18"/>
-                <w:szCs w:val="18"/>
-              </w:rPr>
-              <w:t xml:space="preserve">Copyright</w:t>
-            </w:r>
-          </w:p>
-        </w:tc>
-      </w:tr>
-      <w:tr>
-        <w:tc>
-          <w:tcPr>
-            <w:tcW w:type="dxa" w:w="3600"/>
-            <w:tcBorders>
-              <w:top w:val="single" w:color="E2E8F0" w:sz="1"/>
-              <w:left w:val="single" w:color="E2E8F0" w:sz="1"/>
-              <w:bottom w:val="single" w:color="E2E8F0" w:sz="1"/>
-              <w:right w:val="single" w:color="E2E8F0" w:sz="1"/>
-            </w:tcBorders>
-            <w:tcMar>
-              <w:top w:type="dxa" w:w="50"/>
-              <w:left w:type="dxa" w:w="100"/>
-              <w:bottom w:type="dxa" w:w="50"/>
-              <w:right w:type="dxa" w:w="100"/>
-            </w:tcMar>
-          </w:tcPr>
-          <w:p>
-            <w:r>
-              <w:rPr>
-                <w:rFonts w:ascii="DM Sans" w:cs="DM Sans" w:eastAsia="DM Sans" w:hAnsi="DM Sans"/>
-                <w:color w:val="1A1A2E"/>
-                <w:sz w:val="18"/>
-                <w:szCs w:val="18"/>
-              </w:rPr>
-              <w:t xml:space="preserve">DM Sans (Regular, Medium, SemiBold, Bold)</w:t>
-            </w:r>
-          </w:p>
-        </w:tc>
-        <w:tc>
-          <w:tcPr>
-            <w:tcW w:type="dxa" w:w="2400"/>
-            <w:tcBorders>
-              <w:top w:val="single" w:color="E2E8F0" w:sz="1"/>
-              <w:left w:val="single" w:color="E2E8F0" w:sz="1"/>
-              <w:bottom w:val="single" w:color="E2E8F0" w:sz="1"/>
-              <w:right w:val="single" w:color="E2E8F0" w:sz="1"/>
-            </w:tcBorders>
-            <w:tcMar>
-              <w:top w:type="dxa" w:w="50"/>
-              <w:left w:type="dxa" w:w="100"/>
-              <w:bottom w:type="dxa" w:w="50"/>
-              <w:right w:type="dxa" w:w="100"/>
-            </w:tcMar>
-          </w:tcPr>
-          <w:p>
-            <w:r>
-              <w:rPr>
-                <w:rFonts w:ascii="DM Sans" w:cs="DM Sans" w:eastAsia="DM Sans" w:hAnsi="DM Sans"/>
-                <w:color w:val="1A1A2E"/>
-                <w:sz w:val="18"/>
-                <w:szCs w:val="18"/>
-              </w:rPr>
-              <w:t xml:space="preserve">SIL Open Font License 1.1</w:t>
-            </w:r>
-          </w:p>
-        </w:tc>
-        <w:tc>
-          <w:tcPr>
-            <w:tcW w:type="dxa" w:w="3026"/>
-            <w:tcBorders>
-              <w:top w:val="single" w:color="E2E8F0" w:sz="1"/>
-              <w:left w:val="single" w:color="E2E8F0" w:sz="1"/>
-              <w:bottom w:val="single" w:color="E2E8F0" w:sz="1"/>
-              <w:right w:val="single" w:color="E2E8F0" w:sz="1"/>
-            </w:tcBorders>
-            <w:tcMar>
-              <w:top w:type="dxa" w:w="50"/>
-              <w:left w:type="dxa" w:w="100"/>
-              <w:bottom w:type="dxa" w:w="50"/>
-              <w:right w:type="dxa" w:w="100"/>
-            </w:tcMar>
-          </w:tcPr>
-          <w:p>
-            <w:r>
-              <w:rPr>
-                <w:rFonts w:ascii="DM Sans" w:cs="DM Sans" w:eastAsia="DM Sans" w:hAnsi="DM Sans"/>
-                <w:color w:val="1A1A2E"/>
-                <w:sz w:val="18"/>
-                <w:szCs w:val="18"/>
-              </w:rPr>
-              <w:t xml:space="preserve">Colophon Foundry, Google</w:t>
-            </w:r>
-          </w:p>
-        </w:tc>
-      </w:tr>
-      <w:tr>
-        <w:tc>
-          <w:tcPr>
-            <w:tcW w:type="dxa" w:w="3600"/>
-            <w:tcBorders>
-              <w:top w:val="single" w:color="E2E8F0" w:sz="1"/>
-              <w:left w:val="single" w:color="E2E8F0" w:sz="1"/>
-              <w:bottom w:val="single" w:color="E2E8F0" w:sz="1"/>
-              <w:right w:val="single" w:color="E2E8F0" w:sz="1"/>
-            </w:tcBorders>
-            <w:shd w:fill="F8FAFC" w:val="clear"/>
-            <w:tcMar>
-              <w:top w:type="dxa" w:w="50"/>
-              <w:left w:type="dxa" w:w="100"/>
-              <w:bottom w:type="dxa" w:w="50"/>
-              <w:right w:type="dxa" w:w="100"/>
-            </w:tcMar>
-          </w:tcPr>
-          <w:p>
-            <w:r>
-              <w:rPr>
-                <w:rFonts w:ascii="DM Sans" w:cs="DM Sans" w:eastAsia="DM Sans" w:hAnsi="DM Sans"/>
-                <w:color w:val="1A1A2E"/>
-                <w:sz w:val="18"/>
-                <w:szCs w:val="18"/>
-              </w:rPr>
-              <w:t xml:space="preserve">JetBrains Mono (Regular, Medium, Bold)</w:t>
-            </w:r>
-          </w:p>
-        </w:tc>
-        <w:tc>
-          <w:tcPr>
-            <w:tcW w:type="dxa" w:w="2400"/>
-            <w:tcBorders>
-              <w:top w:val="single" w:color="E2E8F0" w:sz="1"/>
-              <w:left w:val="single" w:color="E2E8F0" w:sz="1"/>
-              <w:bottom w:val="single" w:color="E2E8F0" w:sz="1"/>
-              <w:right w:val="single" w:color="E2E8F0" w:sz="1"/>
-            </w:tcBorders>
-            <w:shd w:fill="F8FAFC" w:val="clear"/>
-            <w:tcMar>
-              <w:top w:type="dxa" w:w="50"/>
-              <w:left w:type="dxa" w:w="100"/>
-              <w:bottom w:type="dxa" w:w="50"/>
-              <w:right w:type="dxa" w:w="100"/>
-            </w:tcMar>
-          </w:tcPr>
-          <w:p>
-            <w:r>
-              <w:rPr>
-                <w:rFonts w:ascii="DM Sans" w:cs="DM Sans" w:eastAsia="DM Sans" w:hAnsi="DM Sans"/>
-                <w:color w:val="1A1A2E"/>
-                <w:sz w:val="18"/>
-                <w:szCs w:val="18"/>
-              </w:rPr>
-              <w:t xml:space="preserve">SIL Open Font License 1.1</w:t>
-            </w:r>
-          </w:p>
-        </w:tc>
-        <w:tc>
-          <w:tcPr>
-            <w:tcW w:type="dxa" w:w="3026"/>
-            <w:tcBorders>
-              <w:top w:val="single" w:color="E2E8F0" w:sz="1"/>
-              <w:left w:val="single" w:color="E2E8F0" w:sz="1"/>
-              <w:bottom w:val="single" w:color="E2E8F0" w:sz="1"/>
-              <w:right w:val="single" w:color="E2E8F0" w:sz="1"/>
-            </w:tcBorders>
-            <w:shd w:fill="F8FAFC" w:val="clear"/>
-            <w:tcMar>
-              <w:top w:type="dxa" w:w="50"/>
-              <w:left w:type="dxa" w:w="100"/>
-              <w:bottom w:type="dxa" w:w="50"/>
-              <w:right w:type="dxa" w:w="100"/>
-            </w:tcMar>
-          </w:tcPr>
-          <w:p>
-            <w:r>
-              <w:rPr>
-                <w:rFonts w:ascii="DM Sans" w:cs="DM Sans" w:eastAsia="DM Sans" w:hAnsi="DM Sans"/>
-                <w:color w:val="1A1A2E"/>
-                <w:sz w:val="18"/>
-                <w:szCs w:val="18"/>
-              </w:rPr>
-              <w:t xml:space="preserve">JetBrains s.r.o.</w:t>
-            </w:r>
-          </w:p>
-        </w:tc>
-      </w:tr>
-      <w:tr>
-        <w:tc>
-          <w:tcPr>
-            <w:tcW w:type="dxa" w:w="3600"/>
-            <w:tcBorders>
-              <w:top w:val="single" w:color="E2E8F0" w:sz="1"/>
-              <w:left w:val="single" w:color="E2E8F0" w:sz="1"/>
-              <w:bottom w:val="single" w:color="E2E8F0" w:sz="1"/>
-              <w:right w:val="single" w:color="E2E8F0" w:sz="1"/>
-            </w:tcBorders>
-            <w:tcMar>
-              <w:top w:type="dxa" w:w="50"/>
-              <w:left w:type="dxa" w:w="100"/>
-              <w:bottom w:type="dxa" w:w="50"/>
-              <w:right w:type="dxa" w:w="100"/>
-            </w:tcMar>
-          </w:tcPr>
-          <w:p>
-            <w:r>
-              <w:rPr>
-                <w:rFonts w:ascii="DM Sans" w:cs="DM Sans" w:eastAsia="DM Sans" w:hAnsi="DM Sans"/>
-                <w:color w:val="1A1A2E"/>
-                <w:sz w:val="18"/>
-                <w:szCs w:val="18"/>
-              </w:rPr>
-              <w:t xml:space="preserve">Roboto (Medium)</w:t>
-            </w:r>
-          </w:p>
-        </w:tc>
-        <w:tc>
-          <w:tcPr>
-            <w:tcW w:type="dxa" w:w="2400"/>
-            <w:tcBorders>
-              <w:top w:val="single" w:color="E2E8F0" w:sz="1"/>
-              <w:left w:val="single" w:color="E2E8F0" w:sz="1"/>
-              <w:bottom w:val="single" w:color="E2E8F0" w:sz="1"/>
-              <w:right w:val="single" w:color="E2E8F0" w:sz="1"/>
-            </w:tcBorders>
-            <w:tcMar>
-              <w:top w:type="dxa" w:w="50"/>
-              <w:left w:type="dxa" w:w="100"/>
-              <w:bottom w:type="dxa" w:w="50"/>
-              <w:right w:type="dxa" w:w="100"/>
-            </w:tcMar>
-          </w:tcPr>
-          <w:p>
-            <w:r>
-              <w:rPr>
-                <w:rFonts w:ascii="DM Sans" w:cs="DM Sans" w:eastAsia="DM Sans" w:hAnsi="DM Sans"/>
-                <w:color w:val="1A1A2E"/>
-                <w:sz w:val="18"/>
-                <w:szCs w:val="18"/>
-              </w:rPr>
-              <w:t xml:space="preserve">Apache License 2.0</w:t>
-            </w:r>
-          </w:p>
-        </w:tc>
-        <w:tc>
-          <w:tcPr>
-            <w:tcW w:type="dxa" w:w="3026"/>
-            <w:tcBorders>
-              <w:top w:val="single" w:color="E2E8F0" w:sz="1"/>
-              <w:left w:val="single" w:color="E2E8F0" w:sz="1"/>
-              <w:bottom w:val="single" w:color="E2E8F0" w:sz="1"/>
-              <w:right w:val="single" w:color="E2E8F0" w:sz="1"/>
-            </w:tcBorders>
-            <w:tcMar>
-              <w:top w:type="dxa" w:w="50"/>
-              <w:left w:type="dxa" w:w="100"/>
-              <w:bottom w:type="dxa" w:w="50"/>
-              <w:right w:type="dxa" w:w="100"/>
-            </w:tcMar>
-          </w:tcPr>
-          <w:p>
-            <w:r>
-              <w:rPr>
-                <w:rFonts w:ascii="DM Sans" w:cs="DM Sans" w:eastAsia="DM Sans" w:hAnsi="DM Sans"/>
-                <w:color w:val="1A1A2E"/>
-                <w:sz w:val="18"/>
-                <w:szCs w:val="18"/>
-              </w:rPr>
-              <w:t xml:space="preserve">Google LLC</w:t>
-            </w:r>
-          </w:p>
-        </w:tc>
-      </w:tr>
-    </w:tbl>
-    <w:p>
-      <w:pPr>
-        <w:spacing w:after="160"/>
-      </w:pPr>
-    </w:p>
-    <w:p>
-      <w:pPr>
-        <w:spacing w:after="160" w:line="300"/>
-      </w:pPr>
-      <w:r>
-        <w:rPr>
-          <w:rFonts w:ascii="DM Sans" w:cs="DM Sans" w:eastAsia="DM Sans" w:hAnsi="DM Sans"/>
-          <w:b/>
-          <w:bCs/>
-          <w:color w:val="1A1A2E"/>
-          <w:sz w:val="22"/>
-          <w:szCs w:val="22"/>
-        </w:rPr>
-        <w:t xml:space="preserve">SIL Open Font License 1.1: </w:t>
-      </w:r>
-      <w:r>
-        <w:rPr>
-          <w:rFonts w:ascii="DM Sans" w:cs="DM Sans" w:eastAsia="DM Sans" w:hAnsi="DM Sans"/>
-          <w:color w:val="1A1A2E"/>
-          <w:sz w:val="22"/>
-          <w:szCs w:val="22"/>
-        </w:rPr>
-        <w:t xml:space="preserve">DM Sans and JetBrains Mono are licensed under the SIL Open Font License, Version 1.1. This license is available at </w:t>
-      </w:r>
-      <w:hyperlink w:history="1" r:id="rIdh3vkz2y1gdwha_o_bbnpz">
-        <w:r>
-          <w:rPr>
-            <w:rFonts w:ascii="DM Sans" w:cs="DM Sans" w:eastAsia="DM Sans" w:hAnsi="DM Sans"/>
-            <w:color w:val="2563EB"/>
-            <w:sz w:val="22"/>
-            <w:szCs w:val="22"/>
-            <w:u w:val="single"/>
-          </w:rPr>
-          <w:t xml:space="preserve">openfontlicense.org</w:t>
-        </w:r>
-      </w:hyperlink>
-      <w:r>
-        <w:rPr>
-          <w:rFonts w:ascii="DM Sans" w:cs="DM Sans" w:eastAsia="DM Sans" w:hAnsi="DM Sans"/>
-          <w:color w:val="1A1A2E"/>
-          <w:sz w:val="22"/>
-          <w:szCs w:val="22"/>
-        </w:rPr>
-        <w:t xml:space="preserve">. The fonts may be used, modified, and distributed freely, provided that they are not sold by themselves and any derivative fonts carry a different name.</w:t>
-      </w:r>
-    </w:p>
-    <w:p>
-      <w:pPr>
-        <w:spacing w:after="160" w:line="300"/>
-      </w:pPr>
-      <w:r>
-        <w:rPr>
-          <w:rFonts w:ascii="DM Sans" w:cs="DM Sans" w:eastAsia="DM Sans" w:hAnsi="DM Sans"/>
-          <w:b/>
-          <w:bCs/>
-          <w:color w:val="1A1A2E"/>
-          <w:sz w:val="22"/>
-          <w:szCs w:val="22"/>
-        </w:rPr>
-        <w:t xml:space="preserve">Apache License 2.0: </w:t>
-      </w:r>
-      <w:r>
-        <w:rPr>
-          <w:rFonts w:ascii="DM Sans" w:cs="DM Sans" w:eastAsia="DM Sans" w:hAnsi="DM Sans"/>
-          <w:color w:val="1A1A2E"/>
-          <w:sz w:val="22"/>
-          <w:szCs w:val="22"/>
-        </w:rPr>
-        <w:t xml:space="preserve">Roboto is licensed under the Apache License, Version 2.0. You may obtain a copy of the License at </w:t>
-      </w:r>
-      <w:hyperlink w:history="1" r:id="rIdtlcc-rixgdn1vvbtd3fdy">
-        <w:r>
-          <w:rPr>
-            <w:rFonts w:ascii="DM Sans" w:cs="DM Sans" w:eastAsia="DM Sans" w:hAnsi="DM Sans"/>
-            <w:color w:val="2563EB"/>
-            <w:sz w:val="22"/>
-            <w:szCs w:val="22"/>
-            <w:u w:val="single"/>
-          </w:rPr>
-          <w:t xml:space="preserve">apache.org/licenses/LICENSE-2.0</w:t>
-        </w:r>
-      </w:hyperlink>
-      <w:r>
-        <w:rPr>
-          <w:rFonts w:ascii="DM Sans" w:cs="DM Sans" w:eastAsia="DM Sans" w:hAnsi="DM Sans"/>
-          <w:color w:val="1A1A2E"/>
-          <w:sz w:val="22"/>
-          <w:szCs w:val="22"/>
-        </w:rPr>
-        <w:t xml:space="preserve">.</w:t>
-      </w:r>
-    </w:p>
-    <w:p>
-      <w:pPr>
-        <w:pStyle w:val="Heading2"/>
-        <w:spacing w:after="180" w:before="280"/>
-      </w:pPr>
-      <w:r>
-        <w:rPr>
-          <w:rFonts w:ascii="DM Sans" w:cs="DM Sans" w:eastAsia="DM Sans" w:hAnsi="DM Sans"/>
-          <w:b/>
-          <w:bCs/>
-          <w:color w:val="64748B"/>
-          <w:sz w:val="30"/>
-          <w:szCs w:val="30"/>
-        </w:rPr>
-        <w:t xml:space="preserve">11.4</w:t>
-      </w:r>
-      <w:r>
-        <w:rPr>
-          <w:rFonts w:ascii="DM Sans" w:cs="DM Sans" w:eastAsia="DM Sans" w:hAnsi="DM Sans"/>
-          <w:b/>
-          <w:bCs/>
-          <w:color w:val="001633"/>
-          <w:sz w:val="30"/>
-          <w:szCs w:val="30"/>
-        </w:rPr>
-        <w:t xml:space="preserve">  Project License</w:t>
-      </w:r>
-    </w:p>
-    <w:p>
-      <w:pPr>
-        <w:spacing w:after="160" w:line="300"/>
-      </w:pPr>
-      <w:r>
-        <w:rPr>
-          <w:rFonts w:ascii="DM Sans" w:cs="DM Sans" w:eastAsia="DM Sans" w:hAnsi="DM Sans"/>
-          <w:color w:val="1A1A2E"/>
-          <w:sz w:val="22"/>
-          <w:szCs w:val="22"/>
-        </w:rPr>
-        <w:t xml:space="preserve">OpenSpatialDelay itself is dual-licensed under the </w:t>
-      </w:r>
-      <w:r>
-        <w:rPr>
-          <w:rFonts w:ascii="DM Sans" w:cs="DM Sans" w:eastAsia="DM Sans" w:hAnsi="DM Sans"/>
-          <w:b/>
-          <w:bCs/>
-          <w:color w:val="1A1A2E"/>
-          <w:sz w:val="22"/>
-          <w:szCs w:val="22"/>
-        </w:rPr>
-        <w:t xml:space="preserve">GNU General Public License v3.0</w:t>
-      </w:r>
-      <w:r>
-        <w:rPr>
-          <w:rFonts w:ascii="DM Sans" w:cs="DM Sans" w:eastAsia="DM Sans" w:hAnsi="DM Sans"/>
-          <w:color w:val="1A1A2E"/>
-          <w:sz w:val="22"/>
-          <w:szCs w:val="22"/>
-        </w:rPr>
-        <w:t xml:space="preserve"> (for open-source use) and a </w:t>
-      </w:r>
-      <w:r>
-        <w:rPr>
-          <w:rFonts w:ascii="DM Sans" w:cs="DM Sans" w:eastAsia="DM Sans" w:hAnsi="DM Sans"/>
-          <w:b/>
-          <w:bCs/>
-          <w:color w:val="1A1A2E"/>
-          <w:sz w:val="22"/>
-          <w:szCs w:val="22"/>
-        </w:rPr>
-        <w:t xml:space="preserve">Commercial License</w:t>
-      </w:r>
-      <w:r>
-        <w:rPr>
-          <w:rFonts w:ascii="DM Sans" w:cs="DM Sans" w:eastAsia="DM Sans" w:hAnsi="DM Sans"/>
-          <w:color w:val="1A1A2E"/>
-          <w:sz w:val="22"/>
-          <w:szCs w:val="22"/>
-        </w:rPr>
-        <w:t xml:space="preserve"> (for proprietary/closed-source projects). The full GPL-3.0 text is included in the LICENSE file distributed with the source code. For commercial licensing, contact </w:t>
-      </w:r>
-      <w:hyperlink w:history="1" r:id="rIdglsjpldvrifk-hhrzxiol">
-        <w:r>
-          <w:rPr>
-            <w:rFonts w:ascii="DM Sans" w:cs="DM Sans" w:eastAsia="DM Sans" w:hAnsi="DM Sans"/>
-            <w:color w:val="2563EB"/>
-            <w:sz w:val="22"/>
-            <w:szCs w:val="22"/>
-            <w:u w:val="single"/>
-          </w:rPr>
-          <w:t xml:space="preserve">Spatial Media Lab</w:t>
-        </w:r>
-      </w:hyperlink>
-      <w:r>
-        <w:rPr>
-          <w:rFonts w:ascii="DM Sans" w:cs="DM Sans" w:eastAsia="DM Sans" w:hAnsi="DM Sans"/>
-          <w:color w:val="1A1A2E"/>
-          <w:sz w:val="22"/>
-          <w:szCs w:val="22"/>
-        </w:rPr>
-        <w:t xml:space="preserve">.</w:t>
-      </w:r>
-    </w:p>
-    <w:p>
-      <w:r>
-        <w:br w:type="page"/>
-      </w:r>
-    </w:p>
-    <w:p>
-      <w:pPr>
         <w:spacing w:after="1200"/>
       </w:pPr>
     </w:p>
@@ -20614,7 +18400,7 @@
         <w:spacing w:after="60"/>
         <w:jc w:val="center"/>
       </w:pPr>
-      <w:hyperlink w:history="1" r:id="rIddjvasj8dqi5ffopwtfwgx">
+      <w:hyperlink w:history="1" r:id="rIdakjlj1cece2sfcci-0s-m">
         <w:r>
           <w:rPr>
             <w:rFonts w:ascii="DM Sans" w:cs="DM Sans" w:eastAsia="DM Sans" w:hAnsi="DM Sans"/>
@@ -20632,7 +18418,7 @@
         <w:spacing w:after="60"/>
         <w:jc w:val="center"/>
       </w:pPr>
-      <w:hyperlink w:history="1" r:id="rIds_-v3ajprg17xon5cvhj4">
+      <w:hyperlink w:history="1" r:id="rIdnzyckilgc9ci51ym6pjsj">
         <w:r>
           <w:rPr>
             <w:rFonts w:ascii="DM Sans" w:cs="DM Sans" w:eastAsia="DM Sans" w:hAnsi="DM Sans"/>

</xml_diff>

<commit_message>
docs(manual): add Trajectory Shape Reference gallery (issue #168)
Embed the 13 map-only trajectory reference PNGs in the manual as a
3-col × 5-row gallery under §6 Trajectories & Animation. Each cell
shows the shape render (one tap at origin, full-brightness trail)
with a bold shape-name caption below.

Also drop the stale docs/assets/trajectories/traj_none.png — it was
a leftover 1640×1160 full-plugin-window capture from the prior round,
not a map-only trajectory render. "None" needs no visual (no trail
to show); the existing table row already documents it.

- docs/generate_manual.js: add TRAJECTORY_SHAPES loader + new
  trajectoryGalleryTable() helper, extend buildTrajectories() with
  §6.1 Trajectory Shape Reference.
- docs/OpenSpatialDelay_Manual_v1.0.{docx,pdf}: regenerate.
- docs/assets/trajectories/traj_none.png: delete stale asset.

Co-Authored-By: Claude Opus 4.7 (1M context) <noreply@anthropic.com>
</commit_message>
<xml_diff>
--- a/docs/OpenSpatialDelay_Manual_v1.0.docx
+++ b/docs/OpenSpatialDelay_Manual_v1.0.docx
@@ -1312,7 +1312,7 @@
         </w:rPr>
         <w:t xml:space="preserve">Download the latest release for your platform from the </w:t>
       </w:r>
-      <w:hyperlink w:history="1" r:id="rIdzwyckemkplsagbryzit-q">
+      <w:hyperlink w:history="1" r:id="rId2kajdu_lqcigvq5lxiarw">
         <w:r>
           <w:rPr>
             <w:rFonts w:ascii="DM Sans" w:cs="DM Sans" w:eastAsia="DM Sans" w:hAnsi="DM Sans"/>
@@ -9800,7 +9800,7 @@
           <wp:inline distT="0" distB="0" distL="0" distR="0">
             <wp:extent cx="4572000" cy="285750"/>
             <wp:effectExtent t="0" r="0" b="0" l="0"/>
-            <wp:docPr id="1" name="header-bar" descr="Header Bar — showing title, preset navigation, OSC toggle, Output Format, Algorithm/HRTF dropdown" title="Header Bar"/>
+            <wp:docPr id="1" name="header-bar" descr="Header Bar — showing title, preset navigation, undo / redo arrows, OSC toggle, Output Format, Algorithm/HRTF dropdown" title="Header Bar"/>
             <wp:cNvGraphicFramePr>
               <a:graphicFrameLocks xmlns:a="http://schemas.openxmlformats.org/drawingml/2006/main" noChangeAspect="1"/>
             </wp:cNvGraphicFramePr>
@@ -9873,6 +9873,26 @@
           <w:szCs w:val="22"/>
         </w:rPr>
         <w:t xml:space="preserve">(dropdown, prev/next arrows, save button), </w:t>
+      </w:r>
+      <w:r>
+        <w:rPr>
+          <w:rFonts w:ascii="DM Sans" w:cs="DM Sans" w:eastAsia="DM Sans" w:hAnsi="DM Sans"/>
+          <w:b/>
+          <w:bCs/>
+          <w:color w:val="1A1A2E"/>
+          <w:sz w:val="22"/>
+          <w:szCs w:val="22"/>
+        </w:rPr>
+        <w:t xml:space="preserve">undo / redo arrows </w:t>
+      </w:r>
+      <w:r>
+        <w:rPr>
+          <w:rFonts w:ascii="DM Sans" w:cs="DM Sans" w:eastAsia="DM Sans" w:hAnsi="DM Sans"/>
+          <w:color w:val="1A1A2E"/>
+          <w:sz w:val="22"/>
+          <w:szCs w:val="22"/>
+        </w:rPr>
+        <w:t xml:space="preserve">(step backwards or forwards through recent parameter changes — dimmed when the corresponding history is empty), </w:t>
       </w:r>
       <w:r>
         <w:rPr>
@@ -16406,6 +16426,1164 @@
       </w:tr>
     </w:tbl>
     <w:p>
+      <w:pPr>
+        <w:spacing w:after="200"/>
+      </w:pPr>
+    </w:p>
+    <w:p>
+      <w:pPr>
+        <w:pStyle w:val="Heading2"/>
+        <w:spacing w:after="180" w:before="280"/>
+      </w:pPr>
+      <w:bookmarkStart w:name="trajectory-shapes" w:id="1"/>
+      <w:r>
+        <w:rPr>
+          <w:rFonts w:ascii="DM Sans" w:cs="DM Sans" w:eastAsia="DM Sans" w:hAnsi="DM Sans"/>
+          <w:b/>
+          <w:bCs/>
+          <w:color w:val="64748B"/>
+          <w:sz w:val="30"/>
+          <w:szCs w:val="30"/>
+        </w:rPr>
+        <w:t xml:space="preserve">6.1</w:t>
+      </w:r>
+      <w:r>
+        <w:rPr>
+          <w:rFonts w:ascii="DM Sans" w:cs="DM Sans" w:eastAsia="DM Sans" w:hAnsi="DM Sans"/>
+          <w:b/>
+          <w:bCs/>
+          <w:color w:val="001633"/>
+          <w:sz w:val="30"/>
+          <w:szCs w:val="30"/>
+        </w:rPr>
+        <w:t xml:space="preserve">  Trajectory Shape Reference</w:t>
+      </w:r>
+      <w:bookmarkEnd w:id="1"/>
+    </w:p>
+    <w:p>
+      <w:pPr>
+        <w:spacing w:after="160" w:line="300"/>
+      </w:pPr>
+      <w:r>
+        <w:rPr>
+          <w:rFonts w:ascii="DM Sans" w:cs="DM Sans" w:eastAsia="DM Sans" w:hAnsi="DM Sans"/>
+          <w:color w:val="1A1A2E"/>
+          <w:sz w:val="22"/>
+          <w:szCs w:val="22"/>
+        </w:rPr>
+        <w:t xml:space="preserve">Each reference shows one tap at origin (az=0°, el=0°, distance=0.5) running the named shape. The glow trail is drawn at full brightness to show the full path.</w:t>
+      </w:r>
+    </w:p>
+    <w:p>
+      <w:pPr>
+        <w:spacing w:after="120"/>
+      </w:pPr>
+    </w:p>
+    <w:tbl>
+      <w:tblPr>
+        <w:tblW w:type="dxa" w:w="9026"/>
+        <w:tblBorders>
+          <w:top w:val="none" w:color="FFFFFF" w:sz="0"/>
+          <w:left w:val="none" w:color="FFFFFF" w:sz="0"/>
+          <w:bottom w:val="none" w:color="FFFFFF" w:sz="0"/>
+          <w:right w:val="none" w:color="FFFFFF" w:sz="0"/>
+          <w:insideH w:val="none" w:color="FFFFFF" w:sz="0"/>
+          <w:insideV w:val="none" w:color="FFFFFF" w:sz="0"/>
+        </w:tblBorders>
+      </w:tblPr>
+      <w:tblGrid>
+        <w:gridCol w:w="3008"/>
+        <w:gridCol w:w="3008"/>
+        <w:gridCol w:w="3010"/>
+      </w:tblGrid>
+      <w:tr>
+        <w:tc>
+          <w:tcPr>
+            <w:tcW w:type="dxa" w:w="3008"/>
+            <w:tcBorders>
+              <w:top w:val="none" w:color="FFFFFF" w:sz="0"/>
+              <w:left w:val="none" w:color="FFFFFF" w:sz="0"/>
+              <w:bottom w:val="none" w:color="FFFFFF" w:sz="0"/>
+              <w:right w:val="none" w:color="FFFFFF" w:sz="0"/>
+            </w:tcBorders>
+            <w:tcMar>
+              <w:top w:type="dxa" w:w="100"/>
+              <w:left w:type="dxa" w:w="80"/>
+              <w:bottom w:type="dxa" w:w="100"/>
+              <w:right w:type="dxa" w:w="80"/>
+            </w:tcMar>
+          </w:tcPr>
+          <w:p>
+            <w:pPr>
+              <w:spacing w:after="40" w:before="0"/>
+              <w:jc w:val="center"/>
+            </w:pPr>
+            <w:r>
+              <w:drawing>
+                <wp:inline distT="0" distB="0" distL="0" distR="0">
+                  <wp:extent cx="1428750" cy="1047750"/>
+                  <wp:effectExtent t="0" r="0" b="0" l="0"/>
+                  <wp:docPr id="1" name="traj-bounce" descr="Spatial map showing the Bounce trajectory path" title="Bounce trajectory"/>
+                  <wp:cNvGraphicFramePr>
+                    <a:graphicFrameLocks xmlns:a="http://schemas.openxmlformats.org/drawingml/2006/main" noChangeAspect="1"/>
+                  </wp:cNvGraphicFramePr>
+                  <a:graphic xmlns:a="http://schemas.openxmlformats.org/drawingml/2006/main">
+                    <a:graphicData uri="http://schemas.openxmlformats.org/drawingml/2006/picture">
+                      <pic:pic xmlns:pic="http://schemas.openxmlformats.org/drawingml/2006/picture">
+                        <pic:nvPicPr>
+                          <pic:cNvPr id="0" name="" descr=""/>
+                          <pic:cNvPicPr>
+                            <a:picLocks noChangeAspect="1" noChangeArrowheads="1"/>
+                          </pic:cNvPicPr>
+                        </pic:nvPicPr>
+                        <pic:blipFill>
+                          <a:blip r:embed="rId18" cstate="none"/>
+                          <a:srcRect/>
+                          <a:stretch>
+                            <a:fillRect/>
+                          </a:stretch>
+                        </pic:blipFill>
+                        <pic:spPr bwMode="auto">
+                          <a:xfrm>
+                            <a:off x="0" y="0"/>
+                            <a:ext cx="1428750" cy="1047750"/>
+                          </a:xfrm>
+                          <a:prstGeom prst="rect">
+                            <a:avLst/>
+                          </a:prstGeom>
+                        </pic:spPr>
+                      </pic:pic>
+                    </a:graphicData>
+                  </a:graphic>
+                </wp:inline>
+              </w:drawing>
+            </w:r>
+          </w:p>
+          <w:p>
+            <w:pPr>
+              <w:spacing w:after="60" w:before="0"/>
+              <w:jc w:val="center"/>
+            </w:pPr>
+            <w:r>
+              <w:rPr>
+                <w:rFonts w:ascii="DM Sans" w:cs="DM Sans" w:eastAsia="DM Sans" w:hAnsi="DM Sans"/>
+                <w:b/>
+                <w:bCs/>
+                <w:color w:val="334155"/>
+                <w:sz w:val="18"/>
+                <w:szCs w:val="18"/>
+              </w:rPr>
+              <w:t xml:space="preserve">Bounce</w:t>
+            </w:r>
+          </w:p>
+        </w:tc>
+        <w:tc>
+          <w:tcPr>
+            <w:tcW w:type="dxa" w:w="3008"/>
+            <w:tcBorders>
+              <w:top w:val="none" w:color="FFFFFF" w:sz="0"/>
+              <w:left w:val="none" w:color="FFFFFF" w:sz="0"/>
+              <w:bottom w:val="none" w:color="FFFFFF" w:sz="0"/>
+              <w:right w:val="none" w:color="FFFFFF" w:sz="0"/>
+            </w:tcBorders>
+            <w:tcMar>
+              <w:top w:type="dxa" w:w="100"/>
+              <w:left w:type="dxa" w:w="80"/>
+              <w:bottom w:type="dxa" w:w="100"/>
+              <w:right w:type="dxa" w:w="80"/>
+            </w:tcMar>
+          </w:tcPr>
+          <w:p>
+            <w:pPr>
+              <w:spacing w:after="40" w:before="0"/>
+              <w:jc w:val="center"/>
+            </w:pPr>
+            <w:r>
+              <w:drawing>
+                <wp:inline distT="0" distB="0" distL="0" distR="0">
+                  <wp:extent cx="1428750" cy="1047750"/>
+                  <wp:effectExtent t="0" r="0" b="0" l="0"/>
+                  <wp:docPr id="1" name="traj-circle" descr="Spatial map showing the Circle trajectory path" title="Circle trajectory"/>
+                  <wp:cNvGraphicFramePr>
+                    <a:graphicFrameLocks xmlns:a="http://schemas.openxmlformats.org/drawingml/2006/main" noChangeAspect="1"/>
+                  </wp:cNvGraphicFramePr>
+                  <a:graphic xmlns:a="http://schemas.openxmlformats.org/drawingml/2006/main">
+                    <a:graphicData uri="http://schemas.openxmlformats.org/drawingml/2006/picture">
+                      <pic:pic xmlns:pic="http://schemas.openxmlformats.org/drawingml/2006/picture">
+                        <pic:nvPicPr>
+                          <pic:cNvPr id="0" name="" descr=""/>
+                          <pic:cNvPicPr>
+                            <a:picLocks noChangeAspect="1" noChangeArrowheads="1"/>
+                          </pic:cNvPicPr>
+                        </pic:nvPicPr>
+                        <pic:blipFill>
+                          <a:blip r:embed="rId19" cstate="none"/>
+                          <a:srcRect/>
+                          <a:stretch>
+                            <a:fillRect/>
+                          </a:stretch>
+                        </pic:blipFill>
+                        <pic:spPr bwMode="auto">
+                          <a:xfrm>
+                            <a:off x="0" y="0"/>
+                            <a:ext cx="1428750" cy="1047750"/>
+                          </a:xfrm>
+                          <a:prstGeom prst="rect">
+                            <a:avLst/>
+                          </a:prstGeom>
+                        </pic:spPr>
+                      </pic:pic>
+                    </a:graphicData>
+                  </a:graphic>
+                </wp:inline>
+              </w:drawing>
+            </w:r>
+          </w:p>
+          <w:p>
+            <w:pPr>
+              <w:spacing w:after="60" w:before="0"/>
+              <w:jc w:val="center"/>
+            </w:pPr>
+            <w:r>
+              <w:rPr>
+                <w:rFonts w:ascii="DM Sans" w:cs="DM Sans" w:eastAsia="DM Sans" w:hAnsi="DM Sans"/>
+                <w:b/>
+                <w:bCs/>
+                <w:color w:val="334155"/>
+                <w:sz w:val="18"/>
+                <w:szCs w:val="18"/>
+              </w:rPr>
+              <w:t xml:space="preserve">Circle</w:t>
+            </w:r>
+          </w:p>
+        </w:tc>
+        <w:tc>
+          <w:tcPr>
+            <w:tcW w:type="dxa" w:w="3010"/>
+            <w:tcBorders>
+              <w:top w:val="none" w:color="FFFFFF" w:sz="0"/>
+              <w:left w:val="none" w:color="FFFFFF" w:sz="0"/>
+              <w:bottom w:val="none" w:color="FFFFFF" w:sz="0"/>
+              <w:right w:val="none" w:color="FFFFFF" w:sz="0"/>
+            </w:tcBorders>
+            <w:tcMar>
+              <w:top w:type="dxa" w:w="100"/>
+              <w:left w:type="dxa" w:w="80"/>
+              <w:bottom w:type="dxa" w:w="100"/>
+              <w:right w:type="dxa" w:w="80"/>
+            </w:tcMar>
+          </w:tcPr>
+          <w:p>
+            <w:pPr>
+              <w:spacing w:after="40" w:before="0"/>
+              <w:jc w:val="center"/>
+            </w:pPr>
+            <w:r>
+              <w:drawing>
+                <wp:inline distT="0" distB="0" distL="0" distR="0">
+                  <wp:extent cx="1428750" cy="1047750"/>
+                  <wp:effectExtent t="0" r="0" b="0" l="0"/>
+                  <wp:docPr id="1" name="traj-cross" descr="Spatial map showing the Cross trajectory path" title="Cross trajectory"/>
+                  <wp:cNvGraphicFramePr>
+                    <a:graphicFrameLocks xmlns:a="http://schemas.openxmlformats.org/drawingml/2006/main" noChangeAspect="1"/>
+                  </wp:cNvGraphicFramePr>
+                  <a:graphic xmlns:a="http://schemas.openxmlformats.org/drawingml/2006/main">
+                    <a:graphicData uri="http://schemas.openxmlformats.org/drawingml/2006/picture">
+                      <pic:pic xmlns:pic="http://schemas.openxmlformats.org/drawingml/2006/picture">
+                        <pic:nvPicPr>
+                          <pic:cNvPr id="0" name="" descr=""/>
+                          <pic:cNvPicPr>
+                            <a:picLocks noChangeAspect="1" noChangeArrowheads="1"/>
+                          </pic:cNvPicPr>
+                        </pic:nvPicPr>
+                        <pic:blipFill>
+                          <a:blip r:embed="rId20" cstate="none"/>
+                          <a:srcRect/>
+                          <a:stretch>
+                            <a:fillRect/>
+                          </a:stretch>
+                        </pic:blipFill>
+                        <pic:spPr bwMode="auto">
+                          <a:xfrm>
+                            <a:off x="0" y="0"/>
+                            <a:ext cx="1428750" cy="1047750"/>
+                          </a:xfrm>
+                          <a:prstGeom prst="rect">
+                            <a:avLst/>
+                          </a:prstGeom>
+                        </pic:spPr>
+                      </pic:pic>
+                    </a:graphicData>
+                  </a:graphic>
+                </wp:inline>
+              </w:drawing>
+            </w:r>
+          </w:p>
+          <w:p>
+            <w:pPr>
+              <w:spacing w:after="60" w:before="0"/>
+              <w:jc w:val="center"/>
+            </w:pPr>
+            <w:r>
+              <w:rPr>
+                <w:rFonts w:ascii="DM Sans" w:cs="DM Sans" w:eastAsia="DM Sans" w:hAnsi="DM Sans"/>
+                <w:b/>
+                <w:bCs/>
+                <w:color w:val="334155"/>
+                <w:sz w:val="18"/>
+                <w:szCs w:val="18"/>
+              </w:rPr>
+              <w:t xml:space="preserve">Cross</w:t>
+            </w:r>
+          </w:p>
+        </w:tc>
+      </w:tr>
+      <w:tr>
+        <w:tc>
+          <w:tcPr>
+            <w:tcW w:type="dxa" w:w="3008"/>
+            <w:tcBorders>
+              <w:top w:val="none" w:color="FFFFFF" w:sz="0"/>
+              <w:left w:val="none" w:color="FFFFFF" w:sz="0"/>
+              <w:bottom w:val="none" w:color="FFFFFF" w:sz="0"/>
+              <w:right w:val="none" w:color="FFFFFF" w:sz="0"/>
+            </w:tcBorders>
+            <w:tcMar>
+              <w:top w:type="dxa" w:w="100"/>
+              <w:left w:type="dxa" w:w="80"/>
+              <w:bottom w:type="dxa" w:w="100"/>
+              <w:right w:type="dxa" w:w="80"/>
+            </w:tcMar>
+          </w:tcPr>
+          <w:p>
+            <w:pPr>
+              <w:spacing w:after="40" w:before="0"/>
+              <w:jc w:val="center"/>
+            </w:pPr>
+            <w:r>
+              <w:drawing>
+                <wp:inline distT="0" distB="0" distL="0" distR="0">
+                  <wp:extent cx="1428750" cy="1047750"/>
+                  <wp:effectExtent t="0" r="0" b="0" l="0"/>
+                  <wp:docPr id="1" name="traj-figure8" descr="Spatial map showing the Figure-8 trajectory path" title="Figure-8 trajectory"/>
+                  <wp:cNvGraphicFramePr>
+                    <a:graphicFrameLocks xmlns:a="http://schemas.openxmlformats.org/drawingml/2006/main" noChangeAspect="1"/>
+                  </wp:cNvGraphicFramePr>
+                  <a:graphic xmlns:a="http://schemas.openxmlformats.org/drawingml/2006/main">
+                    <a:graphicData uri="http://schemas.openxmlformats.org/drawingml/2006/picture">
+                      <pic:pic xmlns:pic="http://schemas.openxmlformats.org/drawingml/2006/picture">
+                        <pic:nvPicPr>
+                          <pic:cNvPr id="0" name="" descr=""/>
+                          <pic:cNvPicPr>
+                            <a:picLocks noChangeAspect="1" noChangeArrowheads="1"/>
+                          </pic:cNvPicPr>
+                        </pic:nvPicPr>
+                        <pic:blipFill>
+                          <a:blip r:embed="rId21" cstate="none"/>
+                          <a:srcRect/>
+                          <a:stretch>
+                            <a:fillRect/>
+                          </a:stretch>
+                        </pic:blipFill>
+                        <pic:spPr bwMode="auto">
+                          <a:xfrm>
+                            <a:off x="0" y="0"/>
+                            <a:ext cx="1428750" cy="1047750"/>
+                          </a:xfrm>
+                          <a:prstGeom prst="rect">
+                            <a:avLst/>
+                          </a:prstGeom>
+                        </pic:spPr>
+                      </pic:pic>
+                    </a:graphicData>
+                  </a:graphic>
+                </wp:inline>
+              </w:drawing>
+            </w:r>
+          </w:p>
+          <w:p>
+            <w:pPr>
+              <w:spacing w:after="60" w:before="0"/>
+              <w:jc w:val="center"/>
+            </w:pPr>
+            <w:r>
+              <w:rPr>
+                <w:rFonts w:ascii="DM Sans" w:cs="DM Sans" w:eastAsia="DM Sans" w:hAnsi="DM Sans"/>
+                <w:b/>
+                <w:bCs/>
+                <w:color w:val="334155"/>
+                <w:sz w:val="18"/>
+                <w:szCs w:val="18"/>
+              </w:rPr>
+              <w:t xml:space="preserve">Figure-8</w:t>
+            </w:r>
+          </w:p>
+        </w:tc>
+        <w:tc>
+          <w:tcPr>
+            <w:tcW w:type="dxa" w:w="3008"/>
+            <w:tcBorders>
+              <w:top w:val="none" w:color="FFFFFF" w:sz="0"/>
+              <w:left w:val="none" w:color="FFFFFF" w:sz="0"/>
+              <w:bottom w:val="none" w:color="FFFFFF" w:sz="0"/>
+              <w:right w:val="none" w:color="FFFFFF" w:sz="0"/>
+            </w:tcBorders>
+            <w:tcMar>
+              <w:top w:type="dxa" w:w="100"/>
+              <w:left w:type="dxa" w:w="80"/>
+              <w:bottom w:type="dxa" w:w="100"/>
+              <w:right w:type="dxa" w:w="80"/>
+            </w:tcMar>
+          </w:tcPr>
+          <w:p>
+            <w:pPr>
+              <w:spacing w:after="40" w:before="0"/>
+              <w:jc w:val="center"/>
+            </w:pPr>
+            <w:r>
+              <w:drawing>
+                <wp:inline distT="0" distB="0" distL="0" distR="0">
+                  <wp:extent cx="1428750" cy="1047750"/>
+                  <wp:effectExtent t="0" r="0" b="0" l="0"/>
+                  <wp:docPr id="1" name="traj-heart" descr="Spatial map showing the Heart trajectory path" title="Heart trajectory"/>
+                  <wp:cNvGraphicFramePr>
+                    <a:graphicFrameLocks xmlns:a="http://schemas.openxmlformats.org/drawingml/2006/main" noChangeAspect="1"/>
+                  </wp:cNvGraphicFramePr>
+                  <a:graphic xmlns:a="http://schemas.openxmlformats.org/drawingml/2006/main">
+                    <a:graphicData uri="http://schemas.openxmlformats.org/drawingml/2006/picture">
+                      <pic:pic xmlns:pic="http://schemas.openxmlformats.org/drawingml/2006/picture">
+                        <pic:nvPicPr>
+                          <pic:cNvPr id="0" name="" descr=""/>
+                          <pic:cNvPicPr>
+                            <a:picLocks noChangeAspect="1" noChangeArrowheads="1"/>
+                          </pic:cNvPicPr>
+                        </pic:nvPicPr>
+                        <pic:blipFill>
+                          <a:blip r:embed="rId22" cstate="none"/>
+                          <a:srcRect/>
+                          <a:stretch>
+                            <a:fillRect/>
+                          </a:stretch>
+                        </pic:blipFill>
+                        <pic:spPr bwMode="auto">
+                          <a:xfrm>
+                            <a:off x="0" y="0"/>
+                            <a:ext cx="1428750" cy="1047750"/>
+                          </a:xfrm>
+                          <a:prstGeom prst="rect">
+                            <a:avLst/>
+                          </a:prstGeom>
+                        </pic:spPr>
+                      </pic:pic>
+                    </a:graphicData>
+                  </a:graphic>
+                </wp:inline>
+              </w:drawing>
+            </w:r>
+          </w:p>
+          <w:p>
+            <w:pPr>
+              <w:spacing w:after="60" w:before="0"/>
+              <w:jc w:val="center"/>
+            </w:pPr>
+            <w:r>
+              <w:rPr>
+                <w:rFonts w:ascii="DM Sans" w:cs="DM Sans" w:eastAsia="DM Sans" w:hAnsi="DM Sans"/>
+                <w:b/>
+                <w:bCs/>
+                <w:color w:val="334155"/>
+                <w:sz w:val="18"/>
+                <w:szCs w:val="18"/>
+              </w:rPr>
+              <w:t xml:space="preserve">Heart</w:t>
+            </w:r>
+          </w:p>
+        </w:tc>
+        <w:tc>
+          <w:tcPr>
+            <w:tcW w:type="dxa" w:w="3010"/>
+            <w:tcBorders>
+              <w:top w:val="none" w:color="FFFFFF" w:sz="0"/>
+              <w:left w:val="none" w:color="FFFFFF" w:sz="0"/>
+              <w:bottom w:val="none" w:color="FFFFFF" w:sz="0"/>
+              <w:right w:val="none" w:color="FFFFFF" w:sz="0"/>
+            </w:tcBorders>
+            <w:tcMar>
+              <w:top w:type="dxa" w:w="100"/>
+              <w:left w:type="dxa" w:w="80"/>
+              <w:bottom w:type="dxa" w:w="100"/>
+              <w:right w:type="dxa" w:w="80"/>
+            </w:tcMar>
+          </w:tcPr>
+          <w:p>
+            <w:pPr>
+              <w:spacing w:after="40" w:before="0"/>
+              <w:jc w:val="center"/>
+            </w:pPr>
+            <w:r>
+              <w:drawing>
+                <wp:inline distT="0" distB="0" distL="0" distR="0">
+                  <wp:extent cx="1428750" cy="1047750"/>
+                  <wp:effectExtent t="0" r="0" b="0" l="0"/>
+                  <wp:docPr id="1" name="traj-helix" descr="Spatial map showing the Helix trajectory path" title="Helix trajectory"/>
+                  <wp:cNvGraphicFramePr>
+                    <a:graphicFrameLocks xmlns:a="http://schemas.openxmlformats.org/drawingml/2006/main" noChangeAspect="1"/>
+                  </wp:cNvGraphicFramePr>
+                  <a:graphic xmlns:a="http://schemas.openxmlformats.org/drawingml/2006/main">
+                    <a:graphicData uri="http://schemas.openxmlformats.org/drawingml/2006/picture">
+                      <pic:pic xmlns:pic="http://schemas.openxmlformats.org/drawingml/2006/picture">
+                        <pic:nvPicPr>
+                          <pic:cNvPr id="0" name="" descr=""/>
+                          <pic:cNvPicPr>
+                            <a:picLocks noChangeAspect="1" noChangeArrowheads="1"/>
+                          </pic:cNvPicPr>
+                        </pic:nvPicPr>
+                        <pic:blipFill>
+                          <a:blip r:embed="rId23" cstate="none"/>
+                          <a:srcRect/>
+                          <a:stretch>
+                            <a:fillRect/>
+                          </a:stretch>
+                        </pic:blipFill>
+                        <pic:spPr bwMode="auto">
+                          <a:xfrm>
+                            <a:off x="0" y="0"/>
+                            <a:ext cx="1428750" cy="1047750"/>
+                          </a:xfrm>
+                          <a:prstGeom prst="rect">
+                            <a:avLst/>
+                          </a:prstGeom>
+                        </pic:spPr>
+                      </pic:pic>
+                    </a:graphicData>
+                  </a:graphic>
+                </wp:inline>
+              </w:drawing>
+            </w:r>
+          </w:p>
+          <w:p>
+            <w:pPr>
+              <w:spacing w:after="60" w:before="0"/>
+              <w:jc w:val="center"/>
+            </w:pPr>
+            <w:r>
+              <w:rPr>
+                <w:rFonts w:ascii="DM Sans" w:cs="DM Sans" w:eastAsia="DM Sans" w:hAnsi="DM Sans"/>
+                <w:b/>
+                <w:bCs/>
+                <w:color w:val="334155"/>
+                <w:sz w:val="18"/>
+                <w:szCs w:val="18"/>
+              </w:rPr>
+              <w:t xml:space="preserve">Helix</w:t>
+            </w:r>
+          </w:p>
+        </w:tc>
+      </w:tr>
+      <w:tr>
+        <w:tc>
+          <w:tcPr>
+            <w:tcW w:type="dxa" w:w="3008"/>
+            <w:tcBorders>
+              <w:top w:val="none" w:color="FFFFFF" w:sz="0"/>
+              <w:left w:val="none" w:color="FFFFFF" w:sz="0"/>
+              <w:bottom w:val="none" w:color="FFFFFF" w:sz="0"/>
+              <w:right w:val="none" w:color="FFFFFF" w:sz="0"/>
+            </w:tcBorders>
+            <w:tcMar>
+              <w:top w:type="dxa" w:w="100"/>
+              <w:left w:type="dxa" w:w="80"/>
+              <w:bottom w:type="dxa" w:w="100"/>
+              <w:right w:type="dxa" w:w="80"/>
+            </w:tcMar>
+          </w:tcPr>
+          <w:p>
+            <w:pPr>
+              <w:spacing w:after="40" w:before="0"/>
+              <w:jc w:val="center"/>
+            </w:pPr>
+            <w:r>
+              <w:drawing>
+                <wp:inline distT="0" distB="0" distL="0" distR="0">
+                  <wp:extent cx="1428750" cy="1047750"/>
+                  <wp:effectExtent t="0" r="0" b="0" l="0"/>
+                  <wp:docPr id="1" name="traj-infinity" descr="Spatial map showing the Infinity trajectory path" title="Infinity trajectory"/>
+                  <wp:cNvGraphicFramePr>
+                    <a:graphicFrameLocks xmlns:a="http://schemas.openxmlformats.org/drawingml/2006/main" noChangeAspect="1"/>
+                  </wp:cNvGraphicFramePr>
+                  <a:graphic xmlns:a="http://schemas.openxmlformats.org/drawingml/2006/main">
+                    <a:graphicData uri="http://schemas.openxmlformats.org/drawingml/2006/picture">
+                      <pic:pic xmlns:pic="http://schemas.openxmlformats.org/drawingml/2006/picture">
+                        <pic:nvPicPr>
+                          <pic:cNvPr id="0" name="" descr=""/>
+                          <pic:cNvPicPr>
+                            <a:picLocks noChangeAspect="1" noChangeArrowheads="1"/>
+                          </pic:cNvPicPr>
+                        </pic:nvPicPr>
+                        <pic:blipFill>
+                          <a:blip r:embed="rId24" cstate="none"/>
+                          <a:srcRect/>
+                          <a:stretch>
+                            <a:fillRect/>
+                          </a:stretch>
+                        </pic:blipFill>
+                        <pic:spPr bwMode="auto">
+                          <a:xfrm>
+                            <a:off x="0" y="0"/>
+                            <a:ext cx="1428750" cy="1047750"/>
+                          </a:xfrm>
+                          <a:prstGeom prst="rect">
+                            <a:avLst/>
+                          </a:prstGeom>
+                        </pic:spPr>
+                      </pic:pic>
+                    </a:graphicData>
+                  </a:graphic>
+                </wp:inline>
+              </w:drawing>
+            </w:r>
+          </w:p>
+          <w:p>
+            <w:pPr>
+              <w:spacing w:after="60" w:before="0"/>
+              <w:jc w:val="center"/>
+            </w:pPr>
+            <w:r>
+              <w:rPr>
+                <w:rFonts w:ascii="DM Sans" w:cs="DM Sans" w:eastAsia="DM Sans" w:hAnsi="DM Sans"/>
+                <w:b/>
+                <w:bCs/>
+                <w:color w:val="334155"/>
+                <w:sz w:val="18"/>
+                <w:szCs w:val="18"/>
+              </w:rPr>
+              <w:t xml:space="preserve">Infinity</w:t>
+            </w:r>
+          </w:p>
+        </w:tc>
+        <w:tc>
+          <w:tcPr>
+            <w:tcW w:type="dxa" w:w="3008"/>
+            <w:tcBorders>
+              <w:top w:val="none" w:color="FFFFFF" w:sz="0"/>
+              <w:left w:val="none" w:color="FFFFFF" w:sz="0"/>
+              <w:bottom w:val="none" w:color="FFFFFF" w:sz="0"/>
+              <w:right w:val="none" w:color="FFFFFF" w:sz="0"/>
+            </w:tcBorders>
+            <w:tcMar>
+              <w:top w:type="dxa" w:w="100"/>
+              <w:left w:type="dxa" w:w="80"/>
+              <w:bottom w:type="dxa" w:w="100"/>
+              <w:right w:type="dxa" w:w="80"/>
+            </w:tcMar>
+          </w:tcPr>
+          <w:p>
+            <w:pPr>
+              <w:spacing w:after="40" w:before="0"/>
+              <w:jc w:val="center"/>
+            </w:pPr>
+            <w:r>
+              <w:drawing>
+                <wp:inline distT="0" distB="0" distL="0" distR="0">
+                  <wp:extent cx="1428750" cy="1047750"/>
+                  <wp:effectExtent t="0" r="0" b="0" l="0"/>
+                  <wp:docPr id="1" name="traj-line" descr="Spatial map showing the Line trajectory path" title="Line trajectory"/>
+                  <wp:cNvGraphicFramePr>
+                    <a:graphicFrameLocks xmlns:a="http://schemas.openxmlformats.org/drawingml/2006/main" noChangeAspect="1"/>
+                  </wp:cNvGraphicFramePr>
+                  <a:graphic xmlns:a="http://schemas.openxmlformats.org/drawingml/2006/main">
+                    <a:graphicData uri="http://schemas.openxmlformats.org/drawingml/2006/picture">
+                      <pic:pic xmlns:pic="http://schemas.openxmlformats.org/drawingml/2006/picture">
+                        <pic:nvPicPr>
+                          <pic:cNvPr id="0" name="" descr=""/>
+                          <pic:cNvPicPr>
+                            <a:picLocks noChangeAspect="1" noChangeArrowheads="1"/>
+                          </pic:cNvPicPr>
+                        </pic:nvPicPr>
+                        <pic:blipFill>
+                          <a:blip r:embed="rId25" cstate="none"/>
+                          <a:srcRect/>
+                          <a:stretch>
+                            <a:fillRect/>
+                          </a:stretch>
+                        </pic:blipFill>
+                        <pic:spPr bwMode="auto">
+                          <a:xfrm>
+                            <a:off x="0" y="0"/>
+                            <a:ext cx="1428750" cy="1047750"/>
+                          </a:xfrm>
+                          <a:prstGeom prst="rect">
+                            <a:avLst/>
+                          </a:prstGeom>
+                        </pic:spPr>
+                      </pic:pic>
+                    </a:graphicData>
+                  </a:graphic>
+                </wp:inline>
+              </w:drawing>
+            </w:r>
+          </w:p>
+          <w:p>
+            <w:pPr>
+              <w:spacing w:after="60" w:before="0"/>
+              <w:jc w:val="center"/>
+            </w:pPr>
+            <w:r>
+              <w:rPr>
+                <w:rFonts w:ascii="DM Sans" w:cs="DM Sans" w:eastAsia="DM Sans" w:hAnsi="DM Sans"/>
+                <w:b/>
+                <w:bCs/>
+                <w:color w:val="334155"/>
+                <w:sz w:val="18"/>
+                <w:szCs w:val="18"/>
+              </w:rPr>
+              <w:t xml:space="preserve">Line</w:t>
+            </w:r>
+          </w:p>
+        </w:tc>
+        <w:tc>
+          <w:tcPr>
+            <w:tcW w:type="dxa" w:w="3010"/>
+            <w:tcBorders>
+              <w:top w:val="none" w:color="FFFFFF" w:sz="0"/>
+              <w:left w:val="none" w:color="FFFFFF" w:sz="0"/>
+              <w:bottom w:val="none" w:color="FFFFFF" w:sz="0"/>
+              <w:right w:val="none" w:color="FFFFFF" w:sz="0"/>
+            </w:tcBorders>
+            <w:tcMar>
+              <w:top w:type="dxa" w:w="100"/>
+              <w:left w:type="dxa" w:w="80"/>
+              <w:bottom w:type="dxa" w:w="100"/>
+              <w:right w:type="dxa" w:w="80"/>
+            </w:tcMar>
+          </w:tcPr>
+          <w:p>
+            <w:pPr>
+              <w:spacing w:after="40" w:before="0"/>
+              <w:jc w:val="center"/>
+            </w:pPr>
+            <w:r>
+              <w:drawing>
+                <wp:inline distT="0" distB="0" distL="0" distR="0">
+                  <wp:extent cx="1428750" cy="1047750"/>
+                  <wp:effectExtent t="0" r="0" b="0" l="0"/>
+                  <wp:docPr id="1" name="traj-orbit" descr="Spatial map showing the Orbit trajectory path" title="Orbit trajectory"/>
+                  <wp:cNvGraphicFramePr>
+                    <a:graphicFrameLocks xmlns:a="http://schemas.openxmlformats.org/drawingml/2006/main" noChangeAspect="1"/>
+                  </wp:cNvGraphicFramePr>
+                  <a:graphic xmlns:a="http://schemas.openxmlformats.org/drawingml/2006/main">
+                    <a:graphicData uri="http://schemas.openxmlformats.org/drawingml/2006/picture">
+                      <pic:pic xmlns:pic="http://schemas.openxmlformats.org/drawingml/2006/picture">
+                        <pic:nvPicPr>
+                          <pic:cNvPr id="0" name="" descr=""/>
+                          <pic:cNvPicPr>
+                            <a:picLocks noChangeAspect="1" noChangeArrowheads="1"/>
+                          </pic:cNvPicPr>
+                        </pic:nvPicPr>
+                        <pic:blipFill>
+                          <a:blip r:embed="rId26" cstate="none"/>
+                          <a:srcRect/>
+                          <a:stretch>
+                            <a:fillRect/>
+                          </a:stretch>
+                        </pic:blipFill>
+                        <pic:spPr bwMode="auto">
+                          <a:xfrm>
+                            <a:off x="0" y="0"/>
+                            <a:ext cx="1428750" cy="1047750"/>
+                          </a:xfrm>
+                          <a:prstGeom prst="rect">
+                            <a:avLst/>
+                          </a:prstGeom>
+                        </pic:spPr>
+                      </pic:pic>
+                    </a:graphicData>
+                  </a:graphic>
+                </wp:inline>
+              </w:drawing>
+            </w:r>
+          </w:p>
+          <w:p>
+            <w:pPr>
+              <w:spacing w:after="60" w:before="0"/>
+              <w:jc w:val="center"/>
+            </w:pPr>
+            <w:r>
+              <w:rPr>
+                <w:rFonts w:ascii="DM Sans" w:cs="DM Sans" w:eastAsia="DM Sans" w:hAnsi="DM Sans"/>
+                <w:b/>
+                <w:bCs/>
+                <w:color w:val="334155"/>
+                <w:sz w:val="18"/>
+                <w:szCs w:val="18"/>
+              </w:rPr>
+              <w:t xml:space="preserve">Orbit</w:t>
+            </w:r>
+          </w:p>
+        </w:tc>
+      </w:tr>
+      <w:tr>
+        <w:tc>
+          <w:tcPr>
+            <w:tcW w:type="dxa" w:w="3008"/>
+            <w:tcBorders>
+              <w:top w:val="none" w:color="FFFFFF" w:sz="0"/>
+              <w:left w:val="none" w:color="FFFFFF" w:sz="0"/>
+              <w:bottom w:val="none" w:color="FFFFFF" w:sz="0"/>
+              <w:right w:val="none" w:color="FFFFFF" w:sz="0"/>
+            </w:tcBorders>
+            <w:tcMar>
+              <w:top w:type="dxa" w:w="100"/>
+              <w:left w:type="dxa" w:w="80"/>
+              <w:bottom w:type="dxa" w:w="100"/>
+              <w:right w:type="dxa" w:w="80"/>
+            </w:tcMar>
+          </w:tcPr>
+          <w:p>
+            <w:pPr>
+              <w:spacing w:after="40" w:before="0"/>
+              <w:jc w:val="center"/>
+            </w:pPr>
+            <w:r>
+              <w:drawing>
+                <wp:inline distT="0" distB="0" distL="0" distR="0">
+                  <wp:extent cx="1428750" cy="1047750"/>
+                  <wp:effectExtent t="0" r="0" b="0" l="0"/>
+                  <wp:docPr id="1" name="traj-random" descr="Spatial map showing the Random trajectory path" title="Random trajectory"/>
+                  <wp:cNvGraphicFramePr>
+                    <a:graphicFrameLocks xmlns:a="http://schemas.openxmlformats.org/drawingml/2006/main" noChangeAspect="1"/>
+                  </wp:cNvGraphicFramePr>
+                  <a:graphic xmlns:a="http://schemas.openxmlformats.org/drawingml/2006/main">
+                    <a:graphicData uri="http://schemas.openxmlformats.org/drawingml/2006/picture">
+                      <pic:pic xmlns:pic="http://schemas.openxmlformats.org/drawingml/2006/picture">
+                        <pic:nvPicPr>
+                          <pic:cNvPr id="0" name="" descr=""/>
+                          <pic:cNvPicPr>
+                            <a:picLocks noChangeAspect="1" noChangeArrowheads="1"/>
+                          </pic:cNvPicPr>
+                        </pic:nvPicPr>
+                        <pic:blipFill>
+                          <a:blip r:embed="rId27" cstate="none"/>
+                          <a:srcRect/>
+                          <a:stretch>
+                            <a:fillRect/>
+                          </a:stretch>
+                        </pic:blipFill>
+                        <pic:spPr bwMode="auto">
+                          <a:xfrm>
+                            <a:off x="0" y="0"/>
+                            <a:ext cx="1428750" cy="1047750"/>
+                          </a:xfrm>
+                          <a:prstGeom prst="rect">
+                            <a:avLst/>
+                          </a:prstGeom>
+                        </pic:spPr>
+                      </pic:pic>
+                    </a:graphicData>
+                  </a:graphic>
+                </wp:inline>
+              </w:drawing>
+            </w:r>
+          </w:p>
+          <w:p>
+            <w:pPr>
+              <w:spacing w:after="60" w:before="0"/>
+              <w:jc w:val="center"/>
+            </w:pPr>
+            <w:r>
+              <w:rPr>
+                <w:rFonts w:ascii="DM Sans" w:cs="DM Sans" w:eastAsia="DM Sans" w:hAnsi="DM Sans"/>
+                <w:b/>
+                <w:bCs/>
+                <w:color w:val="334155"/>
+                <w:sz w:val="18"/>
+                <w:szCs w:val="18"/>
+              </w:rPr>
+              <w:t xml:space="preserve">Random</w:t>
+            </w:r>
+          </w:p>
+        </w:tc>
+        <w:tc>
+          <w:tcPr>
+            <w:tcW w:type="dxa" w:w="3008"/>
+            <w:tcBorders>
+              <w:top w:val="none" w:color="FFFFFF" w:sz="0"/>
+              <w:left w:val="none" w:color="FFFFFF" w:sz="0"/>
+              <w:bottom w:val="none" w:color="FFFFFF" w:sz="0"/>
+              <w:right w:val="none" w:color="FFFFFF" w:sz="0"/>
+            </w:tcBorders>
+            <w:tcMar>
+              <w:top w:type="dxa" w:w="100"/>
+              <w:left w:type="dxa" w:w="80"/>
+              <w:bottom w:type="dxa" w:w="100"/>
+              <w:right w:type="dxa" w:w="80"/>
+            </w:tcMar>
+          </w:tcPr>
+          <w:p>
+            <w:pPr>
+              <w:spacing w:after="40" w:before="0"/>
+              <w:jc w:val="center"/>
+            </w:pPr>
+            <w:r>
+              <w:drawing>
+                <wp:inline distT="0" distB="0" distL="0" distR="0">
+                  <wp:extent cx="1428750" cy="1047750"/>
+                  <wp:effectExtent t="0" r="0" b="0" l="0"/>
+                  <wp:docPr id="1" name="traj-spiral" descr="Spatial map showing the Spiral trajectory path" title="Spiral trajectory"/>
+                  <wp:cNvGraphicFramePr>
+                    <a:graphicFrameLocks xmlns:a="http://schemas.openxmlformats.org/drawingml/2006/main" noChangeAspect="1"/>
+                  </wp:cNvGraphicFramePr>
+                  <a:graphic xmlns:a="http://schemas.openxmlformats.org/drawingml/2006/main">
+                    <a:graphicData uri="http://schemas.openxmlformats.org/drawingml/2006/picture">
+                      <pic:pic xmlns:pic="http://schemas.openxmlformats.org/drawingml/2006/picture">
+                        <pic:nvPicPr>
+                          <pic:cNvPr id="0" name="" descr=""/>
+                          <pic:cNvPicPr>
+                            <a:picLocks noChangeAspect="1" noChangeArrowheads="1"/>
+                          </pic:cNvPicPr>
+                        </pic:nvPicPr>
+                        <pic:blipFill>
+                          <a:blip r:embed="rId28" cstate="none"/>
+                          <a:srcRect/>
+                          <a:stretch>
+                            <a:fillRect/>
+                          </a:stretch>
+                        </pic:blipFill>
+                        <pic:spPr bwMode="auto">
+                          <a:xfrm>
+                            <a:off x="0" y="0"/>
+                            <a:ext cx="1428750" cy="1047750"/>
+                          </a:xfrm>
+                          <a:prstGeom prst="rect">
+                            <a:avLst/>
+                          </a:prstGeom>
+                        </pic:spPr>
+                      </pic:pic>
+                    </a:graphicData>
+                  </a:graphic>
+                </wp:inline>
+              </w:drawing>
+            </w:r>
+          </w:p>
+          <w:p>
+            <w:pPr>
+              <w:spacing w:after="60" w:before="0"/>
+              <w:jc w:val="center"/>
+            </w:pPr>
+            <w:r>
+              <w:rPr>
+                <w:rFonts w:ascii="DM Sans" w:cs="DM Sans" w:eastAsia="DM Sans" w:hAnsi="DM Sans"/>
+                <w:b/>
+                <w:bCs/>
+                <w:color w:val="334155"/>
+                <w:sz w:val="18"/>
+                <w:szCs w:val="18"/>
+              </w:rPr>
+              <w:t xml:space="preserve">Spiral</w:t>
+            </w:r>
+          </w:p>
+        </w:tc>
+        <w:tc>
+          <w:tcPr>
+            <w:tcW w:type="dxa" w:w="3010"/>
+            <w:tcBorders>
+              <w:top w:val="none" w:color="FFFFFF" w:sz="0"/>
+              <w:left w:val="none" w:color="FFFFFF" w:sz="0"/>
+              <w:bottom w:val="none" w:color="FFFFFF" w:sz="0"/>
+              <w:right w:val="none" w:color="FFFFFF" w:sz="0"/>
+            </w:tcBorders>
+            <w:tcMar>
+              <w:top w:type="dxa" w:w="100"/>
+              <w:left w:type="dxa" w:w="80"/>
+              <w:bottom w:type="dxa" w:w="100"/>
+              <w:right w:type="dxa" w:w="80"/>
+            </w:tcMar>
+          </w:tcPr>
+          <w:p>
+            <w:pPr>
+              <w:spacing w:after="40" w:before="0"/>
+              <w:jc w:val="center"/>
+            </w:pPr>
+            <w:r>
+              <w:drawing>
+                <wp:inline distT="0" distB="0" distL="0" distR="0">
+                  <wp:extent cx="1428750" cy="1047750"/>
+                  <wp:effectExtent t="0" r="0" b="0" l="0"/>
+                  <wp:docPr id="1" name="traj-square" descr="Spatial map showing the Square trajectory path" title="Square trajectory"/>
+                  <wp:cNvGraphicFramePr>
+                    <a:graphicFrameLocks xmlns:a="http://schemas.openxmlformats.org/drawingml/2006/main" noChangeAspect="1"/>
+                  </wp:cNvGraphicFramePr>
+                  <a:graphic xmlns:a="http://schemas.openxmlformats.org/drawingml/2006/main">
+                    <a:graphicData uri="http://schemas.openxmlformats.org/drawingml/2006/picture">
+                      <pic:pic xmlns:pic="http://schemas.openxmlformats.org/drawingml/2006/picture">
+                        <pic:nvPicPr>
+                          <pic:cNvPr id="0" name="" descr=""/>
+                          <pic:cNvPicPr>
+                            <a:picLocks noChangeAspect="1" noChangeArrowheads="1"/>
+                          </pic:cNvPicPr>
+                        </pic:nvPicPr>
+                        <pic:blipFill>
+                          <a:blip r:embed="rId29" cstate="none"/>
+                          <a:srcRect/>
+                          <a:stretch>
+                            <a:fillRect/>
+                          </a:stretch>
+                        </pic:blipFill>
+                        <pic:spPr bwMode="auto">
+                          <a:xfrm>
+                            <a:off x="0" y="0"/>
+                            <a:ext cx="1428750" cy="1047750"/>
+                          </a:xfrm>
+                          <a:prstGeom prst="rect">
+                            <a:avLst/>
+                          </a:prstGeom>
+                        </pic:spPr>
+                      </pic:pic>
+                    </a:graphicData>
+                  </a:graphic>
+                </wp:inline>
+              </w:drawing>
+            </w:r>
+          </w:p>
+          <w:p>
+            <w:pPr>
+              <w:spacing w:after="60" w:before="0"/>
+              <w:jc w:val="center"/>
+            </w:pPr>
+            <w:r>
+              <w:rPr>
+                <w:rFonts w:ascii="DM Sans" w:cs="DM Sans" w:eastAsia="DM Sans" w:hAnsi="DM Sans"/>
+                <w:b/>
+                <w:bCs/>
+                <w:color w:val="334155"/>
+                <w:sz w:val="18"/>
+                <w:szCs w:val="18"/>
+              </w:rPr>
+              <w:t xml:space="preserve">Square</w:t>
+            </w:r>
+          </w:p>
+        </w:tc>
+      </w:tr>
+      <w:tr>
+        <w:tc>
+          <w:tcPr>
+            <w:tcW w:type="dxa" w:w="3008"/>
+            <w:tcBorders>
+              <w:top w:val="none" w:color="FFFFFF" w:sz="0"/>
+              <w:left w:val="none" w:color="FFFFFF" w:sz="0"/>
+              <w:bottom w:val="none" w:color="FFFFFF" w:sz="0"/>
+              <w:right w:val="none" w:color="FFFFFF" w:sz="0"/>
+            </w:tcBorders>
+            <w:tcMar>
+              <w:top w:type="dxa" w:w="100"/>
+              <w:left w:type="dxa" w:w="80"/>
+              <w:bottom w:type="dxa" w:w="100"/>
+              <w:right w:type="dxa" w:w="80"/>
+            </w:tcMar>
+          </w:tcPr>
+          <w:p>
+            <w:pPr>
+              <w:spacing w:after="40" w:before="0"/>
+              <w:jc w:val="center"/>
+            </w:pPr>
+            <w:r>
+              <w:drawing>
+                <wp:inline distT="0" distB="0" distL="0" distR="0">
+                  <wp:extent cx="1428750" cy="1047750"/>
+                  <wp:effectExtent t="0" r="0" b="0" l="0"/>
+                  <wp:docPr id="1" name="traj-triangle" descr="Spatial map showing the Triangle trajectory path" title="Triangle trajectory"/>
+                  <wp:cNvGraphicFramePr>
+                    <a:graphicFrameLocks xmlns:a="http://schemas.openxmlformats.org/drawingml/2006/main" noChangeAspect="1"/>
+                  </wp:cNvGraphicFramePr>
+                  <a:graphic xmlns:a="http://schemas.openxmlformats.org/drawingml/2006/main">
+                    <a:graphicData uri="http://schemas.openxmlformats.org/drawingml/2006/picture">
+                      <pic:pic xmlns:pic="http://schemas.openxmlformats.org/drawingml/2006/picture">
+                        <pic:nvPicPr>
+                          <pic:cNvPr id="0" name="" descr=""/>
+                          <pic:cNvPicPr>
+                            <a:picLocks noChangeAspect="1" noChangeArrowheads="1"/>
+                          </pic:cNvPicPr>
+                        </pic:nvPicPr>
+                        <pic:blipFill>
+                          <a:blip r:embed="rId30" cstate="none"/>
+                          <a:srcRect/>
+                          <a:stretch>
+                            <a:fillRect/>
+                          </a:stretch>
+                        </pic:blipFill>
+                        <pic:spPr bwMode="auto">
+                          <a:xfrm>
+                            <a:off x="0" y="0"/>
+                            <a:ext cx="1428750" cy="1047750"/>
+                          </a:xfrm>
+                          <a:prstGeom prst="rect">
+                            <a:avLst/>
+                          </a:prstGeom>
+                        </pic:spPr>
+                      </pic:pic>
+                    </a:graphicData>
+                  </a:graphic>
+                </wp:inline>
+              </w:drawing>
+            </w:r>
+          </w:p>
+          <w:p>
+            <w:pPr>
+              <w:spacing w:after="60" w:before="0"/>
+              <w:jc w:val="center"/>
+            </w:pPr>
+            <w:r>
+              <w:rPr>
+                <w:rFonts w:ascii="DM Sans" w:cs="DM Sans" w:eastAsia="DM Sans" w:hAnsi="DM Sans"/>
+                <w:b/>
+                <w:bCs/>
+                <w:color w:val="334155"/>
+                <w:sz w:val="18"/>
+                <w:szCs w:val="18"/>
+              </w:rPr>
+              <w:t xml:space="preserve">Triangle</w:t>
+            </w:r>
+          </w:p>
+        </w:tc>
+        <w:tc>
+          <w:tcPr>
+            <w:tcW w:type="dxa" w:w="3008"/>
+            <w:tcBorders>
+              <w:top w:val="none" w:color="FFFFFF" w:sz="0"/>
+              <w:left w:val="none" w:color="FFFFFF" w:sz="0"/>
+              <w:bottom w:val="none" w:color="FFFFFF" w:sz="0"/>
+              <w:right w:val="none" w:color="FFFFFF" w:sz="0"/>
+            </w:tcBorders>
+            <w:tcMar>
+              <w:top w:type="dxa" w:w="100"/>
+              <w:left w:type="dxa" w:w="80"/>
+              <w:bottom w:type="dxa" w:w="100"/>
+              <w:right w:type="dxa" w:w="80"/>
+            </w:tcMar>
+          </w:tcPr>
+          <w:p/>
+        </w:tc>
+        <w:tc>
+          <w:tcPr>
+            <w:tcW w:type="dxa" w:w="3010"/>
+            <w:tcBorders>
+              <w:top w:val="none" w:color="FFFFFF" w:sz="0"/>
+              <w:left w:val="none" w:color="FFFFFF" w:sz="0"/>
+              <w:bottom w:val="none" w:color="FFFFFF" w:sz="0"/>
+              <w:right w:val="none" w:color="FFFFFF" w:sz="0"/>
+            </w:tcBorders>
+            <w:tcMar>
+              <w:top w:type="dxa" w:w="100"/>
+              <w:left w:type="dxa" w:w="80"/>
+              <w:bottom w:type="dxa" w:w="100"/>
+              <w:right w:type="dxa" w:w="80"/>
+            </w:tcMar>
+          </w:tcPr>
+          <w:p/>
+        </w:tc>
+      </w:tr>
+    </w:tbl>
+    <w:p>
       <w:r>
         <w:br w:type="page"/>
       </w:r>
@@ -18326,7 +19504,7 @@
                     </pic:cNvPicPr>
                   </pic:nvPicPr>
                   <pic:blipFill>
-                    <a:blip r:embed="rId18" cstate="none"/>
+                    <a:blip r:embed="rId31" cstate="none"/>
                     <a:srcRect/>
                     <a:stretch>
                       <a:fillRect/>
@@ -18400,7 +19578,7 @@
         <w:spacing w:after="60"/>
         <w:jc w:val="center"/>
       </w:pPr>
-      <w:hyperlink w:history="1" r:id="rIdakjlj1cece2sfcci-0s-m">
+      <w:hyperlink w:history="1" r:id="rId6tgoezs_jswosqwdsvdgy">
         <w:r>
           <w:rPr>
             <w:rFonts w:ascii="DM Sans" w:cs="DM Sans" w:eastAsia="DM Sans" w:hAnsi="DM Sans"/>
@@ -18418,7 +19596,7 @@
         <w:spacing w:after="60"/>
         <w:jc w:val="center"/>
       </w:pPr>
-      <w:hyperlink w:history="1" r:id="rIdnzyckilgc9ci51ym6pjsj">
+      <w:hyperlink w:history="1" r:id="rIdgeo-50pmzvkimlayudoji">
         <w:r>
           <w:rPr>
             <w:rFonts w:ascii="DM Sans" w:cs="DM Sans" w:eastAsia="DM Sans" w:hAnsi="DM Sans"/>

</xml_diff>

<commit_message>
docs(manual): regenerate with pass 4 signal flow
</commit_message>
<xml_diff>
--- a/docs/OpenSpatialDelay_Manual_v1.0.docx
+++ b/docs/OpenSpatialDelay_Manual_v1.0.docx
@@ -1312,7 +1312,7 @@
         </w:rPr>
         <w:t xml:space="preserve">Download the latest release for your platform from the </w:t>
       </w:r>
-      <w:hyperlink w:history="1" r:id="rIdjgwhcowv_cpu8ign563xb">
+      <w:hyperlink w:history="1" r:id="rIda-zlxi_9k5fnhxoyw9xvz">
         <w:r>
           <w:rPr>
             <w:rFonts w:ascii="DM Sans" w:cs="DM Sans" w:eastAsia="DM Sans" w:hAnsi="DM Sans"/>
@@ -19578,7 +19578,7 @@
         <w:spacing w:after="60"/>
         <w:jc w:val="center"/>
       </w:pPr>
-      <w:hyperlink w:history="1" r:id="rIdwymwaaqk7p7fcwmnrp9hb">
+      <w:hyperlink w:history="1" r:id="rIdbro4ua_jjrqfxxkgewl_q">
         <w:r>
           <w:rPr>
             <w:rFonts w:ascii="DM Sans" w:cs="DM Sans" w:eastAsia="DM Sans" w:hAnsi="DM Sans"/>
@@ -19596,7 +19596,7 @@
         <w:spacing w:after="60"/>
         <w:jc w:val="center"/>
       </w:pPr>
-      <w:hyperlink w:history="1" r:id="rIdqxfs6odbp0qnafqsmydi_">
+      <w:hyperlink w:history="1" r:id="rIdoyzlnr0thryhlibrduatd">
         <w:r>
           <w:rPr>
             <w:rFonts w:ascii="DM Sans" w:cs="DM Sans" w:eastAsia="DM Sans" w:hAnsi="DM Sans"/>

</xml_diff>

<commit_message>
Manual regen — pass 4 signal flow (#213)
* docs(manual): regenerate with pass 4 signal flow

* docs(signal-flow): retire pass-4 handoff plans post-regen

The signal-flow track is complete:
- Pass 4 "Orbital Horizon" diagram signed off (PR #211)
- Manual DOCX + PDF regenerated with pass-4 PNG (this PR)
- Issue #168 already closed

Remove the two handoff plan files that are now historical:
- docs/SIGNAL_FLOW_READABILITY_PLAN.md
- docs/SIGNAL_FLOW_NEXT_SESSION.md

Update the one cross-reference in SCREENSHOT_REVIEW_ROUND_2.md to
point at the merged PRs instead of the deleted plan.

Full pass-4 history is preserved in the git log of the deleted
files plus the PR bodies of #211 and #213.
</commit_message>
<xml_diff>
--- a/docs/OpenSpatialDelay_Manual_v1.0.docx
+++ b/docs/OpenSpatialDelay_Manual_v1.0.docx
@@ -1312,7 +1312,7 @@
         </w:rPr>
         <w:t xml:space="preserve">Download the latest release for your platform from the </w:t>
       </w:r>
-      <w:hyperlink w:history="1" r:id="rIdjgwhcowv_cpu8ign563xb">
+      <w:hyperlink w:history="1" r:id="rIda-zlxi_9k5fnhxoyw9xvz">
         <w:r>
           <w:rPr>
             <w:rFonts w:ascii="DM Sans" w:cs="DM Sans" w:eastAsia="DM Sans" w:hAnsi="DM Sans"/>
@@ -19578,7 +19578,7 @@
         <w:spacing w:after="60"/>
         <w:jc w:val="center"/>
       </w:pPr>
-      <w:hyperlink w:history="1" r:id="rIdwymwaaqk7p7fcwmnrp9hb">
+      <w:hyperlink w:history="1" r:id="rIdbro4ua_jjrqfxxkgewl_q">
         <w:r>
           <w:rPr>
             <w:rFonts w:ascii="DM Sans" w:cs="DM Sans" w:eastAsia="DM Sans" w:hAnsi="DM Sans"/>
@@ -19596,7 +19596,7 @@
         <w:spacing w:after="60"/>
         <w:jc w:val="center"/>
       </w:pPr>
-      <w:hyperlink w:history="1" r:id="rIdqxfs6odbp0qnafqsmydi_">
+      <w:hyperlink w:history="1" r:id="rIdoyzlnr0thryhlibrduatd">
         <w:r>
           <w:rPr>
             <w:rFonts w:ascii="DM Sans" w:cs="DM Sans" w:eastAsia="DM Sans" w:hAnsi="DM Sans"/>

</xml_diff>

<commit_message>
docs(manual): fit all 14 trajectory thumbnails on one page
Shrink trajectory-gallery image size from 150×110 pt to 110×80 pt so
the full 3×5 grid (14 shapes, 1 trailing empty cell) lands on page 18
instead of orphaning the 14th shape (Triangle) on an otherwise-blank
page 19.

Aspect preserved (1.375 ≈ prior 1.363). Thumbnails remain clearly
identifiable; Section 7 "Creative Tips" now starts cleanly on page 19.

Surfaced during review of #174 (which this patch finishes tying up).
</commit_message>
<xml_diff>
--- a/docs/OpenSpatialDelay_Manual_v1.0.docx
+++ b/docs/OpenSpatialDelay_Manual_v1.0.docx
@@ -1312,7 +1312,7 @@
         </w:rPr>
         <w:t xml:space="preserve">Download the latest release for your platform from the </w:t>
       </w:r>
-      <w:hyperlink w:history="1" r:id="rIda-zlxi_9k5fnhxoyw9xvz">
+      <w:hyperlink w:history="1" r:id="rIdf0kulddtzrjnct5cbxfi1">
         <w:r>
           <w:rPr>
             <w:rFonts w:ascii="DM Sans" w:cs="DM Sans" w:eastAsia="DM Sans" w:hAnsi="DM Sans"/>
@@ -16521,7 +16521,7 @@
             <w:r>
               <w:drawing>
                 <wp:inline distT="0" distB="0" distL="0" distR="0">
-                  <wp:extent cx="1428750" cy="1047750"/>
+                  <wp:extent cx="1047750" cy="762000"/>
                   <wp:effectExtent t="0" r="0" b="0" l="0"/>
                   <wp:docPr id="1" name="traj-bounce" descr="Spatial map showing the Bounce trajectory path" title="Bounce trajectory"/>
                   <wp:cNvGraphicFramePr>
@@ -16546,7 +16546,7 @@
                         <pic:spPr bwMode="auto">
                           <a:xfrm>
                             <a:off x="0" y="0"/>
-                            <a:ext cx="1428750" cy="1047750"/>
+                            <a:ext cx="1047750" cy="762000"/>
                           </a:xfrm>
                           <a:prstGeom prst="rect">
                             <a:avLst/>
@@ -16601,7 +16601,7 @@
             <w:r>
               <w:drawing>
                 <wp:inline distT="0" distB="0" distL="0" distR="0">
-                  <wp:extent cx="1428750" cy="1047750"/>
+                  <wp:extent cx="1047750" cy="762000"/>
                   <wp:effectExtent t="0" r="0" b="0" l="0"/>
                   <wp:docPr id="1" name="traj-circle" descr="Spatial map showing the Circle trajectory path" title="Circle trajectory"/>
                   <wp:cNvGraphicFramePr>
@@ -16626,7 +16626,7 @@
                         <pic:spPr bwMode="auto">
                           <a:xfrm>
                             <a:off x="0" y="0"/>
-                            <a:ext cx="1428750" cy="1047750"/>
+                            <a:ext cx="1047750" cy="762000"/>
                           </a:xfrm>
                           <a:prstGeom prst="rect">
                             <a:avLst/>
@@ -16681,7 +16681,7 @@
             <w:r>
               <w:drawing>
                 <wp:inline distT="0" distB="0" distL="0" distR="0">
-                  <wp:extent cx="1428750" cy="1047750"/>
+                  <wp:extent cx="1047750" cy="762000"/>
                   <wp:effectExtent t="0" r="0" b="0" l="0"/>
                   <wp:docPr id="1" name="traj-cross" descr="Spatial map showing the Cross trajectory path" title="Cross trajectory"/>
                   <wp:cNvGraphicFramePr>
@@ -16706,7 +16706,7 @@
                         <pic:spPr bwMode="auto">
                           <a:xfrm>
                             <a:off x="0" y="0"/>
-                            <a:ext cx="1428750" cy="1047750"/>
+                            <a:ext cx="1047750" cy="762000"/>
                           </a:xfrm>
                           <a:prstGeom prst="rect">
                             <a:avLst/>
@@ -16763,7 +16763,7 @@
             <w:r>
               <w:drawing>
                 <wp:inline distT="0" distB="0" distL="0" distR="0">
-                  <wp:extent cx="1428750" cy="1047750"/>
+                  <wp:extent cx="1047750" cy="762000"/>
                   <wp:effectExtent t="0" r="0" b="0" l="0"/>
                   <wp:docPr id="1" name="traj-figure8" descr="Spatial map showing the Figure-8 trajectory path" title="Figure-8 trajectory"/>
                   <wp:cNvGraphicFramePr>
@@ -16788,7 +16788,7 @@
                         <pic:spPr bwMode="auto">
                           <a:xfrm>
                             <a:off x="0" y="0"/>
-                            <a:ext cx="1428750" cy="1047750"/>
+                            <a:ext cx="1047750" cy="762000"/>
                           </a:xfrm>
                           <a:prstGeom prst="rect">
                             <a:avLst/>
@@ -16843,7 +16843,7 @@
             <w:r>
               <w:drawing>
                 <wp:inline distT="0" distB="0" distL="0" distR="0">
-                  <wp:extent cx="1428750" cy="1047750"/>
+                  <wp:extent cx="1047750" cy="762000"/>
                   <wp:effectExtent t="0" r="0" b="0" l="0"/>
                   <wp:docPr id="1" name="traj-heart" descr="Spatial map showing the Heart trajectory path" title="Heart trajectory"/>
                   <wp:cNvGraphicFramePr>
@@ -16868,7 +16868,7 @@
                         <pic:spPr bwMode="auto">
                           <a:xfrm>
                             <a:off x="0" y="0"/>
-                            <a:ext cx="1428750" cy="1047750"/>
+                            <a:ext cx="1047750" cy="762000"/>
                           </a:xfrm>
                           <a:prstGeom prst="rect">
                             <a:avLst/>
@@ -16923,7 +16923,7 @@
             <w:r>
               <w:drawing>
                 <wp:inline distT="0" distB="0" distL="0" distR="0">
-                  <wp:extent cx="1428750" cy="1047750"/>
+                  <wp:extent cx="1047750" cy="762000"/>
                   <wp:effectExtent t="0" r="0" b="0" l="0"/>
                   <wp:docPr id="1" name="traj-helix" descr="Spatial map showing the Helix trajectory path" title="Helix trajectory"/>
                   <wp:cNvGraphicFramePr>
@@ -16948,7 +16948,7 @@
                         <pic:spPr bwMode="auto">
                           <a:xfrm>
                             <a:off x="0" y="0"/>
-                            <a:ext cx="1428750" cy="1047750"/>
+                            <a:ext cx="1047750" cy="762000"/>
                           </a:xfrm>
                           <a:prstGeom prst="rect">
                             <a:avLst/>
@@ -17005,7 +17005,7 @@
             <w:r>
               <w:drawing>
                 <wp:inline distT="0" distB="0" distL="0" distR="0">
-                  <wp:extent cx="1428750" cy="1047750"/>
+                  <wp:extent cx="1047750" cy="762000"/>
                   <wp:effectExtent t="0" r="0" b="0" l="0"/>
                   <wp:docPr id="1" name="traj-infinity" descr="Spatial map showing the Infinity trajectory path" title="Infinity trajectory"/>
                   <wp:cNvGraphicFramePr>
@@ -17030,7 +17030,7 @@
                         <pic:spPr bwMode="auto">
                           <a:xfrm>
                             <a:off x="0" y="0"/>
-                            <a:ext cx="1428750" cy="1047750"/>
+                            <a:ext cx="1047750" cy="762000"/>
                           </a:xfrm>
                           <a:prstGeom prst="rect">
                             <a:avLst/>
@@ -17085,7 +17085,7 @@
             <w:r>
               <w:drawing>
                 <wp:inline distT="0" distB="0" distL="0" distR="0">
-                  <wp:extent cx="1428750" cy="1047750"/>
+                  <wp:extent cx="1047750" cy="762000"/>
                   <wp:effectExtent t="0" r="0" b="0" l="0"/>
                   <wp:docPr id="1" name="traj-line" descr="Spatial map showing the Line trajectory path" title="Line trajectory"/>
                   <wp:cNvGraphicFramePr>
@@ -17110,7 +17110,7 @@
                         <pic:spPr bwMode="auto">
                           <a:xfrm>
                             <a:off x="0" y="0"/>
-                            <a:ext cx="1428750" cy="1047750"/>
+                            <a:ext cx="1047750" cy="762000"/>
                           </a:xfrm>
                           <a:prstGeom prst="rect">
                             <a:avLst/>
@@ -17165,7 +17165,7 @@
             <w:r>
               <w:drawing>
                 <wp:inline distT="0" distB="0" distL="0" distR="0">
-                  <wp:extent cx="1428750" cy="1047750"/>
+                  <wp:extent cx="1047750" cy="762000"/>
                   <wp:effectExtent t="0" r="0" b="0" l="0"/>
                   <wp:docPr id="1" name="traj-orbit" descr="Spatial map showing the Orbit trajectory path" title="Orbit trajectory"/>
                   <wp:cNvGraphicFramePr>
@@ -17190,7 +17190,7 @@
                         <pic:spPr bwMode="auto">
                           <a:xfrm>
                             <a:off x="0" y="0"/>
-                            <a:ext cx="1428750" cy="1047750"/>
+                            <a:ext cx="1047750" cy="762000"/>
                           </a:xfrm>
                           <a:prstGeom prst="rect">
                             <a:avLst/>
@@ -17247,7 +17247,7 @@
             <w:r>
               <w:drawing>
                 <wp:inline distT="0" distB="0" distL="0" distR="0">
-                  <wp:extent cx="1428750" cy="1047750"/>
+                  <wp:extent cx="1047750" cy="762000"/>
                   <wp:effectExtent t="0" r="0" b="0" l="0"/>
                   <wp:docPr id="1" name="traj-random" descr="Spatial map showing the Random trajectory path" title="Random trajectory"/>
                   <wp:cNvGraphicFramePr>
@@ -17272,7 +17272,7 @@
                         <pic:spPr bwMode="auto">
                           <a:xfrm>
                             <a:off x="0" y="0"/>
-                            <a:ext cx="1428750" cy="1047750"/>
+                            <a:ext cx="1047750" cy="762000"/>
                           </a:xfrm>
                           <a:prstGeom prst="rect">
                             <a:avLst/>
@@ -17327,7 +17327,7 @@
             <w:r>
               <w:drawing>
                 <wp:inline distT="0" distB="0" distL="0" distR="0">
-                  <wp:extent cx="1428750" cy="1047750"/>
+                  <wp:extent cx="1047750" cy="762000"/>
                   <wp:effectExtent t="0" r="0" b="0" l="0"/>
                   <wp:docPr id="1" name="traj-spiral" descr="Spatial map showing the Spiral trajectory path" title="Spiral trajectory"/>
                   <wp:cNvGraphicFramePr>
@@ -17352,7 +17352,7 @@
                         <pic:spPr bwMode="auto">
                           <a:xfrm>
                             <a:off x="0" y="0"/>
-                            <a:ext cx="1428750" cy="1047750"/>
+                            <a:ext cx="1047750" cy="762000"/>
                           </a:xfrm>
                           <a:prstGeom prst="rect">
                             <a:avLst/>
@@ -17407,7 +17407,7 @@
             <w:r>
               <w:drawing>
                 <wp:inline distT="0" distB="0" distL="0" distR="0">
-                  <wp:extent cx="1428750" cy="1047750"/>
+                  <wp:extent cx="1047750" cy="762000"/>
                   <wp:effectExtent t="0" r="0" b="0" l="0"/>
                   <wp:docPr id="1" name="traj-square" descr="Spatial map showing the Square trajectory path" title="Square trajectory"/>
                   <wp:cNvGraphicFramePr>
@@ -17432,7 +17432,7 @@
                         <pic:spPr bwMode="auto">
                           <a:xfrm>
                             <a:off x="0" y="0"/>
-                            <a:ext cx="1428750" cy="1047750"/>
+                            <a:ext cx="1047750" cy="762000"/>
                           </a:xfrm>
                           <a:prstGeom prst="rect">
                             <a:avLst/>
@@ -17489,7 +17489,7 @@
             <w:r>
               <w:drawing>
                 <wp:inline distT="0" distB="0" distL="0" distR="0">
-                  <wp:extent cx="1428750" cy="1047750"/>
+                  <wp:extent cx="1047750" cy="762000"/>
                   <wp:effectExtent t="0" r="0" b="0" l="0"/>
                   <wp:docPr id="1" name="traj-triangle" descr="Spatial map showing the Triangle trajectory path" title="Triangle trajectory"/>
                   <wp:cNvGraphicFramePr>
@@ -17514,7 +17514,7 @@
                         <pic:spPr bwMode="auto">
                           <a:xfrm>
                             <a:off x="0" y="0"/>
-                            <a:ext cx="1428750" cy="1047750"/>
+                            <a:ext cx="1047750" cy="762000"/>
                           </a:xfrm>
                           <a:prstGeom prst="rect">
                             <a:avLst/>
@@ -19578,7 +19578,7 @@
         <w:spacing w:after="60"/>
         <w:jc w:val="center"/>
       </w:pPr>
-      <w:hyperlink w:history="1" r:id="rIdbro4ua_jjrqfxxkgewl_q">
+      <w:hyperlink w:history="1" r:id="rId0tbcgx7zjkff0rysk87jb">
         <w:r>
           <w:rPr>
             <w:rFonts w:ascii="DM Sans" w:cs="DM Sans" w:eastAsia="DM Sans" w:hAnsi="DM Sans"/>
@@ -19596,7 +19596,7 @@
         <w:spacing w:after="60"/>
         <w:jc w:val="center"/>
       </w:pPr>
-      <w:hyperlink w:history="1" r:id="rIdoyzlnr0thryhlibrduatd">
+      <w:hyperlink w:history="1" r:id="rIdp9edtsfzjewwlnq0dj1rl">
         <w:r>
           <w:rPr>
             <w:rFonts w:ascii="DM Sans" w:cs="DM Sans" w:eastAsia="DM Sans" w:hAnsi="DM Sans"/>

</xml_diff>

<commit_message>
docs(manual): fit all 14 trajectory thumbnails on one page (#216)
Shrink trajectory-gallery image size from 150×110 pt to 110×80 pt so
the full 3×5 grid (14 shapes, 1 trailing empty cell) lands on page 18
instead of orphaning the 14th shape (Triangle) on an otherwise-blank
page 19.

Aspect preserved (1.375 ≈ prior 1.363). Thumbnails remain clearly
identifiable; Section 7 "Creative Tips" now starts cleanly on page 19.

Surfaced during review of #174 (which this patch finishes tying up).
</commit_message>
<xml_diff>
--- a/docs/OpenSpatialDelay_Manual_v1.0.docx
+++ b/docs/OpenSpatialDelay_Manual_v1.0.docx
@@ -1312,7 +1312,7 @@
         </w:rPr>
         <w:t xml:space="preserve">Download the latest release for your platform from the </w:t>
       </w:r>
-      <w:hyperlink w:history="1" r:id="rIda-zlxi_9k5fnhxoyw9xvz">
+      <w:hyperlink w:history="1" r:id="rIdf0kulddtzrjnct5cbxfi1">
         <w:r>
           <w:rPr>
             <w:rFonts w:ascii="DM Sans" w:cs="DM Sans" w:eastAsia="DM Sans" w:hAnsi="DM Sans"/>
@@ -16521,7 +16521,7 @@
             <w:r>
               <w:drawing>
                 <wp:inline distT="0" distB="0" distL="0" distR="0">
-                  <wp:extent cx="1428750" cy="1047750"/>
+                  <wp:extent cx="1047750" cy="762000"/>
                   <wp:effectExtent t="0" r="0" b="0" l="0"/>
                   <wp:docPr id="1" name="traj-bounce" descr="Spatial map showing the Bounce trajectory path" title="Bounce trajectory"/>
                   <wp:cNvGraphicFramePr>
@@ -16546,7 +16546,7 @@
                         <pic:spPr bwMode="auto">
                           <a:xfrm>
                             <a:off x="0" y="0"/>
-                            <a:ext cx="1428750" cy="1047750"/>
+                            <a:ext cx="1047750" cy="762000"/>
                           </a:xfrm>
                           <a:prstGeom prst="rect">
                             <a:avLst/>
@@ -16601,7 +16601,7 @@
             <w:r>
               <w:drawing>
                 <wp:inline distT="0" distB="0" distL="0" distR="0">
-                  <wp:extent cx="1428750" cy="1047750"/>
+                  <wp:extent cx="1047750" cy="762000"/>
                   <wp:effectExtent t="0" r="0" b="0" l="0"/>
                   <wp:docPr id="1" name="traj-circle" descr="Spatial map showing the Circle trajectory path" title="Circle trajectory"/>
                   <wp:cNvGraphicFramePr>
@@ -16626,7 +16626,7 @@
                         <pic:spPr bwMode="auto">
                           <a:xfrm>
                             <a:off x="0" y="0"/>
-                            <a:ext cx="1428750" cy="1047750"/>
+                            <a:ext cx="1047750" cy="762000"/>
                           </a:xfrm>
                           <a:prstGeom prst="rect">
                             <a:avLst/>
@@ -16681,7 +16681,7 @@
             <w:r>
               <w:drawing>
                 <wp:inline distT="0" distB="0" distL="0" distR="0">
-                  <wp:extent cx="1428750" cy="1047750"/>
+                  <wp:extent cx="1047750" cy="762000"/>
                   <wp:effectExtent t="0" r="0" b="0" l="0"/>
                   <wp:docPr id="1" name="traj-cross" descr="Spatial map showing the Cross trajectory path" title="Cross trajectory"/>
                   <wp:cNvGraphicFramePr>
@@ -16706,7 +16706,7 @@
                         <pic:spPr bwMode="auto">
                           <a:xfrm>
                             <a:off x="0" y="0"/>
-                            <a:ext cx="1428750" cy="1047750"/>
+                            <a:ext cx="1047750" cy="762000"/>
                           </a:xfrm>
                           <a:prstGeom prst="rect">
                             <a:avLst/>
@@ -16763,7 +16763,7 @@
             <w:r>
               <w:drawing>
                 <wp:inline distT="0" distB="0" distL="0" distR="0">
-                  <wp:extent cx="1428750" cy="1047750"/>
+                  <wp:extent cx="1047750" cy="762000"/>
                   <wp:effectExtent t="0" r="0" b="0" l="0"/>
                   <wp:docPr id="1" name="traj-figure8" descr="Spatial map showing the Figure-8 trajectory path" title="Figure-8 trajectory"/>
                   <wp:cNvGraphicFramePr>
@@ -16788,7 +16788,7 @@
                         <pic:spPr bwMode="auto">
                           <a:xfrm>
                             <a:off x="0" y="0"/>
-                            <a:ext cx="1428750" cy="1047750"/>
+                            <a:ext cx="1047750" cy="762000"/>
                           </a:xfrm>
                           <a:prstGeom prst="rect">
                             <a:avLst/>
@@ -16843,7 +16843,7 @@
             <w:r>
               <w:drawing>
                 <wp:inline distT="0" distB="0" distL="0" distR="0">
-                  <wp:extent cx="1428750" cy="1047750"/>
+                  <wp:extent cx="1047750" cy="762000"/>
                   <wp:effectExtent t="0" r="0" b="0" l="0"/>
                   <wp:docPr id="1" name="traj-heart" descr="Spatial map showing the Heart trajectory path" title="Heart trajectory"/>
                   <wp:cNvGraphicFramePr>
@@ -16868,7 +16868,7 @@
                         <pic:spPr bwMode="auto">
                           <a:xfrm>
                             <a:off x="0" y="0"/>
-                            <a:ext cx="1428750" cy="1047750"/>
+                            <a:ext cx="1047750" cy="762000"/>
                           </a:xfrm>
                           <a:prstGeom prst="rect">
                             <a:avLst/>
@@ -16923,7 +16923,7 @@
             <w:r>
               <w:drawing>
                 <wp:inline distT="0" distB="0" distL="0" distR="0">
-                  <wp:extent cx="1428750" cy="1047750"/>
+                  <wp:extent cx="1047750" cy="762000"/>
                   <wp:effectExtent t="0" r="0" b="0" l="0"/>
                   <wp:docPr id="1" name="traj-helix" descr="Spatial map showing the Helix trajectory path" title="Helix trajectory"/>
                   <wp:cNvGraphicFramePr>
@@ -16948,7 +16948,7 @@
                         <pic:spPr bwMode="auto">
                           <a:xfrm>
                             <a:off x="0" y="0"/>
-                            <a:ext cx="1428750" cy="1047750"/>
+                            <a:ext cx="1047750" cy="762000"/>
                           </a:xfrm>
                           <a:prstGeom prst="rect">
                             <a:avLst/>
@@ -17005,7 +17005,7 @@
             <w:r>
               <w:drawing>
                 <wp:inline distT="0" distB="0" distL="0" distR="0">
-                  <wp:extent cx="1428750" cy="1047750"/>
+                  <wp:extent cx="1047750" cy="762000"/>
                   <wp:effectExtent t="0" r="0" b="0" l="0"/>
                   <wp:docPr id="1" name="traj-infinity" descr="Spatial map showing the Infinity trajectory path" title="Infinity trajectory"/>
                   <wp:cNvGraphicFramePr>
@@ -17030,7 +17030,7 @@
                         <pic:spPr bwMode="auto">
                           <a:xfrm>
                             <a:off x="0" y="0"/>
-                            <a:ext cx="1428750" cy="1047750"/>
+                            <a:ext cx="1047750" cy="762000"/>
                           </a:xfrm>
                           <a:prstGeom prst="rect">
                             <a:avLst/>
@@ -17085,7 +17085,7 @@
             <w:r>
               <w:drawing>
                 <wp:inline distT="0" distB="0" distL="0" distR="0">
-                  <wp:extent cx="1428750" cy="1047750"/>
+                  <wp:extent cx="1047750" cy="762000"/>
                   <wp:effectExtent t="0" r="0" b="0" l="0"/>
                   <wp:docPr id="1" name="traj-line" descr="Spatial map showing the Line trajectory path" title="Line trajectory"/>
                   <wp:cNvGraphicFramePr>
@@ -17110,7 +17110,7 @@
                         <pic:spPr bwMode="auto">
                           <a:xfrm>
                             <a:off x="0" y="0"/>
-                            <a:ext cx="1428750" cy="1047750"/>
+                            <a:ext cx="1047750" cy="762000"/>
                           </a:xfrm>
                           <a:prstGeom prst="rect">
                             <a:avLst/>
@@ -17165,7 +17165,7 @@
             <w:r>
               <w:drawing>
                 <wp:inline distT="0" distB="0" distL="0" distR="0">
-                  <wp:extent cx="1428750" cy="1047750"/>
+                  <wp:extent cx="1047750" cy="762000"/>
                   <wp:effectExtent t="0" r="0" b="0" l="0"/>
                   <wp:docPr id="1" name="traj-orbit" descr="Spatial map showing the Orbit trajectory path" title="Orbit trajectory"/>
                   <wp:cNvGraphicFramePr>
@@ -17190,7 +17190,7 @@
                         <pic:spPr bwMode="auto">
                           <a:xfrm>
                             <a:off x="0" y="0"/>
-                            <a:ext cx="1428750" cy="1047750"/>
+                            <a:ext cx="1047750" cy="762000"/>
                           </a:xfrm>
                           <a:prstGeom prst="rect">
                             <a:avLst/>
@@ -17247,7 +17247,7 @@
             <w:r>
               <w:drawing>
                 <wp:inline distT="0" distB="0" distL="0" distR="0">
-                  <wp:extent cx="1428750" cy="1047750"/>
+                  <wp:extent cx="1047750" cy="762000"/>
                   <wp:effectExtent t="0" r="0" b="0" l="0"/>
                   <wp:docPr id="1" name="traj-random" descr="Spatial map showing the Random trajectory path" title="Random trajectory"/>
                   <wp:cNvGraphicFramePr>
@@ -17272,7 +17272,7 @@
                         <pic:spPr bwMode="auto">
                           <a:xfrm>
                             <a:off x="0" y="0"/>
-                            <a:ext cx="1428750" cy="1047750"/>
+                            <a:ext cx="1047750" cy="762000"/>
                           </a:xfrm>
                           <a:prstGeom prst="rect">
                             <a:avLst/>
@@ -17327,7 +17327,7 @@
             <w:r>
               <w:drawing>
                 <wp:inline distT="0" distB="0" distL="0" distR="0">
-                  <wp:extent cx="1428750" cy="1047750"/>
+                  <wp:extent cx="1047750" cy="762000"/>
                   <wp:effectExtent t="0" r="0" b="0" l="0"/>
                   <wp:docPr id="1" name="traj-spiral" descr="Spatial map showing the Spiral trajectory path" title="Spiral trajectory"/>
                   <wp:cNvGraphicFramePr>
@@ -17352,7 +17352,7 @@
                         <pic:spPr bwMode="auto">
                           <a:xfrm>
                             <a:off x="0" y="0"/>
-                            <a:ext cx="1428750" cy="1047750"/>
+                            <a:ext cx="1047750" cy="762000"/>
                           </a:xfrm>
                           <a:prstGeom prst="rect">
                             <a:avLst/>
@@ -17407,7 +17407,7 @@
             <w:r>
               <w:drawing>
                 <wp:inline distT="0" distB="0" distL="0" distR="0">
-                  <wp:extent cx="1428750" cy="1047750"/>
+                  <wp:extent cx="1047750" cy="762000"/>
                   <wp:effectExtent t="0" r="0" b="0" l="0"/>
                   <wp:docPr id="1" name="traj-square" descr="Spatial map showing the Square trajectory path" title="Square trajectory"/>
                   <wp:cNvGraphicFramePr>
@@ -17432,7 +17432,7 @@
                         <pic:spPr bwMode="auto">
                           <a:xfrm>
                             <a:off x="0" y="0"/>
-                            <a:ext cx="1428750" cy="1047750"/>
+                            <a:ext cx="1047750" cy="762000"/>
                           </a:xfrm>
                           <a:prstGeom prst="rect">
                             <a:avLst/>
@@ -17489,7 +17489,7 @@
             <w:r>
               <w:drawing>
                 <wp:inline distT="0" distB="0" distL="0" distR="0">
-                  <wp:extent cx="1428750" cy="1047750"/>
+                  <wp:extent cx="1047750" cy="762000"/>
                   <wp:effectExtent t="0" r="0" b="0" l="0"/>
                   <wp:docPr id="1" name="traj-triangle" descr="Spatial map showing the Triangle trajectory path" title="Triangle trajectory"/>
                   <wp:cNvGraphicFramePr>
@@ -17514,7 +17514,7 @@
                         <pic:spPr bwMode="auto">
                           <a:xfrm>
                             <a:off x="0" y="0"/>
-                            <a:ext cx="1428750" cy="1047750"/>
+                            <a:ext cx="1047750" cy="762000"/>
                           </a:xfrm>
                           <a:prstGeom prst="rect">
                             <a:avLst/>
@@ -19578,7 +19578,7 @@
         <w:spacing w:after="60"/>
         <w:jc w:val="center"/>
       </w:pPr>
-      <w:hyperlink w:history="1" r:id="rIdbro4ua_jjrqfxxkgewl_q">
+      <w:hyperlink w:history="1" r:id="rId0tbcgx7zjkff0rysk87jb">
         <w:r>
           <w:rPr>
             <w:rFonts w:ascii="DM Sans" w:cs="DM Sans" w:eastAsia="DM Sans" w:hAnsi="DM Sans"/>
@@ -19596,7 +19596,7 @@
         <w:spacing w:after="60"/>
         <w:jc w:val="center"/>
       </w:pPr>
-      <w:hyperlink w:history="1" r:id="rIdoyzlnr0thryhlibrduatd">
+      <w:hyperlink w:history="1" r:id="rIdp9edtsfzjewwlnq0dj1rl">
         <w:r>
           <w:rPr>
             <w:rFonts w:ascii="DM Sans" w:cs="DM Sans" w:eastAsia="DM Sans" w:hAnsi="DM Sans"/>

</xml_diff>